<commit_message>
Chapters1 and 2 of report are added
</commit_message>
<xml_diff>
--- a/CMPE314 - PROPOSAL (1).docx
+++ b/CMPE314 - PROPOSAL (1).docx
@@ -1,6 +1,6 @@
 
 <file path=word/document.xml><?xml version="1.0" encoding="utf-8"?>
-<w:document xmlns:wpc="http://schemas.microsoft.com/office/word/2010/wordprocessingCanvas" xmlns:mc="http://schemas.openxmlformats.org/markup-compatibility/2006" xmlns:o="urn:schemas-microsoft-com:office:office" xmlns:r="http://schemas.openxmlformats.org/officeDocument/2006/relationships" xmlns:m="http://schemas.openxmlformats.org/officeDocument/2006/math" xmlns:v="urn:schemas-microsoft-com:vml" xmlns:wp14="http://schemas.microsoft.com/office/word/2010/wordprocessingDrawing" xmlns:wp="http://schemas.openxmlformats.org/drawingml/2006/wordprocessingDrawing" xmlns:w="http://schemas.openxmlformats.org/wordprocessingml/2006/main" xmlns:w14="http://schemas.microsoft.com/office/word/2010/wordml" xmlns:w10="urn:schemas-microsoft-com:office:word" xmlns:w15="http://schemas.microsoft.com/office/word/2012/wordml" xmlns:wpg="http://schemas.microsoft.com/office/word/2010/wordprocessingGroup" xmlns:wpi="http://schemas.microsoft.com/office/word/2010/wordprocessingInk" xmlns:wne="http://schemas.microsoft.com/office/word/2006/wordml" xmlns:wps="http://schemas.microsoft.com/office/word/2010/wordprocessingShape" xmlns:wpsCustomData="http://www.wps.cn/officeDocument/2013/wpsCustomData" mc:Ignorable="w14 w15 wp14">
+<w:document xmlns:wpc="http://schemas.microsoft.com/office/word/2010/wordprocessingCanvas" xmlns:cx="http://schemas.microsoft.com/office/drawing/2014/chartex" xmlns:cx1="http://schemas.microsoft.com/office/drawing/2015/9/8/chartex" xmlns:cx2="http://schemas.microsoft.com/office/drawing/2015/10/21/chartex" xmlns:cx3="http://schemas.microsoft.com/office/drawing/2016/5/9/chartex" xmlns:cx4="http://schemas.microsoft.com/office/drawing/2016/5/10/chartex" xmlns:cx5="http://schemas.microsoft.com/office/drawing/2016/5/11/chartex" xmlns:cx6="http://schemas.microsoft.com/office/drawing/2016/5/12/chartex" xmlns:cx7="http://schemas.microsoft.com/office/drawing/2016/5/13/chartex" xmlns:cx8="http://schemas.microsoft.com/office/drawing/2016/5/14/chartex" xmlns:mc="http://schemas.openxmlformats.org/markup-compatibility/2006" xmlns:aink="http://schemas.microsoft.com/office/drawing/2016/ink" xmlns:am3d="http://schemas.microsoft.com/office/drawing/2017/model3d" xmlns:o="urn:schemas-microsoft-com:office:office" xmlns:r="http://schemas.openxmlformats.org/officeDocument/2006/relationships" xmlns:m="http://schemas.openxmlformats.org/officeDocument/2006/math" xmlns:v="urn:schemas-microsoft-com:vml" xmlns:wp14="http://schemas.microsoft.com/office/word/2010/wordprocessingDrawing" xmlns:wp="http://schemas.openxmlformats.org/drawingml/2006/wordprocessingDrawing" xmlns:w10="urn:schemas-microsoft-com:office:word" xmlns:w="http://schemas.openxmlformats.org/wordprocessingml/2006/main" xmlns:w14="http://schemas.microsoft.com/office/word/2010/wordml" xmlns:w15="http://schemas.microsoft.com/office/word/2012/wordml" xmlns:w16cex="http://schemas.microsoft.com/office/word/2018/wordml/cex" xmlns:w16cid="http://schemas.microsoft.com/office/word/2016/wordml/cid" xmlns:w16="http://schemas.microsoft.com/office/word/2018/wordml" xmlns:w16sdtdh="http://schemas.microsoft.com/office/word/2020/wordml/sdtdatahash" xmlns:w16se="http://schemas.microsoft.com/office/word/2015/wordml/symex" xmlns:wpg="http://schemas.microsoft.com/office/word/2010/wordprocessingGroup" xmlns:wpi="http://schemas.microsoft.com/office/word/2010/wordprocessingInk" xmlns:wne="http://schemas.microsoft.com/office/word/2006/wordml" xmlns:wps="http://schemas.microsoft.com/office/word/2010/wordprocessingShape" mc:Ignorable="w14 w15 w16se w16cid w16 w16cex w16sdtdh wp14">
   <w:body>
     <w:p>
       <w:pPr>
@@ -13,8 +13,11 @@
         </w:rPr>
       </w:pPr>
       <w:r>
+        <w:rPr>
+          <w:noProof/>
+        </w:rPr>
         <w:drawing>
-          <wp:inline distT="0" distB="0" distL="0" distR="0">
+          <wp:inline distT="0" distB="0" distL="0" distR="0" wp14:anchorId="3A7D6868" wp14:editId="781B2D47">
             <wp:extent cx="3379470" cy="1351915"/>
             <wp:effectExtent l="0" t="0" r="0" b="635"/>
             <wp:docPr id="1" name="Picture 1" descr="CIU Human Resources | Careers Application"/>
@@ -31,7 +34,7 @@
                     </pic:cNvPicPr>
                   </pic:nvPicPr>
                   <pic:blipFill>
-                    <a:blip r:embed="rId6">
+                    <a:blip r:embed="rId8">
                       <a:extLst>
                         <a:ext uri="{28A0092B-C50C-407E-A947-70E740481C1C}">
                           <a14:useLocalDpi xmlns:a14="http://schemas.microsoft.com/office/drawing/2010/main" val="0"/>
@@ -160,7 +163,7 @@
         <w:t>  1</w:t>
       </w:r>
       <w:r>
-        <w:br w:type="textWrapping"/>
+        <w:br/>
       </w:r>
       <w:r>
         <w:rPr>
@@ -238,7 +241,10 @@
         <w:ind w:left="360"/>
       </w:pPr>
       <w:r>
-        <w:t>[Mahisa Ahadi] - [22213656]</w:t>
+        <w:t xml:space="preserve">[Mahisa Ahadi] - </w:t>
+      </w:r>
+      <w:r>
+        <w:t>[22213656]</w:t>
       </w:r>
     </w:p>
     <w:p>
@@ -299,7 +305,7 @@
         <w:jc w:val="center"/>
       </w:pPr>
       <w:r>
-        <w:br w:type="textWrapping"/>
+        <w:br/>
       </w:r>
       <w:r>
         <w:rPr>
@@ -322,16 +328,9 @@
         <w:rPr>
           <w:sz w:val="24"/>
         </w:rPr>
-        <w:pict>
-          <v:rect id="_x0000_i1025" o:spt="1" style="height:0.75pt;width:0pt;" fillcolor="#A0A0A0" filled="t" stroked="f" coordsize="21600,21600" o:hr="t" o:hrstd="t" o:hralign="center">
-            <v:path/>
-            <v:fill on="t" focussize="0,0"/>
-            <v:stroke on="f"/>
-            <v:imagedata o:title=""/>
-            <o:lock v:ext="edit"/>
-            <w10:wrap type="none"/>
-            <w10:anchorlock/>
-          </v:rect>
+        <w:lastRenderedPageBreak/>
+        <w:pict w14:anchorId="45A4F248">
+          <v:rect id="_x0000_i1025" style="width:0;height:.75pt" o:hralign="center" o:hrstd="t" o:hr="t" fillcolor="#a0a0a0" stroked="f"/>
         </w:pict>
       </w:r>
     </w:p>
@@ -373,18 +372,52 @@
       <w:pPr>
         <w:spacing w:after="120" w:line="240" w:lineRule="auto"/>
         <w:rPr>
-          <w:rFonts w:ascii="Times New Roman" w:hAnsi="Times New Roman" w:eastAsia="Times New Roman" w:cs="Times New Roman"/>
+          <w:rFonts w:ascii="Times New Roman" w:eastAsia="Times New Roman" w:hAnsi="Times New Roman" w:cs="Times New Roman"/>
           <w:sz w:val="24"/>
           <w:szCs w:val="24"/>
         </w:rPr>
       </w:pPr>
       <w:r>
         <w:rPr>
-          <w:rFonts w:ascii="Times New Roman" w:hAnsi="Times New Roman" w:eastAsia="Times New Roman" w:cs="Times New Roman"/>
+          <w:rFonts w:ascii="Times New Roman" w:eastAsia="Times New Roman" w:hAnsi="Times New Roman" w:cs="Times New Roman"/>
           <w:sz w:val="24"/>
           <w:szCs w:val="24"/>
         </w:rPr>
-        <w:t>Usually, instructors must arrange quizzes by looking for empty classes and finding invigilators, although this is a small challenge. However, for bigger challenges, we can mention that in many cases number of students registered for a course is too much, and examining all the papers in a limited time is difficult, or in cases like corona virus period or other Campus closure , students cannot take the classical exam.</w:t>
+        <w:t>Usually, instructors must arrange quizzes by looking for empty classes and finding invigilators, although this</w:t>
+      </w:r>
+      <w:r>
+        <w:rPr>
+          <w:rFonts w:ascii="Times New Roman" w:eastAsia="Times New Roman" w:hAnsi="Times New Roman" w:cs="Times New Roman"/>
+          <w:sz w:val="24"/>
+          <w:szCs w:val="24"/>
+        </w:rPr>
+        <w:t xml:space="preserve"> is a small challenge. However, for bigger challenges, we can mention that in many cases number of students registered for a course is too much, and examining all the papers in a limited time is difficult, or in cases like corona virus period or other Camp</w:t>
+      </w:r>
+      <w:r>
+        <w:rPr>
+          <w:rFonts w:ascii="Times New Roman" w:eastAsia="Times New Roman" w:hAnsi="Times New Roman" w:cs="Times New Roman"/>
+          <w:sz w:val="24"/>
+          <w:szCs w:val="24"/>
+        </w:rPr>
+        <w:t xml:space="preserve">us </w:t>
+      </w:r>
+      <w:proofErr w:type="gramStart"/>
+      <w:r>
+        <w:rPr>
+          <w:rFonts w:ascii="Times New Roman" w:eastAsia="Times New Roman" w:hAnsi="Times New Roman" w:cs="Times New Roman"/>
+          <w:sz w:val="24"/>
+          <w:szCs w:val="24"/>
+        </w:rPr>
+        <w:t>closure ,</w:t>
+      </w:r>
+      <w:proofErr w:type="gramEnd"/>
+      <w:r>
+        <w:rPr>
+          <w:rFonts w:ascii="Times New Roman" w:eastAsia="Times New Roman" w:hAnsi="Times New Roman" w:cs="Times New Roman"/>
+          <w:sz w:val="24"/>
+          <w:szCs w:val="24"/>
+        </w:rPr>
+        <w:t xml:space="preserve"> students cannot take the classical exam.</w:t>
       </w:r>
     </w:p>
     <w:p>
@@ -429,14 +462,14 @@
       <w:pPr>
         <w:spacing w:after="120" w:line="240" w:lineRule="auto"/>
         <w:rPr>
-          <w:rFonts w:ascii="Times New Roman" w:hAnsi="Times New Roman" w:eastAsia="Times New Roman" w:cs="Times New Roman"/>
+          <w:rFonts w:ascii="Times New Roman" w:eastAsia="Times New Roman" w:hAnsi="Times New Roman" w:cs="Times New Roman"/>
           <w:sz w:val="24"/>
           <w:szCs w:val="24"/>
         </w:rPr>
       </w:pPr>
       <w:r>
         <w:rPr>
-          <w:rFonts w:ascii="Times New Roman" w:hAnsi="Times New Roman" w:eastAsia="Times New Roman" w:cs="Times New Roman"/>
+          <w:rFonts w:ascii="Times New Roman" w:eastAsia="Times New Roman" w:hAnsi="Times New Roman" w:cs="Times New Roman"/>
           <w:sz w:val="24"/>
           <w:szCs w:val="24"/>
         </w:rPr>
@@ -505,7 +538,20 @@
         <w:rPr>
           <w:sz w:val="24"/>
         </w:rPr>
-        <w:t>To develop a web based online quiz platform for creating and taking quizzes. This platform must give the teachers the ability to build quizzes with various question types</w:t>
+        <w:t xml:space="preserve">To </w:t>
+      </w:r>
+      <w:r>
+        <w:rPr>
+          <w:sz w:val="24"/>
+        </w:rPr>
+        <w:t xml:space="preserve">develop a web based online quiz platform for creating and taking quizzes. This platform must give the teachers the ability to build quizzes with various question </w:t>
+      </w:r>
+      <w:proofErr w:type="gramStart"/>
+      <w:r>
+        <w:rPr>
+          <w:sz w:val="24"/>
+        </w:rPr>
+        <w:t>types</w:t>
       </w:r>
       <w:r>
         <w:t xml:space="preserve"> </w:t>
@@ -514,92 +560,92 @@
         <w:rPr>
           <w:sz w:val="24"/>
         </w:rPr>
-        <w:t>, and students can take them and receive immediate scores and feedback.</w:t>
-      </w:r>
-    </w:p>
-    <w:p>
-      <w:pPr>
-        <w:rPr>
-          <w:sz w:val="24"/>
-        </w:rPr>
-      </w:pPr>
-    </w:p>
-    <w:p>
-      <w:pPr>
-        <w:rPr>
-          <w:sz w:val="24"/>
-        </w:rPr>
-      </w:pPr>
-    </w:p>
-    <w:p>
-      <w:pPr>
-        <w:rPr>
-          <w:sz w:val="24"/>
-        </w:rPr>
-      </w:pPr>
-    </w:p>
-    <w:p>
-      <w:pPr>
-        <w:rPr>
-          <w:sz w:val="24"/>
-        </w:rPr>
-      </w:pPr>
-    </w:p>
-    <w:p>
-      <w:pPr>
-        <w:rPr>
-          <w:sz w:val="24"/>
-        </w:rPr>
-      </w:pPr>
-    </w:p>
-    <w:p>
-      <w:pPr>
-        <w:rPr>
-          <w:sz w:val="24"/>
-        </w:rPr>
-      </w:pPr>
-    </w:p>
-    <w:p>
-      <w:pPr>
-        <w:rPr>
-          <w:sz w:val="24"/>
-        </w:rPr>
-      </w:pPr>
-    </w:p>
-    <w:p>
-      <w:pPr>
-        <w:rPr>
-          <w:sz w:val="24"/>
-        </w:rPr>
-      </w:pPr>
-    </w:p>
-    <w:p>
-      <w:pPr>
-        <w:rPr>
-          <w:sz w:val="24"/>
-        </w:rPr>
-      </w:pPr>
-    </w:p>
-    <w:p>
-      <w:pPr>
-        <w:rPr>
-          <w:sz w:val="24"/>
-        </w:rPr>
-      </w:pPr>
-      <w:r>
-        <w:rPr>
-          <w:sz w:val="24"/>
-        </w:rPr>
-        <w:pict>
-          <v:rect id="_x0000_i1026" o:spt="1" style="height:0.75pt;width:0pt;" fillcolor="#A0A0A0" filled="t" stroked="f" coordsize="21600,21600" o:hr="t" o:hrstd="t" o:hralign="center">
-            <v:path/>
-            <v:fill on="t" focussize="0,0"/>
-            <v:stroke on="f"/>
-            <v:imagedata o:title=""/>
-            <o:lock v:ext="edit"/>
-            <w10:wrap type="none"/>
-            <w10:anchorlock/>
-          </v:rect>
+        <w:t>,</w:t>
+      </w:r>
+      <w:proofErr w:type="gramEnd"/>
+      <w:r>
+        <w:rPr>
+          <w:sz w:val="24"/>
+        </w:rPr>
+        <w:t xml:space="preserve"> and students can take them and receive immediate scores and feedback.</w:t>
+      </w:r>
+    </w:p>
+    <w:p>
+      <w:pPr>
+        <w:rPr>
+          <w:sz w:val="24"/>
+        </w:rPr>
+      </w:pPr>
+    </w:p>
+    <w:p>
+      <w:pPr>
+        <w:rPr>
+          <w:sz w:val="24"/>
+        </w:rPr>
+      </w:pPr>
+    </w:p>
+    <w:p>
+      <w:pPr>
+        <w:rPr>
+          <w:sz w:val="24"/>
+        </w:rPr>
+      </w:pPr>
+    </w:p>
+    <w:p>
+      <w:pPr>
+        <w:rPr>
+          <w:sz w:val="24"/>
+        </w:rPr>
+      </w:pPr>
+    </w:p>
+    <w:p>
+      <w:pPr>
+        <w:rPr>
+          <w:sz w:val="24"/>
+        </w:rPr>
+      </w:pPr>
+    </w:p>
+    <w:p>
+      <w:pPr>
+        <w:rPr>
+          <w:sz w:val="24"/>
+        </w:rPr>
+      </w:pPr>
+    </w:p>
+    <w:p>
+      <w:pPr>
+        <w:rPr>
+          <w:sz w:val="24"/>
+        </w:rPr>
+      </w:pPr>
+    </w:p>
+    <w:p>
+      <w:pPr>
+        <w:rPr>
+          <w:sz w:val="24"/>
+        </w:rPr>
+      </w:pPr>
+    </w:p>
+    <w:p>
+      <w:pPr>
+        <w:rPr>
+          <w:sz w:val="24"/>
+        </w:rPr>
+      </w:pPr>
+    </w:p>
+    <w:p>
+      <w:pPr>
+        <w:rPr>
+          <w:sz w:val="24"/>
+        </w:rPr>
+      </w:pPr>
+      <w:r>
+        <w:rPr>
+          <w:sz w:val="24"/>
+        </w:rPr>
+        <w:lastRenderedPageBreak/>
+        <w:pict w14:anchorId="63EF86CD">
+          <v:rect id="_x0000_i1026" style="width:0;height:.75pt" o:hralign="center" o:hrstd="t" o:hr="t" fillcolor="#a0a0a0" stroked="f"/>
         </w:pict>
       </w:r>
     </w:p>
@@ -617,129 +663,151 @@
           <w:bCs/>
           <w:sz w:val="24"/>
         </w:rPr>
-        <w:t>2. PROPOSED SOLUTION</w:t>
-      </w:r>
-    </w:p>
-    <w:p>
-      <w:pPr>
+        <w:t>2. PR</w:t>
+      </w:r>
+      <w:r>
         <w:rPr>
           <w:b/>
           <w:bCs/>
           <w:sz w:val="24"/>
         </w:rPr>
-      </w:pPr>
-      <w:r>
+        <w:t>OPOSED SOLUTION</w:t>
+      </w:r>
+    </w:p>
+    <w:p>
+      <w:pPr>
         <w:rPr>
           <w:b/>
           <w:bCs/>
           <w:sz w:val="24"/>
         </w:rPr>
-        <w:t>2.1. Description of the System</w:t>
-      </w:r>
-    </w:p>
-    <w:p>
-      <w:pPr>
-        <w:rPr>
-          <w:sz w:val="24"/>
-        </w:rPr>
-      </w:pPr>
-      <w:r>
-        <w:rPr>
-          <w:sz w:val="24"/>
-        </w:rPr>
-        <w:t>The system is a web application with two interfaces: one for the instructors and one for students. Using system teachers can create, manage, and publish quizzes with multiple question types (multiple choice, true/false, short answer, fill in the blank, and so on).</w:t>
-      </w:r>
-    </w:p>
-    <w:p>
-      <w:pPr>
-        <w:rPr>
-          <w:sz w:val="24"/>
-        </w:rPr>
-      </w:pPr>
-      <w:r>
-        <w:rPr>
-          <w:sz w:val="24"/>
-        </w:rPr>
-        <w:t>Students can securely log in, take quizzes within a set time limit, and submit their answers online.</w:t>
-      </w:r>
-    </w:p>
-    <w:p>
-      <w:pPr>
-        <w:rPr>
-          <w:sz w:val="24"/>
-        </w:rPr>
-      </w:pPr>
-      <w:r>
-        <w:rPr>
-          <w:sz w:val="24"/>
-        </w:rPr>
-        <w:t>The system automatically grades objective questions and provides scores instantly.</w:t>
-      </w:r>
-    </w:p>
-    <w:p>
-      <w:pPr>
-        <w:rPr>
-          <w:sz w:val="24"/>
-        </w:rPr>
-      </w:pPr>
-    </w:p>
-    <w:p>
-      <w:pPr>
-        <w:rPr>
-          <w:sz w:val="24"/>
-        </w:rPr>
-      </w:pPr>
-    </w:p>
-    <w:p>
-      <w:pPr>
-        <w:rPr>
-          <w:sz w:val="24"/>
-        </w:rPr>
-      </w:pPr>
-    </w:p>
-    <w:p>
-      <w:pPr>
-        <w:rPr>
-          <w:sz w:val="24"/>
-        </w:rPr>
-      </w:pPr>
-    </w:p>
-    <w:p>
-      <w:pPr>
-        <w:rPr>
-          <w:sz w:val="24"/>
-        </w:rPr>
-      </w:pPr>
-    </w:p>
-    <w:p>
-      <w:pPr>
-        <w:rPr>
-          <w:sz w:val="24"/>
-        </w:rPr>
-      </w:pPr>
-    </w:p>
-    <w:p>
-      <w:pPr>
-        <w:rPr>
-          <w:sz w:val="24"/>
-        </w:rPr>
-      </w:pPr>
-    </w:p>
-    <w:p>
-      <w:pPr>
+      </w:pPr>
+      <w:r>
         <w:rPr>
           <w:b/>
           <w:bCs/>
           <w:sz w:val="24"/>
         </w:rPr>
-      </w:pPr>
-      <w:r>
+        <w:t>2.1. Description of the System</w:t>
+      </w:r>
+    </w:p>
+    <w:p>
+      <w:pPr>
+        <w:rPr>
+          <w:sz w:val="24"/>
+        </w:rPr>
+      </w:pPr>
+      <w:r>
+        <w:rPr>
+          <w:sz w:val="24"/>
+        </w:rPr>
+        <w:t>The system is a web application with two interfaces: one for the instructors and one for students. Using system teachers can create, manage, and publish quizzes with multiple question types (multiple choice, t</w:t>
+      </w:r>
+      <w:r>
+        <w:rPr>
+          <w:sz w:val="24"/>
+        </w:rPr>
+        <w:t>rue/false, short answer, fill in the blank, and so on).</w:t>
+      </w:r>
+    </w:p>
+    <w:p>
+      <w:pPr>
+        <w:rPr>
+          <w:sz w:val="24"/>
+        </w:rPr>
+      </w:pPr>
+      <w:r>
+        <w:rPr>
+          <w:sz w:val="24"/>
+        </w:rPr>
+        <w:t>Students can securely log in, take quizzes within a set time limit, and submit their answers online.</w:t>
+      </w:r>
+    </w:p>
+    <w:p>
+      <w:pPr>
+        <w:rPr>
+          <w:sz w:val="24"/>
+        </w:rPr>
+      </w:pPr>
+      <w:r>
+        <w:rPr>
+          <w:sz w:val="24"/>
+        </w:rPr>
+        <w:t>The system automatically grades objective questions and provides scores instantly.</w:t>
+      </w:r>
+    </w:p>
+    <w:p>
+      <w:pPr>
+        <w:rPr>
+          <w:sz w:val="24"/>
+        </w:rPr>
+      </w:pPr>
+    </w:p>
+    <w:p>
+      <w:pPr>
+        <w:rPr>
+          <w:sz w:val="24"/>
+        </w:rPr>
+      </w:pPr>
+    </w:p>
+    <w:p>
+      <w:pPr>
+        <w:rPr>
+          <w:sz w:val="24"/>
+        </w:rPr>
+      </w:pPr>
+    </w:p>
+    <w:p>
+      <w:pPr>
+        <w:rPr>
+          <w:sz w:val="24"/>
+        </w:rPr>
+      </w:pPr>
+    </w:p>
+    <w:p>
+      <w:pPr>
+        <w:rPr>
+          <w:sz w:val="24"/>
+        </w:rPr>
+      </w:pPr>
+    </w:p>
+    <w:p>
+      <w:pPr>
+        <w:rPr>
+          <w:sz w:val="24"/>
+        </w:rPr>
+      </w:pPr>
+    </w:p>
+    <w:p>
+      <w:pPr>
+        <w:rPr>
+          <w:sz w:val="24"/>
+        </w:rPr>
+      </w:pPr>
+    </w:p>
+    <w:p>
+      <w:pPr>
         <w:rPr>
           <w:b/>
           <w:bCs/>
           <w:sz w:val="24"/>
         </w:rPr>
-        <w:t>2.2. Key Features (High-Level)</w:t>
+      </w:pPr>
+      <w:r>
+        <w:rPr>
+          <w:b/>
+          <w:bCs/>
+          <w:sz w:val="24"/>
+        </w:rPr>
+        <w:t xml:space="preserve">2.2. </w:t>
+      </w:r>
+      <w:r>
+        <w:rPr>
+          <w:b/>
+          <w:bCs/>
+          <w:sz w:val="24"/>
+        </w:rPr>
+        <w:t>Key Features (High-Level)</w:t>
       </w:r>
     </w:p>
     <w:p>
@@ -918,16 +986,8 @@
         <w:rPr>
           <w:sz w:val="24"/>
         </w:rPr>
-        <w:pict>
-          <v:rect id="_x0000_i1027" o:spt="1" style="height:0.75pt;width:0pt;" fillcolor="#A0A0A0" filled="t" stroked="f" coordsize="21600,21600" o:hr="t" o:hrstd="t" o:hralign="center">
-            <v:path/>
-            <v:fill on="t" focussize="0,0"/>
-            <v:stroke on="f"/>
-            <v:imagedata o:title=""/>
-            <o:lock v:ext="edit"/>
-            <w10:wrap type="none"/>
-            <w10:anchorlock/>
-          </v:rect>
+        <w:pict w14:anchorId="77134DB9">
+          <v:rect id="_x0000_i1027" style="width:0;height:.75pt" o:hralign="center" o:hrstd="t" o:hr="t" fillcolor="#a0a0a0" stroked="f"/>
         </w:pict>
       </w:r>
     </w:p>
@@ -945,7 +1005,15 @@
           <w:bCs/>
           <w:sz w:val="24"/>
         </w:rPr>
-        <w:t>3. STAKEHOLDERS AND TARGET USERS</w:t>
+        <w:t>3. STAKEHO</w:t>
+      </w:r>
+      <w:r>
+        <w:rPr>
+          <w:b/>
+          <w:bCs/>
+          <w:sz w:val="24"/>
+        </w:rPr>
+        <w:t>LDERS AND TARGET USERS</w:t>
       </w:r>
     </w:p>
     <w:p>
@@ -981,13 +1049,29 @@
           <w:bCs/>
           <w:sz w:val="24"/>
         </w:rPr>
-        <w:t>[Student]:</w:t>
-      </w:r>
-      <w:r>
-        <w:rPr>
-          <w:sz w:val="24"/>
-        </w:rPr>
-        <w:t>  (Needs to have a secure exam and see their results instantly).</w:t>
+        <w:t>[Student]</w:t>
+      </w:r>
+      <w:proofErr w:type="gramStart"/>
+      <w:r>
+        <w:rPr>
+          <w:b/>
+          <w:bCs/>
+          <w:sz w:val="24"/>
+        </w:rPr>
+        <w:t>:</w:t>
+      </w:r>
+      <w:r>
+        <w:rPr>
+          <w:sz w:val="24"/>
+        </w:rPr>
+        <w:t>  (</w:t>
+      </w:r>
+      <w:proofErr w:type="gramEnd"/>
+      <w:r>
+        <w:rPr>
+          <w:sz w:val="24"/>
+        </w:rPr>
+        <w:t>Needs to have a secure exam and see their results instantly).</w:t>
       </w:r>
     </w:p>
     <w:p>
@@ -1006,13 +1090,29 @@
           <w:bCs/>
           <w:sz w:val="24"/>
         </w:rPr>
-        <w:t>[Teachers]:</w:t>
-      </w:r>
-      <w:r>
-        <w:rPr>
-          <w:sz w:val="24"/>
-        </w:rPr>
-        <w:t>  (Needs to manage exams, save time and be able to create quizzes easily).</w:t>
+        <w:t>[Teachers]</w:t>
+      </w:r>
+      <w:proofErr w:type="gramStart"/>
+      <w:r>
+        <w:rPr>
+          <w:b/>
+          <w:bCs/>
+          <w:sz w:val="24"/>
+        </w:rPr>
+        <w:t>:</w:t>
+      </w:r>
+      <w:r>
+        <w:rPr>
+          <w:sz w:val="24"/>
+        </w:rPr>
+        <w:t>  (</w:t>
+      </w:r>
+      <w:proofErr w:type="gramEnd"/>
+      <w:r>
+        <w:rPr>
+          <w:sz w:val="24"/>
+        </w:rPr>
+        <w:t>Needs to manage exams, save time and be able to create quizzes easily).</w:t>
       </w:r>
     </w:p>
     <w:p>
@@ -1083,7 +1183,15 @@
           <w:bCs/>
           <w:sz w:val="24"/>
         </w:rPr>
-        <w:t>[e.g., System Administrator]:</w:t>
+        <w:t xml:space="preserve">[e.g., System </w:t>
+      </w:r>
+      <w:r>
+        <w:rPr>
+          <w:b/>
+          <w:bCs/>
+          <w:sz w:val="24"/>
+        </w:rPr>
+        <w:t>Administrator]:</w:t>
       </w:r>
       <w:r>
         <w:rPr>
@@ -1114,127 +1222,133 @@
         <w:rPr>
           <w:sz w:val="24"/>
         </w:rPr>
-        <w:t> Needs to Approve and manage system usage ,monitor overall performance and reports, ensure compliance with academic policies.</w:t>
-      </w:r>
-    </w:p>
-    <w:p>
-      <w:pPr>
-        <w:rPr>
-          <w:sz w:val="24"/>
-        </w:rPr>
-      </w:pPr>
-    </w:p>
-    <w:p>
-      <w:pPr>
-        <w:rPr>
-          <w:sz w:val="24"/>
-        </w:rPr>
-      </w:pPr>
-    </w:p>
-    <w:p>
-      <w:pPr>
-        <w:rPr>
-          <w:sz w:val="24"/>
-        </w:rPr>
-      </w:pPr>
-    </w:p>
-    <w:p>
-      <w:pPr>
-        <w:rPr>
-          <w:sz w:val="24"/>
-        </w:rPr>
-      </w:pPr>
-    </w:p>
-    <w:p>
-      <w:pPr>
-        <w:rPr>
-          <w:sz w:val="24"/>
-        </w:rPr>
-      </w:pPr>
-    </w:p>
-    <w:p>
-      <w:pPr>
-        <w:rPr>
-          <w:sz w:val="24"/>
-        </w:rPr>
-      </w:pPr>
-    </w:p>
-    <w:p>
-      <w:pPr>
-        <w:rPr>
-          <w:sz w:val="24"/>
-        </w:rPr>
-      </w:pPr>
-    </w:p>
-    <w:p>
-      <w:pPr>
-        <w:rPr>
-          <w:sz w:val="24"/>
-        </w:rPr>
-      </w:pPr>
-    </w:p>
-    <w:p>
-      <w:pPr>
-        <w:rPr>
-          <w:sz w:val="24"/>
-        </w:rPr>
-      </w:pPr>
-    </w:p>
-    <w:p>
-      <w:pPr>
-        <w:rPr>
-          <w:sz w:val="24"/>
-        </w:rPr>
-      </w:pPr>
-    </w:p>
-    <w:p>
-      <w:pPr>
-        <w:rPr>
-          <w:sz w:val="24"/>
-        </w:rPr>
-      </w:pPr>
-    </w:p>
-    <w:p>
-      <w:pPr>
-        <w:rPr>
-          <w:sz w:val="24"/>
-        </w:rPr>
-      </w:pPr>
-    </w:p>
-    <w:p>
-      <w:pPr>
-        <w:rPr>
-          <w:sz w:val="24"/>
-        </w:rPr>
-      </w:pPr>
-    </w:p>
-    <w:p>
-      <w:pPr>
-        <w:rPr>
-          <w:sz w:val="24"/>
-        </w:rPr>
-      </w:pPr>
-    </w:p>
-    <w:p>
-      <w:pPr>
-        <w:rPr>
-          <w:sz w:val="24"/>
-        </w:rPr>
-      </w:pPr>
-      <w:r>
-        <w:rPr>
-          <w:sz w:val="24"/>
-        </w:rPr>
-        <w:pict>
-          <v:rect id="_x0000_i1028" o:spt="1" style="height:0.75pt;width:0pt;" fillcolor="#A0A0A0" filled="t" stroked="f" coordsize="21600,21600" o:hr="t" o:hrstd="t" o:hralign="center">
-            <v:path/>
-            <v:fill on="t" focussize="0,0"/>
-            <v:stroke on="f"/>
-            <v:imagedata o:title=""/>
-            <o:lock v:ext="edit"/>
-            <w10:wrap type="none"/>
-            <w10:anchorlock/>
-          </v:rect>
+        <w:t xml:space="preserve"> Needs to Approve and manage system </w:t>
+      </w:r>
+      <w:proofErr w:type="gramStart"/>
+      <w:r>
+        <w:rPr>
+          <w:sz w:val="24"/>
+        </w:rPr>
+        <w:t>usage ,monitor</w:t>
+      </w:r>
+      <w:proofErr w:type="gramEnd"/>
+      <w:r>
+        <w:rPr>
+          <w:sz w:val="24"/>
+        </w:rPr>
+        <w:t xml:space="preserve"> overall performance and reports, ensure compliance with academic policies.</w:t>
+      </w:r>
+    </w:p>
+    <w:p>
+      <w:pPr>
+        <w:rPr>
+          <w:sz w:val="24"/>
+        </w:rPr>
+      </w:pPr>
+    </w:p>
+    <w:p>
+      <w:pPr>
+        <w:rPr>
+          <w:sz w:val="24"/>
+        </w:rPr>
+      </w:pPr>
+    </w:p>
+    <w:p>
+      <w:pPr>
+        <w:rPr>
+          <w:sz w:val="24"/>
+        </w:rPr>
+      </w:pPr>
+    </w:p>
+    <w:p>
+      <w:pPr>
+        <w:rPr>
+          <w:sz w:val="24"/>
+        </w:rPr>
+      </w:pPr>
+    </w:p>
+    <w:p>
+      <w:pPr>
+        <w:rPr>
+          <w:sz w:val="24"/>
+        </w:rPr>
+      </w:pPr>
+    </w:p>
+    <w:p>
+      <w:pPr>
+        <w:rPr>
+          <w:sz w:val="24"/>
+        </w:rPr>
+      </w:pPr>
+    </w:p>
+    <w:p>
+      <w:pPr>
+        <w:rPr>
+          <w:sz w:val="24"/>
+        </w:rPr>
+      </w:pPr>
+    </w:p>
+    <w:p>
+      <w:pPr>
+        <w:rPr>
+          <w:sz w:val="24"/>
+        </w:rPr>
+      </w:pPr>
+    </w:p>
+    <w:p>
+      <w:pPr>
+        <w:rPr>
+          <w:sz w:val="24"/>
+        </w:rPr>
+      </w:pPr>
+    </w:p>
+    <w:p>
+      <w:pPr>
+        <w:rPr>
+          <w:sz w:val="24"/>
+        </w:rPr>
+      </w:pPr>
+    </w:p>
+    <w:p>
+      <w:pPr>
+        <w:rPr>
+          <w:sz w:val="24"/>
+        </w:rPr>
+      </w:pPr>
+    </w:p>
+    <w:p>
+      <w:pPr>
+        <w:rPr>
+          <w:sz w:val="24"/>
+        </w:rPr>
+      </w:pPr>
+    </w:p>
+    <w:p>
+      <w:pPr>
+        <w:rPr>
+          <w:sz w:val="24"/>
+        </w:rPr>
+      </w:pPr>
+    </w:p>
+    <w:p>
+      <w:pPr>
+        <w:rPr>
+          <w:sz w:val="24"/>
+        </w:rPr>
+      </w:pPr>
+    </w:p>
+    <w:p>
+      <w:pPr>
+        <w:rPr>
+          <w:sz w:val="24"/>
+        </w:rPr>
+      </w:pPr>
+      <w:r>
+        <w:rPr>
+          <w:sz w:val="24"/>
+        </w:rPr>
+        <w:pict w14:anchorId="3A999796">
+          <v:rect id="_x0000_i1028" style="width:0;height:.75pt" o:hralign="center" o:hrstd="t" o:hr="t" fillcolor="#a0a0a0" stroked="f"/>
         </w:pict>
       </w:r>
     </w:p>
@@ -1252,29 +1366,22 @@
           <w:bCs/>
           <w:sz w:val="24"/>
         </w:rPr>
-        <w:t>4. REQUIREMENT HIGHLIGHTS</w:t>
+        <w:t>4. REQUIREMENT HIGH</w:t>
+      </w:r>
+      <w:r>
+        <w:rPr>
+          <w:b/>
+          <w:bCs/>
+          <w:sz w:val="24"/>
+        </w:rPr>
+        <w:t>LIGHTS</w:t>
       </w:r>
     </w:p>
     <w:tbl>
       <w:tblPr>
-        <w:tblStyle w:val="16"/>
+        <w:tblStyle w:val="GridTable1Light1"/>
         <w:tblW w:w="9810" w:type="dxa"/>
-        <w:tblInd w:w="0" w:type="dxa"/>
-        <w:tblBorders>
-          <w:top w:val="single" w:color="999999" w:themeColor="text1" w:themeTint="66" w:sz="4" w:space="0"/>
-          <w:left w:val="single" w:color="999999" w:themeColor="text1" w:themeTint="66" w:sz="4" w:space="0"/>
-          <w:bottom w:val="single" w:color="999999" w:themeColor="text1" w:themeTint="66" w:sz="4" w:space="0"/>
-          <w:right w:val="single" w:color="999999" w:themeColor="text1" w:themeTint="66" w:sz="4" w:space="0"/>
-          <w:insideH w:val="single" w:color="999999" w:themeColor="text1" w:themeTint="66" w:sz="4" w:space="0"/>
-          <w:insideV w:val="single" w:color="999999" w:themeColor="text1" w:themeTint="66" w:sz="4" w:space="0"/>
-        </w:tblBorders>
-        <w:tblLayout w:type="autofit"/>
-        <w:tblCellMar>
-          <w:top w:w="0" w:type="dxa"/>
-          <w:left w:w="108" w:type="dxa"/>
-          <w:bottom w:w="0" w:type="dxa"/>
-          <w:right w:w="108" w:type="dxa"/>
-        </w:tblCellMar>
+        <w:tblLook w:val="04A0" w:firstRow="1" w:lastRow="0" w:firstColumn="1" w:lastColumn="0" w:noHBand="0" w:noVBand="1"/>
       </w:tblPr>
       <w:tblGrid>
         <w:gridCol w:w="881"/>
@@ -1282,45 +1389,23 @@
         <w:gridCol w:w="2203"/>
       </w:tblGrid>
       <w:tr>
-        <w:tblPrEx>
-          <w:tblBorders>
-            <w:top w:val="single" w:color="999999" w:themeColor="text1" w:themeTint="66" w:sz="4" w:space="0"/>
-            <w:left w:val="single" w:color="999999" w:themeColor="text1" w:themeTint="66" w:sz="4" w:space="0"/>
-            <w:bottom w:val="single" w:color="999999" w:themeColor="text1" w:themeTint="66" w:sz="4" w:space="0"/>
-            <w:right w:val="single" w:color="999999" w:themeColor="text1" w:themeTint="66" w:sz="4" w:space="0"/>
-            <w:insideH w:val="single" w:color="999999" w:themeColor="text1" w:themeTint="66" w:sz="4" w:space="0"/>
-            <w:insideV w:val="single" w:color="999999" w:themeColor="text1" w:themeTint="66" w:sz="4" w:space="0"/>
-          </w:tblBorders>
-          <w:tblCellMar>
-            <w:top w:w="0" w:type="dxa"/>
-            <w:left w:w="108" w:type="dxa"/>
-            <w:bottom w:w="0" w:type="dxa"/>
-            <w:right w:w="108" w:type="dxa"/>
-          </w:tblCellMar>
-        </w:tblPrEx>
         <w:trPr>
-          <w:trHeight w:val="579" w:hRule="atLeast"/>
+          <w:cnfStyle w:val="100000000000" w:firstRow="1" w:lastRow="0" w:firstColumn="0" w:lastColumn="0" w:oddVBand="0" w:evenVBand="0" w:oddHBand="0" w:evenHBand="0" w:firstRowFirstColumn="0" w:firstRowLastColumn="0" w:lastRowFirstColumn="0" w:lastRowLastColumn="0"/>
+          <w:trHeight w:val="579"/>
         </w:trPr>
         <w:tc>
           <w:tcPr>
+            <w:cnfStyle w:val="001000000000" w:firstRow="0" w:lastRow="0" w:firstColumn="1" w:lastColumn="0" w:oddVBand="0" w:evenVBand="0" w:oddHBand="0" w:evenHBand="0" w:firstRowFirstColumn="0" w:firstRowLastColumn="0" w:lastRowFirstColumn="0" w:lastRowLastColumn="0"/>
             <w:tcW w:w="881" w:type="dxa"/>
-            <w:tcBorders>
-              <w:bottom w:val="single" w:color="666666" w:themeColor="text1" w:themeTint="99" w:sz="12" w:space="0"/>
-              <w:insideH w:val="single" w:sz="12" w:space="0"/>
-            </w:tcBorders>
-          </w:tcPr>
-          <w:p>
-            <w:pPr>
-              <w:rPr>
-                <w:b w:val="0"/>
-                <w:bCs w:val="0"/>
-                <w:sz w:val="24"/>
-              </w:rPr>
-            </w:pPr>
-            <w:r>
-              <w:rPr>
-                <w:b/>
-                <w:bCs/>
+          </w:tcPr>
+          <w:p>
+            <w:pPr>
+              <w:rPr>
+                <w:sz w:val="24"/>
+              </w:rPr>
+            </w:pPr>
+            <w:r>
+              <w:rPr>
                 <w:sz w:val="24"/>
               </w:rPr>
               <w:t>ID</w:t>
@@ -1330,23 +1415,16 @@
         <w:tc>
           <w:tcPr>
             <w:tcW w:w="6726" w:type="dxa"/>
-            <w:tcBorders>
-              <w:bottom w:val="single" w:color="666666" w:themeColor="text1" w:themeTint="99" w:sz="12" w:space="0"/>
-              <w:insideH w:val="single" w:sz="12" w:space="0"/>
-            </w:tcBorders>
-          </w:tcPr>
-          <w:p>
-            <w:pPr>
-              <w:rPr>
-                <w:b w:val="0"/>
-                <w:bCs w:val="0"/>
-                <w:sz w:val="24"/>
-              </w:rPr>
-            </w:pPr>
-            <w:r>
-              <w:rPr>
-                <w:b/>
-                <w:bCs/>
+          </w:tcPr>
+          <w:p>
+            <w:pPr>
+              <w:cnfStyle w:val="100000000000" w:firstRow="1" w:lastRow="0" w:firstColumn="0" w:lastColumn="0" w:oddVBand="0" w:evenVBand="0" w:oddHBand="0" w:evenHBand="0" w:firstRowFirstColumn="0" w:firstRowLastColumn="0" w:lastRowFirstColumn="0" w:lastRowLastColumn="0"/>
+              <w:rPr>
+                <w:sz w:val="24"/>
+              </w:rPr>
+            </w:pPr>
+            <w:r>
+              <w:rPr>
                 <w:sz w:val="24"/>
               </w:rPr>
               <w:t>Requirement Description</w:t>
@@ -1356,23 +1434,16 @@
         <w:tc>
           <w:tcPr>
             <w:tcW w:w="2203" w:type="dxa"/>
-            <w:tcBorders>
-              <w:bottom w:val="single" w:color="666666" w:themeColor="text1" w:themeTint="99" w:sz="12" w:space="0"/>
-              <w:insideH w:val="single" w:sz="12" w:space="0"/>
-            </w:tcBorders>
-          </w:tcPr>
-          <w:p>
-            <w:pPr>
-              <w:rPr>
-                <w:b w:val="0"/>
-                <w:bCs w:val="0"/>
-                <w:sz w:val="24"/>
-              </w:rPr>
-            </w:pPr>
-            <w:r>
-              <w:rPr>
-                <w:b/>
-                <w:bCs/>
+          </w:tcPr>
+          <w:p>
+            <w:pPr>
+              <w:cnfStyle w:val="100000000000" w:firstRow="1" w:lastRow="0" w:firstColumn="0" w:lastColumn="0" w:oddVBand="0" w:evenVBand="0" w:oddHBand="0" w:evenHBand="0" w:firstRowFirstColumn="0" w:firstRowLastColumn="0" w:lastRowFirstColumn="0" w:lastRowLastColumn="0"/>
+              <w:rPr>
+                <w:sz w:val="24"/>
+              </w:rPr>
+            </w:pPr>
+            <w:r>
+              <w:rPr>
                 <w:sz w:val="24"/>
               </w:rPr>
               <w:t>Priority (High/Med/Low)</w:t>
@@ -1381,41 +1452,22 @@
         </w:tc>
       </w:tr>
       <w:tr>
-        <w:tblPrEx>
-          <w:tblBorders>
-            <w:top w:val="single" w:color="999999" w:themeColor="text1" w:themeTint="66" w:sz="4" w:space="0"/>
-            <w:left w:val="single" w:color="999999" w:themeColor="text1" w:themeTint="66" w:sz="4" w:space="0"/>
-            <w:bottom w:val="single" w:color="999999" w:themeColor="text1" w:themeTint="66" w:sz="4" w:space="0"/>
-            <w:right w:val="single" w:color="999999" w:themeColor="text1" w:themeTint="66" w:sz="4" w:space="0"/>
-            <w:insideH w:val="single" w:color="999999" w:themeColor="text1" w:themeTint="66" w:sz="4" w:space="0"/>
-            <w:insideV w:val="single" w:color="999999" w:themeColor="text1" w:themeTint="66" w:sz="4" w:space="0"/>
-          </w:tblBorders>
-          <w:tblCellMar>
-            <w:top w:w="0" w:type="dxa"/>
-            <w:left w:w="108" w:type="dxa"/>
-            <w:bottom w:w="0" w:type="dxa"/>
-            <w:right w:w="108" w:type="dxa"/>
-          </w:tblCellMar>
-        </w:tblPrEx>
         <w:trPr>
-          <w:trHeight w:val="561" w:hRule="atLeast"/>
+          <w:trHeight w:val="561"/>
         </w:trPr>
         <w:tc>
           <w:tcPr>
+            <w:cnfStyle w:val="001000000000" w:firstRow="0" w:lastRow="0" w:firstColumn="1" w:lastColumn="0" w:oddVBand="0" w:evenVBand="0" w:oddHBand="0" w:evenHBand="0" w:firstRowFirstColumn="0" w:firstRowLastColumn="0" w:lastRowFirstColumn="0" w:lastRowLastColumn="0"/>
             <w:tcW w:w="881" w:type="dxa"/>
           </w:tcPr>
           <w:p>
             <w:pPr>
               <w:rPr>
-                <w:b w:val="0"/>
-                <w:bCs w:val="0"/>
-                <w:sz w:val="24"/>
-              </w:rPr>
-            </w:pPr>
-            <w:r>
-              <w:rPr>
-                <w:b/>
-                <w:bCs/>
+                <w:sz w:val="24"/>
+              </w:rPr>
+            </w:pPr>
+            <w:r>
+              <w:rPr>
                 <w:sz w:val="24"/>
               </w:rPr>
               <w:t>FR-01</w:t>
@@ -1428,6 +1480,7 @@
           </w:tcPr>
           <w:p>
             <w:pPr>
+              <w:cnfStyle w:val="000000000000" w:firstRow="0" w:lastRow="0" w:firstColumn="0" w:lastColumn="0" w:oddVBand="0" w:evenVBand="0" w:oddHBand="0" w:evenHBand="0" w:firstRowFirstColumn="0" w:firstRowLastColumn="0" w:lastRowFirstColumn="0" w:lastRowLastColumn="0"/>
               <w:rPr>
                 <w:sz w:val="24"/>
               </w:rPr>
@@ -1440,9 +1493,7 @@
             </w:r>
             <w:r>
               <w:rPr>
-                <w:rFonts w:hint="default"/>
-                <w:sz w:val="24"/>
-                <w:lang w:val="en-US"/>
+                <w:sz w:val="24"/>
               </w:rPr>
               <w:t>allow</w:t>
             </w:r>
@@ -1460,6 +1511,7 @@
           </w:tcPr>
           <w:p>
             <w:pPr>
+              <w:cnfStyle w:val="000000000000" w:firstRow="0" w:lastRow="0" w:firstColumn="0" w:lastColumn="0" w:oddVBand="0" w:evenVBand="0" w:oddHBand="0" w:evenHBand="0" w:firstRowFirstColumn="0" w:firstRowLastColumn="0" w:lastRowFirstColumn="0" w:lastRowLastColumn="0"/>
               <w:rPr>
                 <w:sz w:val="24"/>
               </w:rPr>
@@ -1474,41 +1526,22 @@
         </w:tc>
       </w:tr>
       <w:tr>
-        <w:tblPrEx>
-          <w:tblBorders>
-            <w:top w:val="single" w:color="999999" w:themeColor="text1" w:themeTint="66" w:sz="4" w:space="0"/>
-            <w:left w:val="single" w:color="999999" w:themeColor="text1" w:themeTint="66" w:sz="4" w:space="0"/>
-            <w:bottom w:val="single" w:color="999999" w:themeColor="text1" w:themeTint="66" w:sz="4" w:space="0"/>
-            <w:right w:val="single" w:color="999999" w:themeColor="text1" w:themeTint="66" w:sz="4" w:space="0"/>
-            <w:insideH w:val="single" w:color="999999" w:themeColor="text1" w:themeTint="66" w:sz="4" w:space="0"/>
-            <w:insideV w:val="single" w:color="999999" w:themeColor="text1" w:themeTint="66" w:sz="4" w:space="0"/>
-          </w:tblBorders>
-          <w:tblCellMar>
-            <w:top w:w="0" w:type="dxa"/>
-            <w:left w:w="108" w:type="dxa"/>
-            <w:bottom w:w="0" w:type="dxa"/>
-            <w:right w:w="108" w:type="dxa"/>
-          </w:tblCellMar>
-        </w:tblPrEx>
         <w:trPr>
-          <w:trHeight w:val="579" w:hRule="atLeast"/>
+          <w:trHeight w:val="579"/>
         </w:trPr>
         <w:tc>
           <w:tcPr>
+            <w:cnfStyle w:val="001000000000" w:firstRow="0" w:lastRow="0" w:firstColumn="1" w:lastColumn="0" w:oddVBand="0" w:evenVBand="0" w:oddHBand="0" w:evenHBand="0" w:firstRowFirstColumn="0" w:firstRowLastColumn="0" w:lastRowFirstColumn="0" w:lastRowLastColumn="0"/>
             <w:tcW w:w="881" w:type="dxa"/>
           </w:tcPr>
           <w:p>
             <w:pPr>
               <w:rPr>
-                <w:b w:val="0"/>
-                <w:bCs w:val="0"/>
-                <w:sz w:val="24"/>
-              </w:rPr>
-            </w:pPr>
-            <w:r>
-              <w:rPr>
-                <w:b/>
-                <w:bCs/>
+                <w:sz w:val="24"/>
+              </w:rPr>
+            </w:pPr>
+            <w:r>
+              <w:rPr>
                 <w:sz w:val="24"/>
               </w:rPr>
               <w:t>FR-02</w:t>
@@ -1521,6 +1554,7 @@
           </w:tcPr>
           <w:p>
             <w:pPr>
+              <w:cnfStyle w:val="000000000000" w:firstRow="0" w:lastRow="0" w:firstColumn="0" w:lastColumn="0" w:oddVBand="0" w:evenVBand="0" w:oddHBand="0" w:evenHBand="0" w:firstRowFirstColumn="0" w:firstRowLastColumn="0" w:lastRowFirstColumn="0" w:lastRowLastColumn="0"/>
               <w:rPr>
                 <w:sz w:val="24"/>
               </w:rPr>
@@ -1548,6 +1582,7 @@
           </w:tcPr>
           <w:p>
             <w:pPr>
+              <w:cnfStyle w:val="000000000000" w:firstRow="0" w:lastRow="0" w:firstColumn="0" w:lastColumn="0" w:oddVBand="0" w:evenVBand="0" w:oddHBand="0" w:evenHBand="0" w:firstRowFirstColumn="0" w:firstRowLastColumn="0" w:lastRowFirstColumn="0" w:lastRowLastColumn="0"/>
               <w:rPr>
                 <w:sz w:val="24"/>
               </w:rPr>
@@ -1562,41 +1597,22 @@
         </w:tc>
       </w:tr>
       <w:tr>
-        <w:tblPrEx>
-          <w:tblBorders>
-            <w:top w:val="single" w:color="999999" w:themeColor="text1" w:themeTint="66" w:sz="4" w:space="0"/>
-            <w:left w:val="single" w:color="999999" w:themeColor="text1" w:themeTint="66" w:sz="4" w:space="0"/>
-            <w:bottom w:val="single" w:color="999999" w:themeColor="text1" w:themeTint="66" w:sz="4" w:space="0"/>
-            <w:right w:val="single" w:color="999999" w:themeColor="text1" w:themeTint="66" w:sz="4" w:space="0"/>
-            <w:insideH w:val="single" w:color="999999" w:themeColor="text1" w:themeTint="66" w:sz="4" w:space="0"/>
-            <w:insideV w:val="single" w:color="999999" w:themeColor="text1" w:themeTint="66" w:sz="4" w:space="0"/>
-          </w:tblBorders>
-          <w:tblCellMar>
-            <w:top w:w="0" w:type="dxa"/>
-            <w:left w:w="108" w:type="dxa"/>
-            <w:bottom w:w="0" w:type="dxa"/>
-            <w:right w:w="108" w:type="dxa"/>
-          </w:tblCellMar>
-        </w:tblPrEx>
         <w:trPr>
-          <w:trHeight w:val="579" w:hRule="atLeast"/>
+          <w:trHeight w:val="579"/>
         </w:trPr>
         <w:tc>
           <w:tcPr>
+            <w:cnfStyle w:val="001000000000" w:firstRow="0" w:lastRow="0" w:firstColumn="1" w:lastColumn="0" w:oddVBand="0" w:evenVBand="0" w:oddHBand="0" w:evenHBand="0" w:firstRowFirstColumn="0" w:firstRowLastColumn="0" w:lastRowFirstColumn="0" w:lastRowLastColumn="0"/>
             <w:tcW w:w="881" w:type="dxa"/>
           </w:tcPr>
           <w:p>
             <w:pPr>
               <w:rPr>
-                <w:b w:val="0"/>
-                <w:bCs w:val="0"/>
-                <w:sz w:val="24"/>
-              </w:rPr>
-            </w:pPr>
-            <w:r>
-              <w:rPr>
-                <w:b/>
-                <w:bCs/>
+                <w:sz w:val="24"/>
+              </w:rPr>
+            </w:pPr>
+            <w:r>
+              <w:rPr>
                 <w:sz w:val="24"/>
               </w:rPr>
               <w:t>FR-03</w:t>
@@ -1609,6 +1625,7 @@
           </w:tcPr>
           <w:p>
             <w:pPr>
+              <w:cnfStyle w:val="000000000000" w:firstRow="0" w:lastRow="0" w:firstColumn="0" w:lastColumn="0" w:oddVBand="0" w:evenVBand="0" w:oddHBand="0" w:evenHBand="0" w:firstRowFirstColumn="0" w:firstRowLastColumn="0" w:lastRowFirstColumn="0" w:lastRowLastColumn="0"/>
               <w:rPr>
                 <w:sz w:val="24"/>
               </w:rPr>
@@ -1621,9 +1638,7 @@
             </w:r>
             <w:r>
               <w:rPr>
-                <w:rFonts w:hint="default"/>
-                <w:sz w:val="24"/>
-                <w:lang w:val="en-US"/>
+                <w:sz w:val="24"/>
               </w:rPr>
               <w:t>allow</w:t>
             </w:r>
@@ -1641,6 +1656,7 @@
           </w:tcPr>
           <w:p>
             <w:pPr>
+              <w:cnfStyle w:val="000000000000" w:firstRow="0" w:lastRow="0" w:firstColumn="0" w:lastColumn="0" w:oddVBand="0" w:evenVBand="0" w:oddHBand="0" w:evenHBand="0" w:firstRowFirstColumn="0" w:firstRowLastColumn="0" w:lastRowFirstColumn="0" w:lastRowLastColumn="0"/>
               <w:rPr>
                 <w:sz w:val="24"/>
               </w:rPr>
@@ -1655,41 +1671,22 @@
         </w:tc>
       </w:tr>
       <w:tr>
-        <w:tblPrEx>
-          <w:tblBorders>
-            <w:top w:val="single" w:color="999999" w:themeColor="text1" w:themeTint="66" w:sz="4" w:space="0"/>
-            <w:left w:val="single" w:color="999999" w:themeColor="text1" w:themeTint="66" w:sz="4" w:space="0"/>
-            <w:bottom w:val="single" w:color="999999" w:themeColor="text1" w:themeTint="66" w:sz="4" w:space="0"/>
-            <w:right w:val="single" w:color="999999" w:themeColor="text1" w:themeTint="66" w:sz="4" w:space="0"/>
-            <w:insideH w:val="single" w:color="999999" w:themeColor="text1" w:themeTint="66" w:sz="4" w:space="0"/>
-            <w:insideV w:val="single" w:color="999999" w:themeColor="text1" w:themeTint="66" w:sz="4" w:space="0"/>
-          </w:tblBorders>
-          <w:tblCellMar>
-            <w:top w:w="0" w:type="dxa"/>
-            <w:left w:w="108" w:type="dxa"/>
-            <w:bottom w:w="0" w:type="dxa"/>
-            <w:right w:w="108" w:type="dxa"/>
-          </w:tblCellMar>
-        </w:tblPrEx>
         <w:trPr>
-          <w:trHeight w:val="579" w:hRule="atLeast"/>
+          <w:trHeight w:val="579"/>
         </w:trPr>
         <w:tc>
           <w:tcPr>
+            <w:cnfStyle w:val="001000000000" w:firstRow="0" w:lastRow="0" w:firstColumn="1" w:lastColumn="0" w:oddVBand="0" w:evenVBand="0" w:oddHBand="0" w:evenHBand="0" w:firstRowFirstColumn="0" w:firstRowLastColumn="0" w:lastRowFirstColumn="0" w:lastRowLastColumn="0"/>
             <w:tcW w:w="881" w:type="dxa"/>
           </w:tcPr>
           <w:p>
             <w:pPr>
               <w:rPr>
-                <w:b w:val="0"/>
-                <w:bCs w:val="0"/>
-                <w:sz w:val="24"/>
-              </w:rPr>
-            </w:pPr>
-            <w:r>
-              <w:rPr>
-                <w:b/>
-                <w:bCs/>
+                <w:sz w:val="24"/>
+              </w:rPr>
+            </w:pPr>
+            <w:r>
+              <w:rPr>
                 <w:sz w:val="24"/>
               </w:rPr>
               <w:t>FR-04</w:t>
@@ -1702,6 +1699,7 @@
           </w:tcPr>
           <w:p>
             <w:pPr>
+              <w:cnfStyle w:val="000000000000" w:firstRow="0" w:lastRow="0" w:firstColumn="0" w:lastColumn="0" w:oddVBand="0" w:evenVBand="0" w:oddHBand="0" w:evenHBand="0" w:firstRowFirstColumn="0" w:firstRowLastColumn="0" w:lastRowFirstColumn="0" w:lastRowLastColumn="0"/>
               <w:rPr>
                 <w:sz w:val="24"/>
               </w:rPr>
@@ -1714,9 +1712,7 @@
             </w:r>
             <w:r>
               <w:rPr>
-                <w:rFonts w:hint="default"/>
-                <w:sz w:val="24"/>
-                <w:lang w:val="en-US"/>
+                <w:sz w:val="24"/>
               </w:rPr>
               <w:t xml:space="preserve">allow </w:t>
             </w:r>
@@ -1734,6 +1730,7 @@
           </w:tcPr>
           <w:p>
             <w:pPr>
+              <w:cnfStyle w:val="000000000000" w:firstRow="0" w:lastRow="0" w:firstColumn="0" w:lastColumn="0" w:oddVBand="0" w:evenVBand="0" w:oddHBand="0" w:evenHBand="0" w:firstRowFirstColumn="0" w:firstRowLastColumn="0" w:lastRowFirstColumn="0" w:lastRowLastColumn="0"/>
               <w:rPr>
                 <w:sz w:val="24"/>
               </w:rPr>
@@ -1748,41 +1745,22 @@
         </w:tc>
       </w:tr>
       <w:tr>
-        <w:tblPrEx>
-          <w:tblBorders>
-            <w:top w:val="single" w:color="999999" w:themeColor="text1" w:themeTint="66" w:sz="4" w:space="0"/>
-            <w:left w:val="single" w:color="999999" w:themeColor="text1" w:themeTint="66" w:sz="4" w:space="0"/>
-            <w:bottom w:val="single" w:color="999999" w:themeColor="text1" w:themeTint="66" w:sz="4" w:space="0"/>
-            <w:right w:val="single" w:color="999999" w:themeColor="text1" w:themeTint="66" w:sz="4" w:space="0"/>
-            <w:insideH w:val="single" w:color="999999" w:themeColor="text1" w:themeTint="66" w:sz="4" w:space="0"/>
-            <w:insideV w:val="single" w:color="999999" w:themeColor="text1" w:themeTint="66" w:sz="4" w:space="0"/>
-          </w:tblBorders>
-          <w:tblCellMar>
-            <w:top w:w="0" w:type="dxa"/>
-            <w:left w:w="108" w:type="dxa"/>
-            <w:bottom w:w="0" w:type="dxa"/>
-            <w:right w:w="108" w:type="dxa"/>
-          </w:tblCellMar>
-        </w:tblPrEx>
         <w:trPr>
-          <w:trHeight w:val="561" w:hRule="atLeast"/>
+          <w:trHeight w:val="561"/>
         </w:trPr>
         <w:tc>
           <w:tcPr>
+            <w:cnfStyle w:val="001000000000" w:firstRow="0" w:lastRow="0" w:firstColumn="1" w:lastColumn="0" w:oddVBand="0" w:evenVBand="0" w:oddHBand="0" w:evenHBand="0" w:firstRowFirstColumn="0" w:firstRowLastColumn="0" w:lastRowFirstColumn="0" w:lastRowLastColumn="0"/>
             <w:tcW w:w="881" w:type="dxa"/>
           </w:tcPr>
           <w:p>
             <w:pPr>
               <w:rPr>
-                <w:b w:val="0"/>
-                <w:bCs w:val="0"/>
-                <w:sz w:val="24"/>
-              </w:rPr>
-            </w:pPr>
-            <w:r>
-              <w:rPr>
-                <w:b/>
-                <w:bCs/>
+                <w:sz w:val="24"/>
+              </w:rPr>
+            </w:pPr>
+            <w:r>
+              <w:rPr>
                 <w:sz w:val="24"/>
               </w:rPr>
               <w:t>FR-05</w:t>
@@ -1798,20 +1776,28 @@
               <w:tabs>
                 <w:tab w:val="left" w:pos="4646"/>
               </w:tabs>
-              <w:rPr>
-                <w:sz w:val="24"/>
-              </w:rPr>
-            </w:pPr>
-            <w:r>
-              <w:rPr>
-                <w:sz w:val="24"/>
-              </w:rPr>
-              <w:t>The system shall automatically grade questions and calculate total scores</w:t>
+              <w:cnfStyle w:val="000000000000" w:firstRow="0" w:lastRow="0" w:firstColumn="0" w:lastColumn="0" w:oddVBand="0" w:evenVBand="0" w:oddHBand="0" w:evenHBand="0" w:firstRowFirstColumn="0" w:firstRowLastColumn="0" w:lastRowFirstColumn="0" w:lastRowLastColumn="0"/>
+              <w:rPr>
+                <w:sz w:val="24"/>
+              </w:rPr>
+            </w:pPr>
+            <w:r>
+              <w:rPr>
+                <w:sz w:val="24"/>
+              </w:rPr>
+              <w:t xml:space="preserve">The system shall automatically grade questions and </w:t>
+            </w:r>
+            <w:r>
+              <w:rPr>
+                <w:sz w:val="24"/>
+              </w:rPr>
+              <w:t>calculate total scores</w:t>
             </w:r>
           </w:p>
           <w:p>
             <w:pPr>
               <w:spacing w:after="0" w:line="240" w:lineRule="auto"/>
+              <w:cnfStyle w:val="000000000000" w:firstRow="0" w:lastRow="0" w:firstColumn="0" w:lastColumn="0" w:oddVBand="0" w:evenVBand="0" w:oddHBand="0" w:evenHBand="0" w:firstRowFirstColumn="0" w:firstRowLastColumn="0" w:lastRowFirstColumn="0" w:lastRowLastColumn="0"/>
               <w:rPr>
                 <w:sz w:val="24"/>
               </w:rPr>
@@ -1824,6 +1810,7 @@
           </w:tcPr>
           <w:p>
             <w:pPr>
+              <w:cnfStyle w:val="000000000000" w:firstRow="0" w:lastRow="0" w:firstColumn="0" w:lastColumn="0" w:oddVBand="0" w:evenVBand="0" w:oddHBand="0" w:evenHBand="0" w:firstRowFirstColumn="0" w:firstRowLastColumn="0" w:lastRowFirstColumn="0" w:lastRowLastColumn="0"/>
               <w:rPr>
                 <w:sz w:val="24"/>
               </w:rPr>
@@ -1838,42 +1825,23 @@
         </w:tc>
       </w:tr>
       <w:tr>
-        <w:tblPrEx>
-          <w:tblBorders>
-            <w:top w:val="single" w:color="999999" w:themeColor="text1" w:themeTint="66" w:sz="4" w:space="0"/>
-            <w:left w:val="single" w:color="999999" w:themeColor="text1" w:themeTint="66" w:sz="4" w:space="0"/>
-            <w:bottom w:val="single" w:color="999999" w:themeColor="text1" w:themeTint="66" w:sz="4" w:space="0"/>
-            <w:right w:val="single" w:color="999999" w:themeColor="text1" w:themeTint="66" w:sz="4" w:space="0"/>
-            <w:insideH w:val="single" w:color="999999" w:themeColor="text1" w:themeTint="66" w:sz="4" w:space="0"/>
-            <w:insideV w:val="single" w:color="999999" w:themeColor="text1" w:themeTint="66" w:sz="4" w:space="0"/>
-          </w:tblBorders>
-          <w:tblCellMar>
-            <w:top w:w="0" w:type="dxa"/>
-            <w:left w:w="108" w:type="dxa"/>
-            <w:bottom w:w="0" w:type="dxa"/>
-            <w:right w:w="108" w:type="dxa"/>
-          </w:tblCellMar>
-        </w:tblPrEx>
         <w:trPr>
-          <w:trHeight w:val="561" w:hRule="atLeast"/>
+          <w:trHeight w:val="561"/>
         </w:trPr>
         <w:tc>
           <w:tcPr>
+            <w:cnfStyle w:val="001000000000" w:firstRow="0" w:lastRow="0" w:firstColumn="1" w:lastColumn="0" w:oddVBand="0" w:evenVBand="0" w:oddHBand="0" w:evenHBand="0" w:firstRowFirstColumn="0" w:firstRowLastColumn="0" w:lastRowFirstColumn="0" w:lastRowLastColumn="0"/>
             <w:tcW w:w="881" w:type="dxa"/>
           </w:tcPr>
           <w:p>
             <w:pPr>
               <w:spacing w:after="0" w:line="240" w:lineRule="auto"/>
               <w:rPr>
-                <w:b w:val="0"/>
-                <w:bCs w:val="0"/>
-                <w:sz w:val="24"/>
-              </w:rPr>
-            </w:pPr>
-            <w:r>
-              <w:rPr>
-                <w:b/>
-                <w:bCs/>
+                <w:sz w:val="24"/>
+              </w:rPr>
+            </w:pPr>
+            <w:r>
+              <w:rPr>
                 <w:sz w:val="24"/>
               </w:rPr>
               <w:t>FR-06</w:t>
@@ -1887,6 +1855,7 @@
           <w:p>
             <w:pPr>
               <w:spacing w:after="0" w:line="240" w:lineRule="auto"/>
+              <w:cnfStyle w:val="000000000000" w:firstRow="0" w:lastRow="0" w:firstColumn="0" w:lastColumn="0" w:oddVBand="0" w:evenVBand="0" w:oddHBand="0" w:evenHBand="0" w:firstRowFirstColumn="0" w:firstRowLastColumn="0" w:lastRowFirstColumn="0" w:lastRowLastColumn="0"/>
               <w:rPr>
                 <w:sz w:val="24"/>
               </w:rPr>
@@ -1906,6 +1875,7 @@
           <w:p>
             <w:pPr>
               <w:spacing w:after="0" w:line="240" w:lineRule="auto"/>
+              <w:cnfStyle w:val="000000000000" w:firstRow="0" w:lastRow="0" w:firstColumn="0" w:lastColumn="0" w:oddVBand="0" w:evenVBand="0" w:oddHBand="0" w:evenHBand="0" w:firstRowFirstColumn="0" w:firstRowLastColumn="0" w:lastRowFirstColumn="0" w:lastRowLastColumn="0"/>
               <w:rPr>
                 <w:sz w:val="24"/>
               </w:rPr>
@@ -1920,42 +1890,23 @@
         </w:tc>
       </w:tr>
       <w:tr>
-        <w:tblPrEx>
-          <w:tblBorders>
-            <w:top w:val="single" w:color="999999" w:themeColor="text1" w:themeTint="66" w:sz="4" w:space="0"/>
-            <w:left w:val="single" w:color="999999" w:themeColor="text1" w:themeTint="66" w:sz="4" w:space="0"/>
-            <w:bottom w:val="single" w:color="999999" w:themeColor="text1" w:themeTint="66" w:sz="4" w:space="0"/>
-            <w:right w:val="single" w:color="999999" w:themeColor="text1" w:themeTint="66" w:sz="4" w:space="0"/>
-            <w:insideH w:val="single" w:color="999999" w:themeColor="text1" w:themeTint="66" w:sz="4" w:space="0"/>
-            <w:insideV w:val="single" w:color="999999" w:themeColor="text1" w:themeTint="66" w:sz="4" w:space="0"/>
-          </w:tblBorders>
-          <w:tblCellMar>
-            <w:top w:w="0" w:type="dxa"/>
-            <w:left w:w="108" w:type="dxa"/>
-            <w:bottom w:w="0" w:type="dxa"/>
-            <w:right w:w="108" w:type="dxa"/>
-          </w:tblCellMar>
-        </w:tblPrEx>
         <w:trPr>
-          <w:trHeight w:val="561" w:hRule="atLeast"/>
+          <w:trHeight w:val="561"/>
         </w:trPr>
         <w:tc>
           <w:tcPr>
+            <w:cnfStyle w:val="001000000000" w:firstRow="0" w:lastRow="0" w:firstColumn="1" w:lastColumn="0" w:oddVBand="0" w:evenVBand="0" w:oddHBand="0" w:evenHBand="0" w:firstRowFirstColumn="0" w:firstRowLastColumn="0" w:lastRowFirstColumn="0" w:lastRowLastColumn="0"/>
             <w:tcW w:w="881" w:type="dxa"/>
           </w:tcPr>
           <w:p>
             <w:pPr>
               <w:spacing w:after="0" w:line="240" w:lineRule="auto"/>
               <w:rPr>
-                <w:b w:val="0"/>
-                <w:bCs w:val="0"/>
-                <w:sz w:val="24"/>
-              </w:rPr>
-            </w:pPr>
-            <w:r>
-              <w:rPr>
-                <w:b/>
-                <w:bCs/>
+                <w:sz w:val="24"/>
+              </w:rPr>
+            </w:pPr>
+            <w:r>
+              <w:rPr>
                 <w:sz w:val="24"/>
               </w:rPr>
               <w:t>FR-07</w:t>
@@ -1972,6 +1923,7 @@
                 <w:tab w:val="left" w:pos="1728"/>
               </w:tabs>
               <w:spacing w:after="0" w:line="240" w:lineRule="auto"/>
+              <w:cnfStyle w:val="000000000000" w:firstRow="0" w:lastRow="0" w:firstColumn="0" w:lastColumn="0" w:oddVBand="0" w:evenVBand="0" w:oddHBand="0" w:evenHBand="0" w:firstRowFirstColumn="0" w:firstRowLastColumn="0" w:lastRowFirstColumn="0" w:lastRowLastColumn="0"/>
               <w:rPr>
                 <w:sz w:val="24"/>
               </w:rPr>
@@ -1984,9 +1936,7 @@
             </w:r>
             <w:r>
               <w:rPr>
-                <w:rFonts w:hint="default"/>
-                <w:sz w:val="24"/>
-                <w:lang w:val="en-US"/>
+                <w:sz w:val="24"/>
               </w:rPr>
               <w:t>allow</w:t>
             </w:r>
@@ -2011,6 +1961,7 @@
           <w:p>
             <w:pPr>
               <w:spacing w:after="0" w:line="240" w:lineRule="auto"/>
+              <w:cnfStyle w:val="000000000000" w:firstRow="0" w:lastRow="0" w:firstColumn="0" w:lastColumn="0" w:oddVBand="0" w:evenVBand="0" w:oddHBand="0" w:evenHBand="0" w:firstRowFirstColumn="0" w:firstRowLastColumn="0" w:lastRowFirstColumn="0" w:lastRowLastColumn="0"/>
               <w:rPr>
                 <w:sz w:val="24"/>
               </w:rPr>
@@ -2025,42 +1976,23 @@
         </w:tc>
       </w:tr>
       <w:tr>
-        <w:tblPrEx>
-          <w:tblBorders>
-            <w:top w:val="single" w:color="999999" w:themeColor="text1" w:themeTint="66" w:sz="4" w:space="0"/>
-            <w:left w:val="single" w:color="999999" w:themeColor="text1" w:themeTint="66" w:sz="4" w:space="0"/>
-            <w:bottom w:val="single" w:color="999999" w:themeColor="text1" w:themeTint="66" w:sz="4" w:space="0"/>
-            <w:right w:val="single" w:color="999999" w:themeColor="text1" w:themeTint="66" w:sz="4" w:space="0"/>
-            <w:insideH w:val="single" w:color="999999" w:themeColor="text1" w:themeTint="66" w:sz="4" w:space="0"/>
-            <w:insideV w:val="single" w:color="999999" w:themeColor="text1" w:themeTint="66" w:sz="4" w:space="0"/>
-          </w:tblBorders>
-          <w:tblCellMar>
-            <w:top w:w="0" w:type="dxa"/>
-            <w:left w:w="108" w:type="dxa"/>
-            <w:bottom w:w="0" w:type="dxa"/>
-            <w:right w:w="108" w:type="dxa"/>
-          </w:tblCellMar>
-        </w:tblPrEx>
         <w:trPr>
-          <w:trHeight w:val="561" w:hRule="atLeast"/>
+          <w:trHeight w:val="561"/>
         </w:trPr>
         <w:tc>
           <w:tcPr>
+            <w:cnfStyle w:val="001000000000" w:firstRow="0" w:lastRow="0" w:firstColumn="1" w:lastColumn="0" w:oddVBand="0" w:evenVBand="0" w:oddHBand="0" w:evenHBand="0" w:firstRowFirstColumn="0" w:firstRowLastColumn="0" w:lastRowFirstColumn="0" w:lastRowLastColumn="0"/>
             <w:tcW w:w="881" w:type="dxa"/>
           </w:tcPr>
           <w:p>
             <w:pPr>
               <w:spacing w:after="0" w:line="240" w:lineRule="auto"/>
               <w:rPr>
-                <w:b w:val="0"/>
-                <w:bCs w:val="0"/>
-                <w:sz w:val="24"/>
-              </w:rPr>
-            </w:pPr>
-            <w:r>
-              <w:rPr>
-                <w:b/>
-                <w:bCs/>
+                <w:sz w:val="24"/>
+              </w:rPr>
+            </w:pPr>
+            <w:r>
+              <w:rPr>
                 <w:sz w:val="24"/>
               </w:rPr>
               <w:t>FR-08</w:t>
@@ -2074,12 +2006,16 @@
           <w:p>
             <w:pPr>
               <w:spacing w:after="0" w:line="240" w:lineRule="auto"/>
-              <w:rPr>
-                <w:sz w:val="24"/>
-              </w:rPr>
-            </w:pPr>
-            <w:r>
-              <w:t>The system shall support multiple question types (MCQ, True/False, Short Answer) and allow teachers to add, edit, or remove questions</w:t>
+              <w:cnfStyle w:val="000000000000" w:firstRow="0" w:lastRow="0" w:firstColumn="0" w:lastColumn="0" w:oddVBand="0" w:evenVBand="0" w:oddHBand="0" w:evenHBand="0" w:firstRowFirstColumn="0" w:firstRowLastColumn="0" w:lastRowFirstColumn="0" w:lastRowLastColumn="0"/>
+              <w:rPr>
+                <w:sz w:val="24"/>
+              </w:rPr>
+            </w:pPr>
+            <w:r>
+              <w:t xml:space="preserve">The system shall support multiple question </w:t>
+            </w:r>
+            <w:r>
+              <w:t>types (MCQ, True/False, Short Answer) and allow teachers to add, edit, or remove questions</w:t>
             </w:r>
           </w:p>
         </w:tc>
@@ -2090,6 +2026,7 @@
           <w:p>
             <w:pPr>
               <w:spacing w:after="0" w:line="240" w:lineRule="auto"/>
+              <w:cnfStyle w:val="000000000000" w:firstRow="0" w:lastRow="0" w:firstColumn="0" w:lastColumn="0" w:oddVBand="0" w:evenVBand="0" w:oddHBand="0" w:evenHBand="0" w:firstRowFirstColumn="0" w:firstRowLastColumn="0" w:lastRowFirstColumn="0" w:lastRowLastColumn="0"/>
               <w:rPr>
                 <w:sz w:val="24"/>
               </w:rPr>
@@ -2198,16 +2135,9 @@
         <w:rPr>
           <w:sz w:val="24"/>
         </w:rPr>
-        <w:pict>
-          <v:rect id="_x0000_i1029" o:spt="1" style="height:0.75pt;width:0pt;" fillcolor="#A0A0A0" filled="t" stroked="f" coordsize="21600,21600" o:hr="t" o:hrstd="t" o:hralign="center">
-            <v:path/>
-            <v:fill on="t" focussize="0,0"/>
-            <v:stroke on="f"/>
-            <v:imagedata o:title=""/>
-            <o:lock v:ext="edit"/>
-            <w10:wrap type="none"/>
-            <w10:anchorlock/>
-          </v:rect>
+        <w:lastRenderedPageBreak/>
+        <w:pict w14:anchorId="31592631">
+          <v:rect id="_x0000_i1029" style="width:0;height:.75pt" o:hralign="center" o:hrstd="t" o:hr="t" fillcolor="#a0a0a0" stroked="f"/>
         </w:pict>
       </w:r>
     </w:p>
@@ -2228,50 +2158,25 @@
         <w:t>5. TECHNOLOGY STACK</w:t>
       </w:r>
     </w:p>
-    <w:p>
-      <w:pPr>
-        <w:rPr>
-          <w:sz w:val="24"/>
-        </w:rPr>
-      </w:pPr>
-      <w:r>
-        <w:rPr>
-          <w:i/>
-          <w:iCs/>
-          <w:sz w:val="24"/>
-        </w:rPr>
-        <w:t>[Specify the technologies you plan to use and why.]</w:t>
-      </w:r>
-    </w:p>
     <w:tbl>
       <w:tblPr>
-        <w:tblStyle w:val="7"/>
         <w:tblW w:w="8920" w:type="dxa"/>
-        <w:tblInd w:w="0" w:type="dxa"/>
-        <w:tblLayout w:type="autofit"/>
         <w:tblCellMar>
           <w:top w:w="15" w:type="dxa"/>
           <w:left w:w="15" w:type="dxa"/>
           <w:bottom w:w="15" w:type="dxa"/>
           <w:right w:w="15" w:type="dxa"/>
         </w:tblCellMar>
+        <w:tblLook w:val="04A0" w:firstRow="1" w:lastRow="0" w:firstColumn="1" w:lastColumn="0" w:noHBand="0" w:noVBand="1"/>
       </w:tblPr>
       <w:tblGrid>
-        <w:gridCol w:w="1330"/>
-        <w:gridCol w:w="2129"/>
-        <w:gridCol w:w="5461"/>
+        <w:gridCol w:w="1254"/>
+        <w:gridCol w:w="2138"/>
+        <w:gridCol w:w="5528"/>
       </w:tblGrid>
       <w:tr>
-        <w:tblPrEx>
-          <w:tblCellMar>
-            <w:top w:w="15" w:type="dxa"/>
-            <w:left w:w="15" w:type="dxa"/>
-            <w:bottom w:w="15" w:type="dxa"/>
-            <w:right w:w="15" w:type="dxa"/>
-          </w:tblCellMar>
-        </w:tblPrEx>
         <w:trPr>
-          <w:trHeight w:val="671" w:hRule="atLeast"/>
+          <w:trHeight w:val="671"/>
           <w:tblHeader/>
         </w:trPr>
         <w:tc>
@@ -2360,16 +2265,8 @@
         </w:tc>
       </w:tr>
       <w:tr>
-        <w:tblPrEx>
-          <w:tblCellMar>
-            <w:top w:w="15" w:type="dxa"/>
-            <w:left w:w="15" w:type="dxa"/>
-            <w:bottom w:w="15" w:type="dxa"/>
-            <w:right w:w="15" w:type="dxa"/>
-          </w:tblCellMar>
-        </w:tblPrEx>
         <w:trPr>
-          <w:trHeight w:val="1112" w:hRule="atLeast"/>
+          <w:trHeight w:val="1112"/>
         </w:trPr>
         <w:tc>
           <w:tcPr>
@@ -2419,7 +2316,13 @@
               <w:rPr>
                 <w:sz w:val="24"/>
               </w:rPr>
-              <w:t>[NextJS, TRPC + Tanstack Query and TailwindCss]</w:t>
+              <w:t xml:space="preserve">[NextJS, TRPC + </w:t>
+            </w:r>
+            <w:r>
+              <w:rPr>
+                <w:sz w:val="24"/>
+              </w:rPr>
+              <w:t>Tanstack Query and TailwindCss]</w:t>
             </w:r>
           </w:p>
         </w:tc>
@@ -2437,7 +2340,7 @@
           <w:p>
             <w:pPr>
               <w:rPr>
-                <w:rFonts w:ascii="Times New Roman" w:hAnsi="Times New Roman" w:eastAsia="Times New Roman" w:cs="Times New Roman"/>
+                <w:rFonts w:ascii="Times New Roman" w:eastAsia="Times New Roman" w:hAnsi="Times New Roman" w:cs="Times New Roman"/>
                 <w:sz w:val="24"/>
                 <w:szCs w:val="24"/>
               </w:rPr>
@@ -2450,31 +2353,48 @@
             </w:r>
             <w:r>
               <w:rPr>
-                <w:rFonts w:ascii="Times New Roman" w:hAnsi="Times New Roman" w:eastAsia="Times New Roman" w:cs="Times New Roman"/>
+                <w:rFonts w:ascii="Times New Roman" w:eastAsia="Times New Roman" w:hAnsi="Times New Roman" w:cs="Times New Roman"/>
                 <w:sz w:val="24"/>
                 <w:szCs w:val="24"/>
               </w:rPr>
-              <w:t xml:space="preserve">Next.js is a powerful web framework; it is the recommended way to create React projects and provides useful features like file-based routing, image optimization, server actions, and works perfectly fine with React server components. It is also the most popular framework, so it has a huge community and better support. Trpc+Tanstack: Since we are using a decoupled architecture (backend + frontend), I need a type-safe API to efficiently communicate with the backend without having to define the types myself. Tanstack query is the industry standard for data fetching. It provides auto-retry, amazing error handling, and caching. As well as powerful revalidation features and mutations that are a lot more powerful than NextJS ' default Server Actions </w:t>
-            </w:r>
-            <w:r>
-              <w:rPr>
-                <w:rFonts w:ascii="Times New Roman" w:hAnsi="Times New Roman" w:eastAsia="Times New Roman" w:cs="Times New Roman"/>
+              <w:t>Next.js is a powerful web framework; it is the recommended way to create React projects and provides useful features like file-based routing, image optimization, server actions, and works perfectly fine with React server co</w:t>
+            </w:r>
+            <w:r>
+              <w:rPr>
+                <w:rFonts w:ascii="Times New Roman" w:eastAsia="Times New Roman" w:hAnsi="Times New Roman" w:cs="Times New Roman"/>
                 <w:sz w:val="24"/>
                 <w:szCs w:val="24"/>
               </w:rPr>
-              <w:br w:type="textWrapping"/>
-            </w:r>
-            <w:r>
-              <w:rPr>
-                <w:rFonts w:ascii="Times New Roman" w:hAnsi="Times New Roman" w:eastAsia="Times New Roman" w:cs="Times New Roman"/>
+              <w:t>mponents. It is also the most popular framework, so it has a huge community and better support. Trpc+Tanstack: Since we are using a decoupled architecture (backend + frontend), I need a type-safe API to efficiently communicate with the backend without havi</w:t>
+            </w:r>
+            <w:r>
+              <w:rPr>
+                <w:rFonts w:ascii="Times New Roman" w:eastAsia="Times New Roman" w:hAnsi="Times New Roman" w:cs="Times New Roman"/>
                 <w:sz w:val="24"/>
                 <w:szCs w:val="24"/>
               </w:rPr>
+              <w:t>ng to define the types myself. Tanstack query is the industry standard for data fetching. It provides auto-retry, amazing error handling, and caching. As well as powerful revalidation features and mutations that are a lot more powerful than NextJS ' defaul</w:t>
+            </w:r>
+            <w:r>
+              <w:rPr>
+                <w:rFonts w:ascii="Times New Roman" w:eastAsia="Times New Roman" w:hAnsi="Times New Roman" w:cs="Times New Roman"/>
+                <w:sz w:val="24"/>
+                <w:szCs w:val="24"/>
+              </w:rPr>
+              <w:t xml:space="preserve">t Server Actions </w:t>
+            </w:r>
+            <w:r>
+              <w:rPr>
+                <w:rFonts w:ascii="Times New Roman" w:eastAsia="Times New Roman" w:hAnsi="Times New Roman" w:cs="Times New Roman"/>
+                <w:sz w:val="24"/>
+                <w:szCs w:val="24"/>
+              </w:rPr>
+              <w:br/>
               <w:t>TailwindCSS because i</w:t>
             </w:r>
             <w:r>
               <w:rPr>
-                <w:rFonts w:hint="default" w:ascii="Times New Roman" w:hAnsi="Times New Roman" w:eastAsia="SimSun" w:cs="Times New Roman"/>
+                <w:rFonts w:ascii="Times New Roman" w:eastAsia="SimSun" w:hAnsi="Times New Roman" w:cs="Times New Roman"/>
                 <w:sz w:val="24"/>
                 <w:szCs w:val="24"/>
               </w:rPr>
@@ -2482,7 +2402,7 @@
             </w:r>
             <w:r>
               <w:rPr>
-                <w:rFonts w:ascii="Times New Roman" w:hAnsi="Times New Roman" w:eastAsia="Times New Roman" w:cs="Times New Roman"/>
+                <w:rFonts w:ascii="Times New Roman" w:eastAsia="Times New Roman" w:hAnsi="Times New Roman" w:cs="Times New Roman"/>
                 <w:sz w:val="24"/>
                 <w:szCs w:val="24"/>
               </w:rPr>
@@ -2498,16 +2418,8 @@
         </w:tc>
       </w:tr>
       <w:tr>
-        <w:tblPrEx>
-          <w:tblCellMar>
-            <w:top w:w="15" w:type="dxa"/>
-            <w:left w:w="15" w:type="dxa"/>
-            <w:bottom w:w="15" w:type="dxa"/>
-            <w:right w:w="15" w:type="dxa"/>
-          </w:tblCellMar>
-        </w:tblPrEx>
         <w:trPr>
-          <w:trHeight w:val="1091" w:hRule="atLeast"/>
+          <w:trHeight w:val="1091"/>
         </w:trPr>
         <w:tc>
           <w:tcPr>
@@ -2582,22 +2494,20 @@
               <w:rPr>
                 <w:sz w:val="24"/>
               </w:rPr>
-              <w:t>[It lets you use the same language for both frontend and backend, which keeps development simpler.]</w:t>
+              <w:t xml:space="preserve">[It </w:t>
+            </w:r>
+            <w:r>
+              <w:rPr>
+                <w:sz w:val="24"/>
+              </w:rPr>
+              <w:t>lets you use the same language for both frontend and backend, which keeps development simpler.]</w:t>
             </w:r>
           </w:p>
         </w:tc>
       </w:tr>
       <w:tr>
-        <w:tblPrEx>
-          <w:tblCellMar>
-            <w:top w:w="15" w:type="dxa"/>
-            <w:left w:w="15" w:type="dxa"/>
-            <w:bottom w:w="15" w:type="dxa"/>
-            <w:right w:w="15" w:type="dxa"/>
-          </w:tblCellMar>
-        </w:tblPrEx>
         <w:trPr>
-          <w:trHeight w:val="671" w:hRule="atLeast"/>
+          <w:trHeight w:val="671"/>
         </w:trPr>
         <w:tc>
           <w:tcPr>
@@ -2647,15 +2557,7 @@
               <w:rPr>
                 <w:sz w:val="24"/>
               </w:rPr>
-              <w:t>[MySQ</w:t>
-            </w:r>
-            <w:bookmarkStart w:id="0" w:name="_GoBack"/>
-            <w:bookmarkEnd w:id="0"/>
-            <w:r>
-              <w:rPr>
-                <w:sz w:val="24"/>
-              </w:rPr>
-              <w:t>L]</w:t>
+              <w:t>[MySQL]</w:t>
             </w:r>
           </w:p>
         </w:tc>
@@ -2680,42 +2582,61 @@
               <w:rPr>
                 <w:sz w:val="24"/>
               </w:rPr>
-              <w:t xml:space="preserve">[It is a widely used relational database management system that provides efficient storage and retrieval of structured data. It supports relationships between entities such as users, quizzes, and results, making it suitable for the Online Quiz Platform. In simple terms It supports relational data, handles large numbers of users, fast and reliable and it works well with web applications </w:t>
-            </w:r>
-          </w:p>
-          <w:p>
-            <w:pPr>
-              <w:rPr>
-                <w:sz w:val="24"/>
-              </w:rPr>
-            </w:pPr>
-          </w:p>
-          <w:p>
-            <w:pPr>
-              <w:rPr>
-                <w:sz w:val="24"/>
-              </w:rPr>
-            </w:pPr>
-            <w:r>
-              <w:rPr>
-                <w:sz w:val="24"/>
-              </w:rPr>
-              <w:t>And also, it integrate smoothly with the stacks that Christy and Lamine are using</w:t>
+              <w:t>[It is a widely used relational database management system that provides efficient storage and retrieval of structured data. It supports relat</w:t>
+            </w:r>
+            <w:r>
+              <w:rPr>
+                <w:sz w:val="24"/>
+              </w:rPr>
+              <w:t xml:space="preserve">ionships between entities such as users, quizzes, and results, making it suitable for the Online Quiz Platform. In simple terms It supports relational data, handles large numbers of users, fast and reliable and it works well with web applications </w:t>
+            </w:r>
+          </w:p>
+          <w:p>
+            <w:pPr>
+              <w:rPr>
+                <w:sz w:val="24"/>
+              </w:rPr>
+            </w:pPr>
+          </w:p>
+          <w:p>
+            <w:pPr>
+              <w:rPr>
+                <w:sz w:val="24"/>
+              </w:rPr>
+            </w:pPr>
+            <w:r>
+              <w:rPr>
+                <w:sz w:val="24"/>
+              </w:rPr>
+              <w:lastRenderedPageBreak/>
+              <w:t xml:space="preserve">And </w:t>
+            </w:r>
+            <w:r>
+              <w:rPr>
+                <w:sz w:val="24"/>
+              </w:rPr>
+              <w:t xml:space="preserve">also, it </w:t>
+            </w:r>
+            <w:proofErr w:type="gramStart"/>
+            <w:r>
+              <w:rPr>
+                <w:sz w:val="24"/>
+              </w:rPr>
+              <w:t>integrate</w:t>
+            </w:r>
+            <w:proofErr w:type="gramEnd"/>
+            <w:r>
+              <w:rPr>
+                <w:sz w:val="24"/>
+              </w:rPr>
+              <w:t xml:space="preserve"> smoothly with the stacks that Christy and Lamine are using</w:t>
             </w:r>
           </w:p>
         </w:tc>
       </w:tr>
       <w:tr>
-        <w:tblPrEx>
-          <w:tblCellMar>
-            <w:top w:w="15" w:type="dxa"/>
-            <w:left w:w="15" w:type="dxa"/>
-            <w:bottom w:w="15" w:type="dxa"/>
-            <w:right w:w="15" w:type="dxa"/>
-          </w:tblCellMar>
-        </w:tblPrEx>
         <w:trPr>
-          <w:trHeight w:val="671" w:hRule="atLeast"/>
+          <w:trHeight w:val="671"/>
         </w:trPr>
         <w:tc>
           <w:tcPr>
@@ -2740,6 +2661,7 @@
                 <w:bCs/>
                 <w:sz w:val="24"/>
               </w:rPr>
+              <w:lastRenderedPageBreak/>
               <w:t>Version Control</w:t>
             </w:r>
           </w:p>
@@ -2795,96 +2717,6 @@
           </w:p>
         </w:tc>
       </w:tr>
-      <w:tr>
-        <w:tblPrEx>
-          <w:tblCellMar>
-            <w:top w:w="15" w:type="dxa"/>
-            <w:left w:w="15" w:type="dxa"/>
-            <w:bottom w:w="15" w:type="dxa"/>
-            <w:right w:w="15" w:type="dxa"/>
-          </w:tblCellMar>
-        </w:tblPrEx>
-        <w:trPr>
-          <w:trHeight w:val="1112" w:hRule="atLeast"/>
-        </w:trPr>
-        <w:tc>
-          <w:tcPr>
-            <w:tcW w:w="0" w:type="auto"/>
-            <w:tcMar>
-              <w:top w:w="150" w:type="dxa"/>
-              <w:left w:w="0" w:type="dxa"/>
-              <w:bottom w:w="150" w:type="dxa"/>
-              <w:right w:w="240" w:type="dxa"/>
-            </w:tcMar>
-            <w:vAlign w:val="center"/>
-          </w:tcPr>
-          <w:p>
-            <w:pPr>
-              <w:rPr>
-                <w:sz w:val="24"/>
-              </w:rPr>
-            </w:pPr>
-            <w:r>
-              <w:rPr>
-                <w:b/>
-                <w:bCs/>
-                <w:sz w:val="24"/>
-              </w:rPr>
-              <w:t>Open Source Libraries</w:t>
-            </w:r>
-          </w:p>
-        </w:tc>
-        <w:tc>
-          <w:tcPr>
-            <w:tcW w:w="0" w:type="auto"/>
-            <w:tcMar>
-              <w:top w:w="150" w:type="dxa"/>
-              <w:left w:w="240" w:type="dxa"/>
-              <w:bottom w:w="150" w:type="dxa"/>
-              <w:right w:w="240" w:type="dxa"/>
-            </w:tcMar>
-            <w:vAlign w:val="center"/>
-          </w:tcPr>
-          <w:p>
-            <w:pPr>
-              <w:rPr>
-                <w:sz w:val="24"/>
-              </w:rPr>
-            </w:pPr>
-            <w:r>
-              <w:rPr>
-                <w:sz w:val="24"/>
-              </w:rPr>
-              <w:t>[e.g., Bootstrap, Chart.js]</w:t>
-            </w:r>
-          </w:p>
-        </w:tc>
-        <w:tc>
-          <w:tcPr>
-            <w:tcW w:w="0" w:type="auto"/>
-            <w:tcMar>
-              <w:top w:w="150" w:type="dxa"/>
-              <w:left w:w="240" w:type="dxa"/>
-              <w:bottom w:w="150" w:type="dxa"/>
-              <w:right w:w="0" w:type="dxa"/>
-            </w:tcMar>
-            <w:vAlign w:val="center"/>
-          </w:tcPr>
-          <w:p>
-            <w:pPr>
-              <w:rPr>
-                <w:sz w:val="24"/>
-              </w:rPr>
-            </w:pPr>
-            <w:r>
-              <w:rPr>
-                <w:sz w:val="24"/>
-              </w:rPr>
-              <w:t>To speed up development.</w:t>
-            </w:r>
-          </w:p>
-        </w:tc>
-      </w:tr>
     </w:tbl>
     <w:p>
       <w:pPr>
@@ -2921,7 +2753,15 @@
           <w:bCs/>
           <w:sz w:val="24"/>
         </w:rPr>
-        <w:t>6. PROJECT PLAN AND TIMELINE</w:t>
+        <w:t xml:space="preserve">6. PROJECT PLAN AND </w:t>
+      </w:r>
+      <w:r>
+        <w:rPr>
+          <w:b/>
+          <w:bCs/>
+          <w:sz w:val="24"/>
+        </w:rPr>
+        <w:t>TIMELINE</w:t>
       </w:r>
     </w:p>
     <w:p>
@@ -2943,25 +2783,23 @@
     </w:p>
     <w:tbl>
       <w:tblPr>
-        <w:tblStyle w:val="7"/>
         <w:tblW w:w="10547" w:type="dxa"/>
         <w:tblCellSpacing w:w="15" w:type="dxa"/>
-        <w:tblInd w:w="0" w:type="dxa"/>
         <w:tblBorders>
-          <w:top w:val="single" w:color="auto" w:sz="4" w:space="0"/>
-          <w:left w:val="single" w:color="auto" w:sz="4" w:space="0"/>
-          <w:bottom w:val="single" w:color="auto" w:sz="4" w:space="0"/>
-          <w:right w:val="single" w:color="auto" w:sz="4" w:space="0"/>
-          <w:insideH w:val="single" w:color="auto" w:sz="4" w:space="0"/>
-          <w:insideV w:val="single" w:color="auto" w:sz="4" w:space="0"/>
+          <w:top w:val="single" w:sz="4" w:space="0" w:color="auto"/>
+          <w:left w:val="single" w:sz="4" w:space="0" w:color="auto"/>
+          <w:bottom w:val="single" w:sz="4" w:space="0" w:color="auto"/>
+          <w:right w:val="single" w:sz="4" w:space="0" w:color="auto"/>
+          <w:insideH w:val="single" w:sz="4" w:space="0" w:color="auto"/>
+          <w:insideV w:val="single" w:sz="4" w:space="0" w:color="auto"/>
         </w:tblBorders>
-        <w:tblLayout w:type="autofit"/>
         <w:tblCellMar>
           <w:top w:w="15" w:type="dxa"/>
           <w:left w:w="15" w:type="dxa"/>
           <w:bottom w:w="15" w:type="dxa"/>
           <w:right w:w="15" w:type="dxa"/>
         </w:tblCellMar>
+        <w:tblLook w:val="04A0" w:firstRow="1" w:lastRow="0" w:firstColumn="1" w:lastColumn="0" w:noHBand="0" w:noVBand="1"/>
       </w:tblPr>
       <w:tblGrid>
         <w:gridCol w:w="2885"/>
@@ -2970,24 +2808,8 @@
         <w:gridCol w:w="1905"/>
       </w:tblGrid>
       <w:tr>
-        <w:tblPrEx>
-          <w:tblBorders>
-            <w:top w:val="single" w:color="auto" w:sz="4" w:space="0"/>
-            <w:left w:val="single" w:color="auto" w:sz="4" w:space="0"/>
-            <w:bottom w:val="single" w:color="auto" w:sz="4" w:space="0"/>
-            <w:right w:val="single" w:color="auto" w:sz="4" w:space="0"/>
-            <w:insideH w:val="single" w:color="auto" w:sz="4" w:space="0"/>
-            <w:insideV w:val="single" w:color="auto" w:sz="4" w:space="0"/>
-          </w:tblBorders>
-          <w:tblCellMar>
-            <w:top w:w="15" w:type="dxa"/>
-            <w:left w:w="15" w:type="dxa"/>
-            <w:bottom w:w="15" w:type="dxa"/>
-            <w:right w:w="15" w:type="dxa"/>
-          </w:tblCellMar>
-        </w:tblPrEx>
         <w:trPr>
-          <w:trHeight w:val="555" w:hRule="atLeast"/>
+          <w:trHeight w:val="555"/>
           <w:tblHeader/>
           <w:tblCellSpacing w:w="15" w:type="dxa"/>
         </w:trPr>
@@ -3097,24 +2919,8 @@
         </w:tc>
       </w:tr>
       <w:tr>
-        <w:tblPrEx>
-          <w:tblBorders>
-            <w:top w:val="single" w:color="auto" w:sz="4" w:space="0"/>
-            <w:left w:val="single" w:color="auto" w:sz="4" w:space="0"/>
-            <w:bottom w:val="single" w:color="auto" w:sz="4" w:space="0"/>
-            <w:right w:val="single" w:color="auto" w:sz="4" w:space="0"/>
-            <w:insideH w:val="single" w:color="auto" w:sz="4" w:space="0"/>
-            <w:insideV w:val="single" w:color="auto" w:sz="4" w:space="0"/>
-          </w:tblBorders>
-          <w:tblCellMar>
-            <w:top w:w="15" w:type="dxa"/>
-            <w:left w:w="15" w:type="dxa"/>
-            <w:bottom w:w="15" w:type="dxa"/>
-            <w:right w:w="15" w:type="dxa"/>
-          </w:tblCellMar>
-        </w:tblPrEx>
         <w:trPr>
-          <w:trHeight w:val="831" w:hRule="atLeast"/>
+          <w:trHeight w:val="831"/>
           <w:tblCellSpacing w:w="15" w:type="dxa"/>
         </w:trPr>
         <w:tc>
@@ -3125,7 +2931,7 @@
           <w:p>
             <w:r>
               <w:rPr>
-                <w:rStyle w:val="10"/>
+                <w:rStyle w:val="Strong"/>
                 <w:rFonts w:eastAsia="SimSun" w:cs="SimSun"/>
                 <w:sz w:val="24"/>
                 <w:szCs w:val="24"/>
@@ -3188,24 +2994,8 @@
         </w:tc>
       </w:tr>
       <w:tr>
-        <w:tblPrEx>
-          <w:tblBorders>
-            <w:top w:val="single" w:color="auto" w:sz="4" w:space="0"/>
-            <w:left w:val="single" w:color="auto" w:sz="4" w:space="0"/>
-            <w:bottom w:val="single" w:color="auto" w:sz="4" w:space="0"/>
-            <w:right w:val="single" w:color="auto" w:sz="4" w:space="0"/>
-            <w:insideH w:val="single" w:color="auto" w:sz="4" w:space="0"/>
-            <w:insideV w:val="single" w:color="auto" w:sz="4" w:space="0"/>
-          </w:tblBorders>
-          <w:tblCellMar>
-            <w:top w:w="15" w:type="dxa"/>
-            <w:left w:w="15" w:type="dxa"/>
-            <w:bottom w:w="15" w:type="dxa"/>
-            <w:right w:w="15" w:type="dxa"/>
-          </w:tblCellMar>
-        </w:tblPrEx>
         <w:trPr>
-          <w:trHeight w:val="1161" w:hRule="atLeast"/>
+          <w:trHeight w:val="1161"/>
           <w:tblCellSpacing w:w="15" w:type="dxa"/>
         </w:trPr>
         <w:tc>
@@ -3216,7 +3006,7 @@
           <w:p>
             <w:r>
               <w:rPr>
-                <w:rStyle w:val="10"/>
+                <w:rStyle w:val="Strong"/>
                 <w:rFonts w:eastAsia="SimSun" w:cs="SimSun"/>
                 <w:sz w:val="24"/>
                 <w:szCs w:val="24"/>
@@ -3256,7 +3046,16 @@
                 <w:szCs w:val="24"/>
                 <w:lang w:eastAsia="zh-CN" w:bidi="ar"/>
               </w:rPr>
-              <w:t>System architecture design, database design, UML diagrams, UI/UX prototyping</w:t>
+              <w:t xml:space="preserve">System architecture </w:t>
+            </w:r>
+            <w:r>
+              <w:rPr>
+                <w:rFonts w:eastAsia="SimSun" w:cs="SimSun"/>
+                <w:sz w:val="24"/>
+                <w:szCs w:val="24"/>
+                <w:lang w:eastAsia="zh-CN" w:bidi="ar"/>
+              </w:rPr>
+              <w:t>design, database design, UML diagrams, UI/UX prototyping</w:t>
             </w:r>
           </w:p>
         </w:tc>
@@ -3279,24 +3078,8 @@
         </w:tc>
       </w:tr>
       <w:tr>
-        <w:tblPrEx>
-          <w:tblBorders>
-            <w:top w:val="single" w:color="auto" w:sz="4" w:space="0"/>
-            <w:left w:val="single" w:color="auto" w:sz="4" w:space="0"/>
-            <w:bottom w:val="single" w:color="auto" w:sz="4" w:space="0"/>
-            <w:right w:val="single" w:color="auto" w:sz="4" w:space="0"/>
-            <w:insideH w:val="single" w:color="auto" w:sz="4" w:space="0"/>
-            <w:insideV w:val="single" w:color="auto" w:sz="4" w:space="0"/>
-          </w:tblBorders>
-          <w:tblCellMar>
-            <w:top w:w="15" w:type="dxa"/>
-            <w:left w:w="15" w:type="dxa"/>
-            <w:bottom w:w="15" w:type="dxa"/>
-            <w:right w:w="15" w:type="dxa"/>
-          </w:tblCellMar>
-        </w:tblPrEx>
         <w:trPr>
-          <w:trHeight w:val="831" w:hRule="atLeast"/>
+          <w:trHeight w:val="831"/>
           <w:tblCellSpacing w:w="15" w:type="dxa"/>
         </w:trPr>
         <w:tc>
@@ -3307,7 +3090,7 @@
           <w:p>
             <w:r>
               <w:rPr>
-                <w:rStyle w:val="10"/>
+                <w:rStyle w:val="Strong"/>
                 <w:rFonts w:eastAsia="SimSun" w:cs="SimSun"/>
                 <w:sz w:val="24"/>
                 <w:szCs w:val="24"/>
@@ -3370,24 +3153,8 @@
         </w:tc>
       </w:tr>
       <w:tr>
-        <w:tblPrEx>
-          <w:tblBorders>
-            <w:top w:val="single" w:color="auto" w:sz="4" w:space="0"/>
-            <w:left w:val="single" w:color="auto" w:sz="4" w:space="0"/>
-            <w:bottom w:val="single" w:color="auto" w:sz="4" w:space="0"/>
-            <w:right w:val="single" w:color="auto" w:sz="4" w:space="0"/>
-            <w:insideH w:val="single" w:color="auto" w:sz="4" w:space="0"/>
-            <w:insideV w:val="single" w:color="auto" w:sz="4" w:space="0"/>
-          </w:tblBorders>
-          <w:tblCellMar>
-            <w:top w:w="15" w:type="dxa"/>
-            <w:left w:w="15" w:type="dxa"/>
-            <w:bottom w:w="15" w:type="dxa"/>
-            <w:right w:w="15" w:type="dxa"/>
-          </w:tblCellMar>
-        </w:tblPrEx>
         <w:trPr>
-          <w:trHeight w:val="831" w:hRule="atLeast"/>
+          <w:trHeight w:val="831"/>
           <w:tblCellSpacing w:w="15" w:type="dxa"/>
         </w:trPr>
         <w:tc>
@@ -3398,7 +3165,7 @@
           <w:p>
             <w:r>
               <w:rPr>
-                <w:rStyle w:val="10"/>
+                <w:rStyle w:val="Strong"/>
                 <w:rFonts w:eastAsia="SimSun" w:cs="SimSun"/>
                 <w:sz w:val="24"/>
                 <w:szCs w:val="24"/>
@@ -3461,24 +3228,8 @@
         </w:tc>
       </w:tr>
       <w:tr>
-        <w:tblPrEx>
-          <w:tblBorders>
-            <w:top w:val="single" w:color="auto" w:sz="4" w:space="0"/>
-            <w:left w:val="single" w:color="auto" w:sz="4" w:space="0"/>
-            <w:bottom w:val="single" w:color="auto" w:sz="4" w:space="0"/>
-            <w:right w:val="single" w:color="auto" w:sz="4" w:space="0"/>
-            <w:insideH w:val="single" w:color="auto" w:sz="4" w:space="0"/>
-            <w:insideV w:val="single" w:color="auto" w:sz="4" w:space="0"/>
-          </w:tblBorders>
-          <w:tblCellMar>
-            <w:top w:w="15" w:type="dxa"/>
-            <w:left w:w="15" w:type="dxa"/>
-            <w:bottom w:w="15" w:type="dxa"/>
-            <w:right w:w="15" w:type="dxa"/>
-          </w:tblCellMar>
-        </w:tblPrEx>
         <w:trPr>
-          <w:trHeight w:val="885" w:hRule="atLeast"/>
+          <w:trHeight w:val="885"/>
           <w:tblCellSpacing w:w="15" w:type="dxa"/>
         </w:trPr>
         <w:tc>
@@ -3489,7 +3240,7 @@
           <w:p>
             <w:r>
               <w:rPr>
-                <w:rStyle w:val="10"/>
+                <w:rStyle w:val="Strong"/>
                 <w:rFonts w:eastAsia="SimSun" w:cs="SimSun"/>
                 <w:sz w:val="24"/>
                 <w:szCs w:val="24"/>
@@ -3572,7 +3323,7 @@
     </w:p>
     <w:p>
       <w:pPr>
-        <w:ind w:left="120" w:hanging="120" w:hangingChars="50"/>
+        <w:ind w:left="120" w:hangingChars="50" w:hanging="120"/>
         <w:rPr>
           <w:i/>
           <w:iCs/>
@@ -3585,16 +3336,18 @@
           <w:iCs/>
           <w:sz w:val="24"/>
         </w:rPr>
+        <w:lastRenderedPageBreak/>
         <w:t>Gantt Chart</w:t>
       </w:r>
       <w:r>
         <w:rPr>
           <w:i/>
           <w:iCs/>
+          <w:noProof/>
           <w:sz w:val="24"/>
         </w:rPr>
         <w:drawing>
-          <wp:inline distT="0" distB="0" distL="114300" distR="114300">
+          <wp:inline distT="0" distB="0" distL="114300" distR="114300" wp14:anchorId="441AF154" wp14:editId="58A900F3">
             <wp:extent cx="6628765" cy="1741170"/>
             <wp:effectExtent l="0" t="0" r="635" b="0"/>
             <wp:docPr id="2" name="Picture 2" descr="Online Quiz Platform 20260315"/>
@@ -3611,7 +3364,7 @@
                     </pic:cNvPicPr>
                   </pic:nvPicPr>
                   <pic:blipFill>
-                    <a:blip r:embed="rId7"/>
+                    <a:blip r:embed="rId9"/>
                     <a:stretch>
                       <a:fillRect/>
                     </a:stretch>
@@ -3667,30 +3420,20 @@
     </w:p>
     <w:tbl>
       <w:tblPr>
-        <w:tblStyle w:val="7"/>
         <w:tblW w:w="11280" w:type="dxa"/>
-        <w:tblInd w:w="0" w:type="dxa"/>
-        <w:tblLayout w:type="autofit"/>
         <w:tblCellMar>
           <w:top w:w="15" w:type="dxa"/>
           <w:left w:w="15" w:type="dxa"/>
           <w:bottom w:w="15" w:type="dxa"/>
           <w:right w:w="15" w:type="dxa"/>
         </w:tblCellMar>
+        <w:tblLook w:val="04A0" w:firstRow="1" w:lastRow="0" w:firstColumn="1" w:lastColumn="0" w:noHBand="0" w:noVBand="1"/>
       </w:tblPr>
       <w:tblGrid>
         <w:gridCol w:w="3957"/>
         <w:gridCol w:w="7323"/>
       </w:tblGrid>
       <w:tr>
-        <w:tblPrEx>
-          <w:tblCellMar>
-            <w:top w:w="15" w:type="dxa"/>
-            <w:left w:w="15" w:type="dxa"/>
-            <w:bottom w:w="15" w:type="dxa"/>
-            <w:right w:w="15" w:type="dxa"/>
-          </w:tblCellMar>
-        </w:tblPrEx>
         <w:trPr>
           <w:tblHeader/>
         </w:trPr>
@@ -3752,14 +3495,6 @@
         </w:tc>
       </w:tr>
       <w:tr>
-        <w:tblPrEx>
-          <w:tblCellMar>
-            <w:top w:w="15" w:type="dxa"/>
-            <w:left w:w="15" w:type="dxa"/>
-            <w:bottom w:w="15" w:type="dxa"/>
-            <w:right w:w="15" w:type="dxa"/>
-          </w:tblCellMar>
-        </w:tblPrEx>
         <w:tc>
           <w:tcPr>
             <w:tcW w:w="0" w:type="auto"/>
@@ -3821,14 +3556,6 @@
         </w:tc>
       </w:tr>
       <w:tr>
-        <w:tblPrEx>
-          <w:tblCellMar>
-            <w:top w:w="15" w:type="dxa"/>
-            <w:left w:w="15" w:type="dxa"/>
-            <w:bottom w:w="15" w:type="dxa"/>
-            <w:right w:w="15" w:type="dxa"/>
-          </w:tblCellMar>
-        </w:tblPrEx>
         <w:tc>
           <w:tcPr>
             <w:tcW w:w="0" w:type="auto"/>
@@ -3895,14 +3622,6 @@
         </w:tc>
       </w:tr>
       <w:tr>
-        <w:tblPrEx>
-          <w:tblCellMar>
-            <w:top w:w="15" w:type="dxa"/>
-            <w:left w:w="15" w:type="dxa"/>
-            <w:bottom w:w="15" w:type="dxa"/>
-            <w:right w:w="15" w:type="dxa"/>
-          </w:tblCellMar>
-        </w:tblPrEx>
         <w:tc>
           <w:tcPr>
             <w:tcW w:w="0" w:type="auto"/>
@@ -3969,14 +3688,6 @@
         </w:tc>
       </w:tr>
       <w:tr>
-        <w:tblPrEx>
-          <w:tblCellMar>
-            <w:top w:w="15" w:type="dxa"/>
-            <w:left w:w="15" w:type="dxa"/>
-            <w:bottom w:w="15" w:type="dxa"/>
-            <w:right w:w="15" w:type="dxa"/>
-          </w:tblCellMar>
-        </w:tblPrEx>
         <w:tc>
           <w:tcPr>
             <w:tcW w:w="0" w:type="auto"/>
@@ -4043,14 +3754,6 @@
         </w:tc>
       </w:tr>
       <w:tr>
-        <w:tblPrEx>
-          <w:tblCellMar>
-            <w:top w:w="15" w:type="dxa"/>
-            <w:left w:w="15" w:type="dxa"/>
-            <w:bottom w:w="15" w:type="dxa"/>
-            <w:right w:w="15" w:type="dxa"/>
-          </w:tblCellMar>
-        </w:tblPrEx>
         <w:tc>
           <w:tcPr>
             <w:tcW w:w="0" w:type="auto"/>
@@ -4144,7 +3847,27 @@
         <w:rPr>
           <w:sz w:val="24"/>
         </w:rPr>
-        <w:t>This platform is worth pursuing because it makes the process of creating, administering and grading quizzes easier. It also helps us with faster and more accurate evaluation. Overall , the platform supports remote education and can significantly improve the assessment process in modern education systems.</w:t>
+        <w:t xml:space="preserve">This platform is worth pursuing because it makes the process of creating, administering and grading quizzes easier. It also helps us with faster and more accurate evaluation. </w:t>
+      </w:r>
+      <w:proofErr w:type="gramStart"/>
+      <w:r>
+        <w:rPr>
+          <w:sz w:val="24"/>
+        </w:rPr>
+        <w:t>Overall ,</w:t>
+      </w:r>
+      <w:proofErr w:type="gramEnd"/>
+      <w:r>
+        <w:rPr>
+          <w:sz w:val="24"/>
+        </w:rPr>
+        <w:t xml:space="preserve"> the platform supp</w:t>
+      </w:r>
+      <w:r>
+        <w:rPr>
+          <w:sz w:val="24"/>
+        </w:rPr>
+        <w:t>orts remote education and can significantly improve the assessment process in modern education systems.</w:t>
       </w:r>
     </w:p>
     <w:p>
@@ -4157,16 +3880,16 @@
     <w:sectPr>
       <w:pgSz w:w="12240" w:h="15840"/>
       <w:pgMar w:top="1170" w:right="1440" w:bottom="990" w:left="1440" w:header="720" w:footer="720" w:gutter="0"/>
-      <w:cols w:space="720" w:num="1"/>
-      <w:docGrid w:linePitch="360" w:charSpace="0"/>
+      <w:cols w:space="720"/>
+      <w:docGrid w:linePitch="360"/>
     </w:sectPr>
   </w:body>
 </w:document>
 </file>
 
 <file path=word/endnotes.xml><?xml version="1.0" encoding="utf-8"?>
-<w:endnotes xmlns:wpc="http://schemas.microsoft.com/office/word/2010/wordprocessingCanvas" xmlns:mc="http://schemas.openxmlformats.org/markup-compatibility/2006" xmlns:o="urn:schemas-microsoft-com:office:office" xmlns:r="http://schemas.openxmlformats.org/officeDocument/2006/relationships" xmlns:m="http://schemas.openxmlformats.org/officeDocument/2006/math" xmlns:v="urn:schemas-microsoft-com:vml" xmlns:wp14="http://schemas.microsoft.com/office/word/2010/wordprocessingDrawing" xmlns:wp="http://schemas.openxmlformats.org/drawingml/2006/wordprocessingDrawing" xmlns:w="http://schemas.openxmlformats.org/wordprocessingml/2006/main" xmlns:w14="http://schemas.microsoft.com/office/word/2010/wordml" xmlns:w15="http://schemas.microsoft.com/office/word/2012/wordml" xmlns:w10="urn:schemas-microsoft-com:office:word" xmlns:wpg="http://schemas.microsoft.com/office/word/2010/wordprocessingGroup" xmlns:wpi="http://schemas.microsoft.com/office/word/2010/wordprocessingInk" xmlns:wne="http://schemas.microsoft.com/office/word/2006/wordml" xmlns:wps="http://schemas.microsoft.com/office/word/2010/wordprocessingShape" xmlns:wpsCustomData="http://www.wps.cn/officeDocument/2013/wpsCustomData" mc:Ignorable="w14 w15 wp14">
-  <w:endnote w:type="separator" w:id="0">
+<w:endnotes xmlns:wpc="http://schemas.microsoft.com/office/word/2010/wordprocessingCanvas" xmlns:cx="http://schemas.microsoft.com/office/drawing/2014/chartex" xmlns:cx1="http://schemas.microsoft.com/office/drawing/2015/9/8/chartex" xmlns:cx2="http://schemas.microsoft.com/office/drawing/2015/10/21/chartex" xmlns:cx3="http://schemas.microsoft.com/office/drawing/2016/5/9/chartex" xmlns:cx4="http://schemas.microsoft.com/office/drawing/2016/5/10/chartex" xmlns:cx5="http://schemas.microsoft.com/office/drawing/2016/5/11/chartex" xmlns:cx6="http://schemas.microsoft.com/office/drawing/2016/5/12/chartex" xmlns:cx7="http://schemas.microsoft.com/office/drawing/2016/5/13/chartex" xmlns:cx8="http://schemas.microsoft.com/office/drawing/2016/5/14/chartex" xmlns:mc="http://schemas.openxmlformats.org/markup-compatibility/2006" xmlns:aink="http://schemas.microsoft.com/office/drawing/2016/ink" xmlns:am3d="http://schemas.microsoft.com/office/drawing/2017/model3d" xmlns:o="urn:schemas-microsoft-com:office:office" xmlns:r="http://schemas.openxmlformats.org/officeDocument/2006/relationships" xmlns:m="http://schemas.openxmlformats.org/officeDocument/2006/math" xmlns:v="urn:schemas-microsoft-com:vml" xmlns:wp14="http://schemas.microsoft.com/office/word/2010/wordprocessingDrawing" xmlns:wp="http://schemas.openxmlformats.org/drawingml/2006/wordprocessingDrawing" xmlns:w10="urn:schemas-microsoft-com:office:word" xmlns:w="http://schemas.openxmlformats.org/wordprocessingml/2006/main" xmlns:w14="http://schemas.microsoft.com/office/word/2010/wordml" xmlns:w15="http://schemas.microsoft.com/office/word/2012/wordml" xmlns:w16cex="http://schemas.microsoft.com/office/word/2018/wordml/cex" xmlns:w16cid="http://schemas.microsoft.com/office/word/2016/wordml/cid" xmlns:w16="http://schemas.microsoft.com/office/word/2018/wordml" xmlns:w16sdtdh="http://schemas.microsoft.com/office/word/2020/wordml/sdtdatahash" xmlns:w16se="http://schemas.microsoft.com/office/word/2015/wordml/symex" xmlns:wpg="http://schemas.microsoft.com/office/word/2010/wordprocessingGroup" xmlns:wpi="http://schemas.microsoft.com/office/word/2010/wordprocessingInk" xmlns:wne="http://schemas.microsoft.com/office/word/2006/wordml" xmlns:wps="http://schemas.microsoft.com/office/word/2010/wordprocessingShape" mc:Ignorable="w14 w15 w16se w16cid w16 w16cex w16sdtdh wp14">
+  <w:endnote w:type="separator" w:id="-1">
     <w:p>
       <w:pPr>
         <w:spacing w:line="240" w:lineRule="auto"/>
@@ -4176,7 +3899,7 @@
       </w:r>
     </w:p>
   </w:endnote>
-  <w:endnote w:type="continuationSeparator" w:id="1">
+  <w:endnote w:type="continuationSeparator" w:id="0">
     <w:p>
       <w:pPr>
         <w:spacing w:line="240" w:lineRule="auto"/>
@@ -4190,21 +3913,21 @@
 </file>
 
 <file path=word/footnotes.xml><?xml version="1.0" encoding="utf-8"?>
-<w:footnotes xmlns:wpc="http://schemas.microsoft.com/office/word/2010/wordprocessingCanvas" xmlns:mc="http://schemas.openxmlformats.org/markup-compatibility/2006" xmlns:o="urn:schemas-microsoft-com:office:office" xmlns:r="http://schemas.openxmlformats.org/officeDocument/2006/relationships" xmlns:m="http://schemas.openxmlformats.org/officeDocument/2006/math" xmlns:v="urn:schemas-microsoft-com:vml" xmlns:wp14="http://schemas.microsoft.com/office/word/2010/wordprocessingDrawing" xmlns:wp="http://schemas.openxmlformats.org/drawingml/2006/wordprocessingDrawing" xmlns:w="http://schemas.openxmlformats.org/wordprocessingml/2006/main" xmlns:w14="http://schemas.microsoft.com/office/word/2010/wordml" xmlns:w15="http://schemas.microsoft.com/office/word/2012/wordml" xmlns:w10="urn:schemas-microsoft-com:office:word" xmlns:wpg="http://schemas.microsoft.com/office/word/2010/wordprocessingGroup" xmlns:wpi="http://schemas.microsoft.com/office/word/2010/wordprocessingInk" xmlns:wne="http://schemas.microsoft.com/office/word/2006/wordml" xmlns:wps="http://schemas.microsoft.com/office/word/2010/wordprocessingShape" xmlns:wpsCustomData="http://www.wps.cn/officeDocument/2013/wpsCustomData" mc:Ignorable="w14 w15 wp14">
-  <w:footnote w:type="separator" w:id="0">
-    <w:p>
-      <w:pPr>
-        <w:spacing w:before="0" w:after="0" w:line="259" w:lineRule="auto"/>
+<w:footnotes xmlns:wpc="http://schemas.microsoft.com/office/word/2010/wordprocessingCanvas" xmlns:cx="http://schemas.microsoft.com/office/drawing/2014/chartex" xmlns:cx1="http://schemas.microsoft.com/office/drawing/2015/9/8/chartex" xmlns:cx2="http://schemas.microsoft.com/office/drawing/2015/10/21/chartex" xmlns:cx3="http://schemas.microsoft.com/office/drawing/2016/5/9/chartex" xmlns:cx4="http://schemas.microsoft.com/office/drawing/2016/5/10/chartex" xmlns:cx5="http://schemas.microsoft.com/office/drawing/2016/5/11/chartex" xmlns:cx6="http://schemas.microsoft.com/office/drawing/2016/5/12/chartex" xmlns:cx7="http://schemas.microsoft.com/office/drawing/2016/5/13/chartex" xmlns:cx8="http://schemas.microsoft.com/office/drawing/2016/5/14/chartex" xmlns:mc="http://schemas.openxmlformats.org/markup-compatibility/2006" xmlns:aink="http://schemas.microsoft.com/office/drawing/2016/ink" xmlns:am3d="http://schemas.microsoft.com/office/drawing/2017/model3d" xmlns:o="urn:schemas-microsoft-com:office:office" xmlns:r="http://schemas.openxmlformats.org/officeDocument/2006/relationships" xmlns:m="http://schemas.openxmlformats.org/officeDocument/2006/math" xmlns:v="urn:schemas-microsoft-com:vml" xmlns:wp14="http://schemas.microsoft.com/office/word/2010/wordprocessingDrawing" xmlns:wp="http://schemas.openxmlformats.org/drawingml/2006/wordprocessingDrawing" xmlns:w10="urn:schemas-microsoft-com:office:word" xmlns:w="http://schemas.openxmlformats.org/wordprocessingml/2006/main" xmlns:w14="http://schemas.microsoft.com/office/word/2010/wordml" xmlns:w15="http://schemas.microsoft.com/office/word/2012/wordml" xmlns:w16cex="http://schemas.microsoft.com/office/word/2018/wordml/cex" xmlns:w16cid="http://schemas.microsoft.com/office/word/2016/wordml/cid" xmlns:w16="http://schemas.microsoft.com/office/word/2018/wordml" xmlns:w16sdtdh="http://schemas.microsoft.com/office/word/2020/wordml/sdtdatahash" xmlns:w16se="http://schemas.microsoft.com/office/word/2015/wordml/symex" xmlns:wpg="http://schemas.microsoft.com/office/word/2010/wordprocessingGroup" xmlns:wpi="http://schemas.microsoft.com/office/word/2010/wordprocessingInk" xmlns:wne="http://schemas.microsoft.com/office/word/2006/wordml" xmlns:wps="http://schemas.microsoft.com/office/word/2010/wordprocessingShape" mc:Ignorable="w14 w15 w16se w16cid w16 w16cex w16sdtdh wp14">
+  <w:footnote w:type="separator" w:id="-1">
+    <w:p>
+      <w:pPr>
+        <w:spacing w:after="0"/>
       </w:pPr>
       <w:r>
         <w:separator/>
       </w:r>
     </w:p>
   </w:footnote>
-  <w:footnote w:type="continuationSeparator" w:id="1">
-    <w:p>
-      <w:pPr>
-        <w:spacing w:before="0" w:after="0" w:line="259" w:lineRule="auto"/>
+  <w:footnote w:type="continuationSeparator" w:id="0">
+    <w:p>
+      <w:pPr>
+        <w:spacing w:after="0"/>
       </w:pPr>
       <w:r>
         <w:continuationSeparator/>
@@ -4215,12 +3938,12 @@
 </file>
 
 <file path=word/numbering.xml><?xml version="1.0" encoding="utf-8"?>
-<w:numbering xmlns:wpc="http://schemas.microsoft.com/office/word/2010/wordprocessingCanvas" xmlns:mc="http://schemas.openxmlformats.org/markup-compatibility/2006" xmlns:o="urn:schemas-microsoft-com:office:office" xmlns:r="http://schemas.openxmlformats.org/officeDocument/2006/relationships" xmlns:m="http://schemas.openxmlformats.org/officeDocument/2006/math" xmlns:v="urn:schemas-microsoft-com:vml" xmlns:wp14="http://schemas.microsoft.com/office/word/2010/wordprocessingDrawing" xmlns:wp="http://schemas.openxmlformats.org/drawingml/2006/wordprocessingDrawing" xmlns:w10="urn:schemas-microsoft-com:office:word" xmlns:w="http://schemas.openxmlformats.org/wordprocessingml/2006/main" xmlns:w14="http://schemas.microsoft.com/office/word/2010/wordml" xmlns:wpg="http://schemas.microsoft.com/office/word/2010/wordprocessingGroup" xmlns:wpi="http://schemas.microsoft.com/office/word/2010/wordprocessingInk" xmlns:wne="http://schemas.microsoft.com/office/word/2006/wordml" xmlns:wps="http://schemas.microsoft.com/office/word/2010/wordprocessingShape" xmlns:wpsCustomData="http://www.wps.cn/officeDocument/2013/wpsCustomData" mc:Ignorable="w14 wp14">
-  <w:abstractNum w:abstractNumId="0">
+<w:numbering xmlns:wpc="http://schemas.microsoft.com/office/word/2010/wordprocessingCanvas" xmlns:cx="http://schemas.microsoft.com/office/drawing/2014/chartex" xmlns:cx1="http://schemas.microsoft.com/office/drawing/2015/9/8/chartex" xmlns:cx2="http://schemas.microsoft.com/office/drawing/2015/10/21/chartex" xmlns:cx3="http://schemas.microsoft.com/office/drawing/2016/5/9/chartex" xmlns:cx4="http://schemas.microsoft.com/office/drawing/2016/5/10/chartex" xmlns:cx5="http://schemas.microsoft.com/office/drawing/2016/5/11/chartex" xmlns:cx6="http://schemas.microsoft.com/office/drawing/2016/5/12/chartex" xmlns:cx7="http://schemas.microsoft.com/office/drawing/2016/5/13/chartex" xmlns:cx8="http://schemas.microsoft.com/office/drawing/2016/5/14/chartex" xmlns:mc="http://schemas.openxmlformats.org/markup-compatibility/2006" xmlns:aink="http://schemas.microsoft.com/office/drawing/2016/ink" xmlns:am3d="http://schemas.microsoft.com/office/drawing/2017/model3d" xmlns:o="urn:schemas-microsoft-com:office:office" xmlns:r="http://schemas.openxmlformats.org/officeDocument/2006/relationships" xmlns:m="http://schemas.openxmlformats.org/officeDocument/2006/math" xmlns:v="urn:schemas-microsoft-com:vml" xmlns:wp14="http://schemas.microsoft.com/office/word/2010/wordprocessingDrawing" xmlns:wp="http://schemas.openxmlformats.org/drawingml/2006/wordprocessingDrawing" xmlns:w10="urn:schemas-microsoft-com:office:word" xmlns:w="http://schemas.openxmlformats.org/wordprocessingml/2006/main" xmlns:w14="http://schemas.microsoft.com/office/word/2010/wordml" xmlns:w15="http://schemas.microsoft.com/office/word/2012/wordml" xmlns:w16cex="http://schemas.microsoft.com/office/word/2018/wordml/cex" xmlns:w16cid="http://schemas.microsoft.com/office/word/2016/wordml/cid" xmlns:w16="http://schemas.microsoft.com/office/word/2018/wordml" xmlns:w16sdtdh="http://schemas.microsoft.com/office/word/2020/wordml/sdtdatahash" xmlns:w16se="http://schemas.microsoft.com/office/word/2015/wordml/symex" xmlns:wpg="http://schemas.microsoft.com/office/word/2010/wordprocessingGroup" xmlns:wpi="http://schemas.microsoft.com/office/word/2010/wordprocessingInk" xmlns:wne="http://schemas.microsoft.com/office/word/2006/wordml" xmlns:wps="http://schemas.microsoft.com/office/word/2010/wordprocessingShape" mc:Ignorable="w14 w15 w16se w16cid w16 w16cex w16sdtdh wp14">
+  <w:abstractNum w:abstractNumId="0" w15:restartNumberingAfterBreak="0">
     <w:nsid w:val="025A67B2"/>
     <w:multiLevelType w:val="multilevel"/>
     <w:tmpl w:val="025A67B2"/>
-    <w:lvl w:ilvl="0" w:tentative="0">
+    <w:lvl w:ilvl="0">
       <w:start w:val="1"/>
       <w:numFmt w:val="bullet"/>
       <w:lvlText w:val=""/>
@@ -4232,11 +3955,11 @@
         <w:ind w:left="720" w:hanging="360"/>
       </w:pPr>
       <w:rPr>
-        <w:rFonts w:hint="default" w:ascii="Symbol" w:hAnsi="Symbol"/>
+        <w:rFonts w:ascii="Symbol" w:hAnsi="Symbol" w:hint="default"/>
         <w:sz w:val="20"/>
       </w:rPr>
     </w:lvl>
-    <w:lvl w:ilvl="1" w:tentative="0">
+    <w:lvl w:ilvl="1">
       <w:start w:val="1"/>
       <w:numFmt w:val="bullet"/>
       <w:lvlText w:val="o"/>
@@ -4248,11 +3971,11 @@
         <w:ind w:left="1440" w:hanging="360"/>
       </w:pPr>
       <w:rPr>
-        <w:rFonts w:hint="default" w:ascii="Courier New" w:hAnsi="Courier New"/>
+        <w:rFonts w:ascii="Courier New" w:hAnsi="Courier New" w:hint="default"/>
         <w:sz w:val="20"/>
       </w:rPr>
     </w:lvl>
-    <w:lvl w:ilvl="2" w:tentative="0">
+    <w:lvl w:ilvl="2">
       <w:start w:val="1"/>
       <w:numFmt w:val="bullet"/>
       <w:lvlText w:val=""/>
@@ -4264,11 +3987,11 @@
         <w:ind w:left="2160" w:hanging="360"/>
       </w:pPr>
       <w:rPr>
-        <w:rFonts w:hint="default" w:ascii="Wingdings" w:hAnsi="Wingdings"/>
+        <w:rFonts w:ascii="Wingdings" w:hAnsi="Wingdings" w:hint="default"/>
         <w:sz w:val="20"/>
       </w:rPr>
     </w:lvl>
-    <w:lvl w:ilvl="3" w:tentative="0">
+    <w:lvl w:ilvl="3">
       <w:start w:val="1"/>
       <w:numFmt w:val="bullet"/>
       <w:lvlText w:val=""/>
@@ -4280,11 +4003,11 @@
         <w:ind w:left="2880" w:hanging="360"/>
       </w:pPr>
       <w:rPr>
-        <w:rFonts w:hint="default" w:ascii="Wingdings" w:hAnsi="Wingdings"/>
+        <w:rFonts w:ascii="Wingdings" w:hAnsi="Wingdings" w:hint="default"/>
         <w:sz w:val="20"/>
       </w:rPr>
     </w:lvl>
-    <w:lvl w:ilvl="4" w:tentative="0">
+    <w:lvl w:ilvl="4">
       <w:start w:val="1"/>
       <w:numFmt w:val="bullet"/>
       <w:lvlText w:val=""/>
@@ -4296,11 +4019,11 @@
         <w:ind w:left="3600" w:hanging="360"/>
       </w:pPr>
       <w:rPr>
-        <w:rFonts w:hint="default" w:ascii="Wingdings" w:hAnsi="Wingdings"/>
+        <w:rFonts w:ascii="Wingdings" w:hAnsi="Wingdings" w:hint="default"/>
         <w:sz w:val="20"/>
       </w:rPr>
     </w:lvl>
-    <w:lvl w:ilvl="5" w:tentative="0">
+    <w:lvl w:ilvl="5">
       <w:start w:val="1"/>
       <w:numFmt w:val="bullet"/>
       <w:lvlText w:val=""/>
@@ -4312,11 +4035,11 @@
         <w:ind w:left="4320" w:hanging="360"/>
       </w:pPr>
       <w:rPr>
-        <w:rFonts w:hint="default" w:ascii="Wingdings" w:hAnsi="Wingdings"/>
+        <w:rFonts w:ascii="Wingdings" w:hAnsi="Wingdings" w:hint="default"/>
         <w:sz w:val="20"/>
       </w:rPr>
     </w:lvl>
-    <w:lvl w:ilvl="6" w:tentative="0">
+    <w:lvl w:ilvl="6">
       <w:start w:val="1"/>
       <w:numFmt w:val="bullet"/>
       <w:lvlText w:val=""/>
@@ -4328,11 +4051,11 @@
         <w:ind w:left="5040" w:hanging="360"/>
       </w:pPr>
       <w:rPr>
-        <w:rFonts w:hint="default" w:ascii="Wingdings" w:hAnsi="Wingdings"/>
+        <w:rFonts w:ascii="Wingdings" w:hAnsi="Wingdings" w:hint="default"/>
         <w:sz w:val="20"/>
       </w:rPr>
     </w:lvl>
-    <w:lvl w:ilvl="7" w:tentative="0">
+    <w:lvl w:ilvl="7">
       <w:start w:val="1"/>
       <w:numFmt w:val="bullet"/>
       <w:lvlText w:val=""/>
@@ -4344,11 +4067,11 @@
         <w:ind w:left="5760" w:hanging="360"/>
       </w:pPr>
       <w:rPr>
-        <w:rFonts w:hint="default" w:ascii="Wingdings" w:hAnsi="Wingdings"/>
+        <w:rFonts w:ascii="Wingdings" w:hAnsi="Wingdings" w:hint="default"/>
         <w:sz w:val="20"/>
       </w:rPr>
     </w:lvl>
-    <w:lvl w:ilvl="8" w:tentative="0">
+    <w:lvl w:ilvl="8">
       <w:start w:val="1"/>
       <w:numFmt w:val="bullet"/>
       <w:lvlText w:val=""/>
@@ -4360,16 +4083,16 @@
         <w:ind w:left="6480" w:hanging="360"/>
       </w:pPr>
       <w:rPr>
-        <w:rFonts w:hint="default" w:ascii="Wingdings" w:hAnsi="Wingdings"/>
+        <w:rFonts w:ascii="Wingdings" w:hAnsi="Wingdings" w:hint="default"/>
         <w:sz w:val="20"/>
       </w:rPr>
     </w:lvl>
   </w:abstractNum>
-  <w:abstractNum w:abstractNumId="1">
+  <w:abstractNum w:abstractNumId="1" w15:restartNumberingAfterBreak="0">
     <w:nsid w:val="2A14015E"/>
     <w:multiLevelType w:val="multilevel"/>
     <w:tmpl w:val="2A14015E"/>
-    <w:lvl w:ilvl="0" w:tentative="0">
+    <w:lvl w:ilvl="0">
       <w:start w:val="5"/>
       <w:numFmt w:val="decimal"/>
       <w:lvlText w:val="%1"/>
@@ -4381,7 +4104,7 @@
         <w:rFonts w:hint="default"/>
       </w:rPr>
     </w:lvl>
-    <w:lvl w:ilvl="1" w:tentative="0">
+    <w:lvl w:ilvl="1">
       <w:start w:val="1"/>
       <w:numFmt w:val="decimal"/>
       <w:lvlText w:val="%1.%2"/>
@@ -4393,10 +4116,10 @@
         <w:rFonts w:hint="default"/>
       </w:rPr>
     </w:lvl>
-    <w:lvl w:ilvl="2" w:tentative="0">
+    <w:lvl w:ilvl="2">
       <w:start w:val="1"/>
       <w:numFmt w:val="decimal"/>
-      <w:pStyle w:val="5"/>
+      <w:pStyle w:val="Heading3"/>
       <w:lvlText w:val="%1.%2.%3"/>
       <w:lvlJc w:val="left"/>
       <w:pPr>
@@ -4406,7 +4129,7 @@
         <w:rFonts w:hint="default"/>
       </w:rPr>
     </w:lvl>
-    <w:lvl w:ilvl="3" w:tentative="0">
+    <w:lvl w:ilvl="3">
       <w:start w:val="1"/>
       <w:numFmt w:val="decimal"/>
       <w:lvlText w:val="%1.%2.%3.%4"/>
@@ -4418,7 +4141,7 @@
         <w:rFonts w:hint="default"/>
       </w:rPr>
     </w:lvl>
-    <w:lvl w:ilvl="4" w:tentative="0">
+    <w:lvl w:ilvl="4">
       <w:start w:val="1"/>
       <w:numFmt w:val="decimal"/>
       <w:lvlText w:val="%1.%2.%3.%4.%5"/>
@@ -4430,7 +4153,7 @@
         <w:rFonts w:hint="default"/>
       </w:rPr>
     </w:lvl>
-    <w:lvl w:ilvl="5" w:tentative="0">
+    <w:lvl w:ilvl="5">
       <w:start w:val="1"/>
       <w:numFmt w:val="decimal"/>
       <w:lvlText w:val="%1.%2.%3.%4.%5.%6"/>
@@ -4442,7 +4165,7 @@
         <w:rFonts w:hint="default"/>
       </w:rPr>
     </w:lvl>
-    <w:lvl w:ilvl="6" w:tentative="0">
+    <w:lvl w:ilvl="6">
       <w:start w:val="1"/>
       <w:numFmt w:val="decimal"/>
       <w:lvlText w:val="%1.%2.%3.%4.%5.%6.%7"/>
@@ -4454,7 +4177,7 @@
         <w:rFonts w:hint="default"/>
       </w:rPr>
     </w:lvl>
-    <w:lvl w:ilvl="7" w:tentative="0">
+    <w:lvl w:ilvl="7">
       <w:start w:val="1"/>
       <w:numFmt w:val="decimal"/>
       <w:lvlText w:val="%1.%2.%3.%4.%5.%6.%7.%8"/>
@@ -4466,7 +4189,7 @@
         <w:rFonts w:hint="default"/>
       </w:rPr>
     </w:lvl>
-    <w:lvl w:ilvl="8" w:tentative="0">
+    <w:lvl w:ilvl="8">
       <w:start w:val="1"/>
       <w:numFmt w:val="decimal"/>
       <w:lvlText w:val="%1.%2.%3.%4.%5.%6.%7.%8.%9"/>
@@ -4479,11 +4202,11 @@
       </w:rPr>
     </w:lvl>
   </w:abstractNum>
-  <w:abstractNum w:abstractNumId="2">
+  <w:abstractNum w:abstractNumId="2" w15:restartNumberingAfterBreak="0">
     <w:nsid w:val="2BCF5CDD"/>
     <w:multiLevelType w:val="multilevel"/>
     <w:tmpl w:val="2BCF5CDD"/>
-    <w:lvl w:ilvl="0" w:tentative="0">
+    <w:lvl w:ilvl="0">
       <w:start w:val="1"/>
       <w:numFmt w:val="bullet"/>
       <w:lvlText w:val=""/>
@@ -4495,11 +4218,11 @@
         <w:ind w:left="720" w:hanging="360"/>
       </w:pPr>
       <w:rPr>
-        <w:rFonts w:hint="default" w:ascii="Symbol" w:hAnsi="Symbol"/>
+        <w:rFonts w:ascii="Symbol" w:hAnsi="Symbol" w:hint="default"/>
         <w:sz w:val="20"/>
       </w:rPr>
     </w:lvl>
-    <w:lvl w:ilvl="1" w:tentative="0">
+    <w:lvl w:ilvl="1">
       <w:start w:val="1"/>
       <w:numFmt w:val="bullet"/>
       <w:lvlText w:val="o"/>
@@ -4511,11 +4234,11 @@
         <w:ind w:left="1440" w:hanging="360"/>
       </w:pPr>
       <w:rPr>
-        <w:rFonts w:hint="default" w:ascii="Courier New" w:hAnsi="Courier New"/>
+        <w:rFonts w:ascii="Courier New" w:hAnsi="Courier New" w:hint="default"/>
         <w:sz w:val="20"/>
       </w:rPr>
     </w:lvl>
-    <w:lvl w:ilvl="2" w:tentative="0">
+    <w:lvl w:ilvl="2">
       <w:start w:val="1"/>
       <w:numFmt w:val="bullet"/>
       <w:lvlText w:val=""/>
@@ -4527,11 +4250,11 @@
         <w:ind w:left="2160" w:hanging="360"/>
       </w:pPr>
       <w:rPr>
-        <w:rFonts w:hint="default" w:ascii="Wingdings" w:hAnsi="Wingdings"/>
+        <w:rFonts w:ascii="Wingdings" w:hAnsi="Wingdings" w:hint="default"/>
         <w:sz w:val="20"/>
       </w:rPr>
     </w:lvl>
-    <w:lvl w:ilvl="3" w:tentative="0">
+    <w:lvl w:ilvl="3">
       <w:start w:val="1"/>
       <w:numFmt w:val="bullet"/>
       <w:lvlText w:val=""/>
@@ -4543,11 +4266,11 @@
         <w:ind w:left="2880" w:hanging="360"/>
       </w:pPr>
       <w:rPr>
-        <w:rFonts w:hint="default" w:ascii="Wingdings" w:hAnsi="Wingdings"/>
+        <w:rFonts w:ascii="Wingdings" w:hAnsi="Wingdings" w:hint="default"/>
         <w:sz w:val="20"/>
       </w:rPr>
     </w:lvl>
-    <w:lvl w:ilvl="4" w:tentative="0">
+    <w:lvl w:ilvl="4">
       <w:start w:val="1"/>
       <w:numFmt w:val="bullet"/>
       <w:lvlText w:val=""/>
@@ -4559,11 +4282,11 @@
         <w:ind w:left="3600" w:hanging="360"/>
       </w:pPr>
       <w:rPr>
-        <w:rFonts w:hint="default" w:ascii="Wingdings" w:hAnsi="Wingdings"/>
+        <w:rFonts w:ascii="Wingdings" w:hAnsi="Wingdings" w:hint="default"/>
         <w:sz w:val="20"/>
       </w:rPr>
     </w:lvl>
-    <w:lvl w:ilvl="5" w:tentative="0">
+    <w:lvl w:ilvl="5">
       <w:start w:val="1"/>
       <w:numFmt w:val="bullet"/>
       <w:lvlText w:val=""/>
@@ -4575,11 +4298,11 @@
         <w:ind w:left="4320" w:hanging="360"/>
       </w:pPr>
       <w:rPr>
-        <w:rFonts w:hint="default" w:ascii="Wingdings" w:hAnsi="Wingdings"/>
+        <w:rFonts w:ascii="Wingdings" w:hAnsi="Wingdings" w:hint="default"/>
         <w:sz w:val="20"/>
       </w:rPr>
     </w:lvl>
-    <w:lvl w:ilvl="6" w:tentative="0">
+    <w:lvl w:ilvl="6">
       <w:start w:val="1"/>
       <w:numFmt w:val="bullet"/>
       <w:lvlText w:val=""/>
@@ -4591,11 +4314,11 @@
         <w:ind w:left="5040" w:hanging="360"/>
       </w:pPr>
       <w:rPr>
-        <w:rFonts w:hint="default" w:ascii="Wingdings" w:hAnsi="Wingdings"/>
+        <w:rFonts w:ascii="Wingdings" w:hAnsi="Wingdings" w:hint="default"/>
         <w:sz w:val="20"/>
       </w:rPr>
     </w:lvl>
-    <w:lvl w:ilvl="7" w:tentative="0">
+    <w:lvl w:ilvl="7">
       <w:start w:val="1"/>
       <w:numFmt w:val="bullet"/>
       <w:lvlText w:val=""/>
@@ -4607,11 +4330,11 @@
         <w:ind w:left="5760" w:hanging="360"/>
       </w:pPr>
       <w:rPr>
-        <w:rFonts w:hint="default" w:ascii="Wingdings" w:hAnsi="Wingdings"/>
+        <w:rFonts w:ascii="Wingdings" w:hAnsi="Wingdings" w:hint="default"/>
         <w:sz w:val="20"/>
       </w:rPr>
     </w:lvl>
-    <w:lvl w:ilvl="8" w:tentative="0">
+    <w:lvl w:ilvl="8">
       <w:start w:val="1"/>
       <w:numFmt w:val="bullet"/>
       <w:lvlText w:val=""/>
@@ -4623,16 +4346,16 @@
         <w:ind w:left="6480" w:hanging="360"/>
       </w:pPr>
       <w:rPr>
-        <w:rFonts w:hint="default" w:ascii="Wingdings" w:hAnsi="Wingdings"/>
+        <w:rFonts w:ascii="Wingdings" w:hAnsi="Wingdings" w:hint="default"/>
         <w:sz w:val="20"/>
       </w:rPr>
     </w:lvl>
   </w:abstractNum>
-  <w:abstractNum w:abstractNumId="3">
+  <w:abstractNum w:abstractNumId="3" w15:restartNumberingAfterBreak="0">
     <w:nsid w:val="3AEF2BD0"/>
     <w:multiLevelType w:val="multilevel"/>
     <w:tmpl w:val="3AEF2BD0"/>
-    <w:lvl w:ilvl="0" w:tentative="0">
+    <w:lvl w:ilvl="0">
       <w:start w:val="1"/>
       <w:numFmt w:val="decimal"/>
       <w:lvlText w:val="%1."/>
@@ -4644,10 +4367,10 @@
         <w:rFonts w:hint="default"/>
       </w:rPr>
     </w:lvl>
-    <w:lvl w:ilvl="1" w:tentative="0">
+    <w:lvl w:ilvl="1">
       <w:start w:val="1"/>
       <w:numFmt w:val="decimal"/>
-      <w:pStyle w:val="3"/>
+      <w:pStyle w:val="Heading2"/>
       <w:lvlText w:val="%1.%2."/>
       <w:lvlJc w:val="left"/>
       <w:pPr>
@@ -4657,7 +4380,7 @@
         <w:rFonts w:hint="default"/>
       </w:rPr>
     </w:lvl>
-    <w:lvl w:ilvl="2" w:tentative="0">
+    <w:lvl w:ilvl="2">
       <w:start w:val="1"/>
       <w:numFmt w:val="decimal"/>
       <w:lvlText w:val="%1.%2.%3."/>
@@ -4669,7 +4392,7 @@
         <w:rFonts w:hint="default"/>
       </w:rPr>
     </w:lvl>
-    <w:lvl w:ilvl="3" w:tentative="0">
+    <w:lvl w:ilvl="3">
       <w:start w:val="1"/>
       <w:numFmt w:val="decimal"/>
       <w:lvlText w:val="%1.%2.%3.%4."/>
@@ -4681,7 +4404,7 @@
         <w:rFonts w:hint="default"/>
       </w:rPr>
     </w:lvl>
-    <w:lvl w:ilvl="4" w:tentative="0">
+    <w:lvl w:ilvl="4">
       <w:start w:val="1"/>
       <w:numFmt w:val="decimal"/>
       <w:lvlText w:val="%1.%2.%3.%4.%5."/>
@@ -4693,7 +4416,7 @@
         <w:rFonts w:hint="default"/>
       </w:rPr>
     </w:lvl>
-    <w:lvl w:ilvl="5" w:tentative="0">
+    <w:lvl w:ilvl="5">
       <w:start w:val="1"/>
       <w:numFmt w:val="decimal"/>
       <w:lvlText w:val="%1.%2.%3.%4.%5.%6."/>
@@ -4705,7 +4428,7 @@
         <w:rFonts w:hint="default"/>
       </w:rPr>
     </w:lvl>
-    <w:lvl w:ilvl="6" w:tentative="0">
+    <w:lvl w:ilvl="6">
       <w:start w:val="1"/>
       <w:numFmt w:val="decimal"/>
       <w:lvlText w:val="%1.%2.%3.%4.%5.%6.%7."/>
@@ -4717,7 +4440,7 @@
         <w:rFonts w:hint="default"/>
       </w:rPr>
     </w:lvl>
-    <w:lvl w:ilvl="7" w:tentative="0">
+    <w:lvl w:ilvl="7">
       <w:start w:val="1"/>
       <w:numFmt w:val="decimal"/>
       <w:lvlText w:val="%1.%2.%3.%4.%5.%6.%7.%8."/>
@@ -4729,7 +4452,7 @@
         <w:rFonts w:hint="default"/>
       </w:rPr>
     </w:lvl>
-    <w:lvl w:ilvl="8" w:tentative="0">
+    <w:lvl w:ilvl="8">
       <w:start w:val="1"/>
       <w:numFmt w:val="decimal"/>
       <w:lvlText w:val="%1.%2.%3.%4.%5.%6.%7.%8.%9."/>
@@ -4742,11 +4465,11 @@
       </w:rPr>
     </w:lvl>
   </w:abstractNum>
-  <w:abstractNum w:abstractNumId="4">
+  <w:abstractNum w:abstractNumId="4" w15:restartNumberingAfterBreak="0">
     <w:nsid w:val="7ECC25EC"/>
     <w:multiLevelType w:val="multilevel"/>
     <w:tmpl w:val="7ECC25EC"/>
-    <w:lvl w:ilvl="0" w:tentative="0">
+    <w:lvl w:ilvl="0">
       <w:start w:val="1"/>
       <w:numFmt w:val="bullet"/>
       <w:lvlText w:val=""/>
@@ -4758,11 +4481,11 @@
         <w:ind w:left="720" w:hanging="360"/>
       </w:pPr>
       <w:rPr>
-        <w:rFonts w:hint="default" w:ascii="Symbol" w:hAnsi="Symbol"/>
+        <w:rFonts w:ascii="Symbol" w:hAnsi="Symbol" w:hint="default"/>
         <w:sz w:val="20"/>
       </w:rPr>
     </w:lvl>
-    <w:lvl w:ilvl="1" w:tentative="0">
+    <w:lvl w:ilvl="1">
       <w:start w:val="1"/>
       <w:numFmt w:val="bullet"/>
       <w:lvlText w:val="o"/>
@@ -4774,11 +4497,11 @@
         <w:ind w:left="1440" w:hanging="360"/>
       </w:pPr>
       <w:rPr>
-        <w:rFonts w:hint="default" w:ascii="Courier New" w:hAnsi="Courier New"/>
+        <w:rFonts w:ascii="Courier New" w:hAnsi="Courier New" w:hint="default"/>
         <w:sz w:val="20"/>
       </w:rPr>
     </w:lvl>
-    <w:lvl w:ilvl="2" w:tentative="0">
+    <w:lvl w:ilvl="2">
       <w:start w:val="1"/>
       <w:numFmt w:val="bullet"/>
       <w:lvlText w:val=""/>
@@ -4790,11 +4513,11 @@
         <w:ind w:left="2160" w:hanging="360"/>
       </w:pPr>
       <w:rPr>
-        <w:rFonts w:hint="default" w:ascii="Wingdings" w:hAnsi="Wingdings"/>
+        <w:rFonts w:ascii="Wingdings" w:hAnsi="Wingdings" w:hint="default"/>
         <w:sz w:val="20"/>
       </w:rPr>
     </w:lvl>
-    <w:lvl w:ilvl="3" w:tentative="0">
+    <w:lvl w:ilvl="3">
       <w:start w:val="1"/>
       <w:numFmt w:val="bullet"/>
       <w:lvlText w:val=""/>
@@ -4806,11 +4529,11 @@
         <w:ind w:left="2880" w:hanging="360"/>
       </w:pPr>
       <w:rPr>
-        <w:rFonts w:hint="default" w:ascii="Wingdings" w:hAnsi="Wingdings"/>
+        <w:rFonts w:ascii="Wingdings" w:hAnsi="Wingdings" w:hint="default"/>
         <w:sz w:val="20"/>
       </w:rPr>
     </w:lvl>
-    <w:lvl w:ilvl="4" w:tentative="0">
+    <w:lvl w:ilvl="4">
       <w:start w:val="1"/>
       <w:numFmt w:val="bullet"/>
       <w:lvlText w:val=""/>
@@ -4822,11 +4545,11 @@
         <w:ind w:left="3600" w:hanging="360"/>
       </w:pPr>
       <w:rPr>
-        <w:rFonts w:hint="default" w:ascii="Wingdings" w:hAnsi="Wingdings"/>
+        <w:rFonts w:ascii="Wingdings" w:hAnsi="Wingdings" w:hint="default"/>
         <w:sz w:val="20"/>
       </w:rPr>
     </w:lvl>
-    <w:lvl w:ilvl="5" w:tentative="0">
+    <w:lvl w:ilvl="5">
       <w:start w:val="1"/>
       <w:numFmt w:val="bullet"/>
       <w:lvlText w:val=""/>
@@ -4838,11 +4561,11 @@
         <w:ind w:left="4320" w:hanging="360"/>
       </w:pPr>
       <w:rPr>
-        <w:rFonts w:hint="default" w:ascii="Wingdings" w:hAnsi="Wingdings"/>
+        <w:rFonts w:ascii="Wingdings" w:hAnsi="Wingdings" w:hint="default"/>
         <w:sz w:val="20"/>
       </w:rPr>
     </w:lvl>
-    <w:lvl w:ilvl="6" w:tentative="0">
+    <w:lvl w:ilvl="6">
       <w:start w:val="1"/>
       <w:numFmt w:val="bullet"/>
       <w:lvlText w:val=""/>
@@ -4854,11 +4577,11 @@
         <w:ind w:left="5040" w:hanging="360"/>
       </w:pPr>
       <w:rPr>
-        <w:rFonts w:hint="default" w:ascii="Wingdings" w:hAnsi="Wingdings"/>
+        <w:rFonts w:ascii="Wingdings" w:hAnsi="Wingdings" w:hint="default"/>
         <w:sz w:val="20"/>
       </w:rPr>
     </w:lvl>
-    <w:lvl w:ilvl="7" w:tentative="0">
+    <w:lvl w:ilvl="7">
       <w:start w:val="1"/>
       <w:numFmt w:val="bullet"/>
       <w:lvlText w:val=""/>
@@ -4870,11 +4593,11 @@
         <w:ind w:left="5760" w:hanging="360"/>
       </w:pPr>
       <w:rPr>
-        <w:rFonts w:hint="default" w:ascii="Wingdings" w:hAnsi="Wingdings"/>
+        <w:rFonts w:ascii="Wingdings" w:hAnsi="Wingdings" w:hint="default"/>
         <w:sz w:val="20"/>
       </w:rPr>
     </w:lvl>
-    <w:lvl w:ilvl="8" w:tentative="0">
+    <w:lvl w:ilvl="8">
       <w:start w:val="1"/>
       <w:numFmt w:val="bullet"/>
       <w:lvlText w:val=""/>
@@ -4886,7 +4609,7 @@
         <w:ind w:left="6480" w:hanging="360"/>
       </w:pPr>
       <w:rPr>
-        <w:rFonts w:hint="default" w:ascii="Wingdings" w:hAnsi="Wingdings"/>
+        <w:rFonts w:ascii="Wingdings" w:hAnsi="Wingdings" w:hint="default"/>
         <w:sz w:val="20"/>
       </w:rPr>
     </w:lvl>
@@ -4910,287 +4633,410 @@
 </file>
 
 <file path=word/styles.xml><?xml version="1.0" encoding="utf-8"?>
-<w:styles xmlns:mc="http://schemas.openxmlformats.org/markup-compatibility/2006" xmlns:o="urn:schemas-microsoft-com:office:office" xmlns:r="http://schemas.openxmlformats.org/officeDocument/2006/relationships" xmlns:m="http://schemas.openxmlformats.org/officeDocument/2006/math" xmlns:v="urn:schemas-microsoft-com:vml" xmlns:w="http://schemas.openxmlformats.org/wordprocessingml/2006/main" xmlns:w14="http://schemas.microsoft.com/office/word/2010/wordml" xmlns:w10="urn:schemas-microsoft-com:office:word" xmlns:sl="http://schemas.openxmlformats.org/schemaLibrary/2006/main" xmlns:wpsCustomData="http://www.wps.cn/officeDocument/2013/wpsCustomData" mc:Ignorable="w14">
+<w:styles xmlns:mc="http://schemas.openxmlformats.org/markup-compatibility/2006" xmlns:r="http://schemas.openxmlformats.org/officeDocument/2006/relationships" xmlns:w="http://schemas.openxmlformats.org/wordprocessingml/2006/main" xmlns:w14="http://schemas.microsoft.com/office/word/2010/wordml" xmlns:w15="http://schemas.microsoft.com/office/word/2012/wordml" xmlns:w16cex="http://schemas.microsoft.com/office/word/2018/wordml/cex" xmlns:w16cid="http://schemas.microsoft.com/office/word/2016/wordml/cid" xmlns:w16="http://schemas.microsoft.com/office/word/2018/wordml" xmlns:w16sdtdh="http://schemas.microsoft.com/office/word/2020/wordml/sdtdatahash" xmlns:w16se="http://schemas.microsoft.com/office/word/2015/wordml/symex" mc:Ignorable="w14 w15 w16se w16cid w16 w16cex w16sdtdh">
   <w:docDefaults>
     <w:rPrDefault>
       <w:rPr>
-        <w:rFonts w:ascii="Times New Roman" w:hAnsi="Times New Roman" w:eastAsia="SimSun" w:cs="Times New Roman"/>
+        <w:rFonts w:ascii="Times New Roman" w:eastAsia="SimSun" w:hAnsi="Times New Roman" w:cs="Times New Roman"/>
+        <w:lang w:val="en-US" w:eastAsia="en-US" w:bidi="ar-SA"/>
       </w:rPr>
     </w:rPrDefault>
     <w:pPrDefault/>
   </w:docDefaults>
-  <w:latentStyles w:count="260" w:defQFormat="0" w:defUnhideWhenUsed="1" w:defSemiHidden="1" w:defUIPriority="99" w:defLockedState="0">
-    <w:lsdException w:qFormat="1" w:unhideWhenUsed="0" w:uiPriority="0" w:semiHidden="0" w:name="Normal"/>
-    <w:lsdException w:qFormat="1" w:unhideWhenUsed="0" w:uiPriority="9" w:semiHidden="0" w:name="heading 1"/>
-    <w:lsdException w:qFormat="1" w:uiPriority="9" w:semiHidden="0" w:name="heading 2"/>
-    <w:lsdException w:qFormat="1" w:uiPriority="9" w:semiHidden="0" w:name="heading 3"/>
-    <w:lsdException w:qFormat="1" w:uiPriority="9" w:name="heading 4"/>
-    <w:lsdException w:qFormat="1" w:uiPriority="9" w:name="heading 5"/>
-    <w:lsdException w:qFormat="1" w:uiPriority="9" w:name="heading 6"/>
-    <w:lsdException w:qFormat="1" w:uiPriority="9" w:name="heading 7"/>
-    <w:lsdException w:qFormat="1" w:uiPriority="9" w:name="heading 8"/>
-    <w:lsdException w:qFormat="1" w:uiPriority="9" w:name="heading 9"/>
-    <w:lsdException w:uiPriority="99" w:name="index 1"/>
-    <w:lsdException w:uiPriority="99" w:name="index 2"/>
-    <w:lsdException w:uiPriority="99" w:name="index 3"/>
-    <w:lsdException w:uiPriority="99" w:name="index 4"/>
-    <w:lsdException w:uiPriority="99" w:name="index 5"/>
-    <w:lsdException w:uiPriority="99" w:name="index 6"/>
-    <w:lsdException w:uiPriority="99" w:name="index 7"/>
-    <w:lsdException w:uiPriority="99" w:name="index 8"/>
-    <w:lsdException w:uiPriority="99" w:name="index 9"/>
-    <w:lsdException w:qFormat="1" w:uiPriority="39" w:semiHidden="0" w:name="toc 1"/>
-    <w:lsdException w:qFormat="1" w:uiPriority="39" w:semiHidden="0" w:name="toc 2"/>
-    <w:lsdException w:qFormat="1" w:uiPriority="39" w:semiHidden="0" w:name="toc 3"/>
-    <w:lsdException w:uiPriority="39" w:name="toc 4"/>
-    <w:lsdException w:uiPriority="39" w:name="toc 5"/>
-    <w:lsdException w:uiPriority="39" w:name="toc 6"/>
-    <w:lsdException w:uiPriority="39" w:name="toc 7"/>
-    <w:lsdException w:uiPriority="39" w:name="toc 8"/>
-    <w:lsdException w:uiPriority="39" w:name="toc 9"/>
-    <w:lsdException w:uiPriority="99" w:name="Normal Indent"/>
-    <w:lsdException w:uiPriority="99" w:name="footnote text"/>
-    <w:lsdException w:uiPriority="99" w:name="annotation text"/>
-    <w:lsdException w:uiPriority="99" w:name="header"/>
-    <w:lsdException w:uiPriority="99" w:name="footer"/>
-    <w:lsdException w:uiPriority="99" w:name="index heading"/>
-    <w:lsdException w:qFormat="1" w:uiPriority="35" w:name="caption"/>
-    <w:lsdException w:uiPriority="99" w:name="table of figures"/>
-    <w:lsdException w:uiPriority="99" w:name="envelope address"/>
-    <w:lsdException w:uiPriority="99" w:name="envelope return"/>
-    <w:lsdException w:uiPriority="99" w:name="footnote reference"/>
-    <w:lsdException w:uiPriority="99" w:name="annotation reference"/>
-    <w:lsdException w:uiPriority="99" w:name="line number"/>
-    <w:lsdException w:uiPriority="99" w:name="page number"/>
-    <w:lsdException w:uiPriority="99" w:name="endnote reference"/>
-    <w:lsdException w:uiPriority="99" w:name="endnote text"/>
-    <w:lsdException w:uiPriority="99" w:name="table of authorities"/>
-    <w:lsdException w:uiPriority="99" w:name="macro"/>
-    <w:lsdException w:uiPriority="99" w:name="toa heading"/>
-    <w:lsdException w:uiPriority="99" w:name="List"/>
-    <w:lsdException w:uiPriority="99" w:name="List Bullet"/>
-    <w:lsdException w:uiPriority="99" w:name="List Number"/>
-    <w:lsdException w:uiPriority="99" w:name="List 2"/>
-    <w:lsdException w:uiPriority="99" w:name="List 3"/>
-    <w:lsdException w:uiPriority="99" w:name="List 4"/>
-    <w:lsdException w:uiPriority="99" w:name="List 5"/>
-    <w:lsdException w:uiPriority="99" w:name="List Bullet 2"/>
-    <w:lsdException w:uiPriority="99" w:name="List Bullet 3"/>
-    <w:lsdException w:uiPriority="99" w:name="List Bullet 4"/>
-    <w:lsdException w:uiPriority="99" w:name="List Bullet 5"/>
-    <w:lsdException w:uiPriority="99" w:name="List Number 2"/>
-    <w:lsdException w:uiPriority="99" w:name="List Number 3"/>
-    <w:lsdException w:uiPriority="99" w:name="List Number 4"/>
-    <w:lsdException w:uiPriority="99" w:name="List Number 5"/>
-    <w:lsdException w:qFormat="1" w:unhideWhenUsed="0" w:uiPriority="10" w:semiHidden="0" w:name="Title"/>
-    <w:lsdException w:uiPriority="99" w:name="Closing"/>
-    <w:lsdException w:uiPriority="99" w:name="Signature"/>
-    <w:lsdException w:uiPriority="1" w:name="Default Paragraph Font"/>
-    <w:lsdException w:uiPriority="99" w:name="Body Text"/>
-    <w:lsdException w:uiPriority="99" w:name="Body Text Indent"/>
-    <w:lsdException w:uiPriority="99" w:name="List Continue"/>
-    <w:lsdException w:uiPriority="99" w:name="List Continue 2"/>
-    <w:lsdException w:uiPriority="99" w:name="List Continue 3"/>
-    <w:lsdException w:uiPriority="99" w:name="List Continue 4"/>
-    <w:lsdException w:uiPriority="99" w:name="List Continue 5"/>
-    <w:lsdException w:uiPriority="99" w:name="Message Header"/>
-    <w:lsdException w:qFormat="1" w:unhideWhenUsed="0" w:uiPriority="11" w:semiHidden="0" w:name="Subtitle"/>
-    <w:lsdException w:uiPriority="99" w:name="Salutation"/>
-    <w:lsdException w:uiPriority="99" w:name="Date"/>
-    <w:lsdException w:uiPriority="99" w:name="Body Text First Indent"/>
-    <w:lsdException w:uiPriority="99" w:name="Body Text First Indent 2"/>
-    <w:lsdException w:uiPriority="99" w:name="Note Heading"/>
-    <w:lsdException w:uiPriority="99" w:name="Body Text 2"/>
-    <w:lsdException w:uiPriority="99" w:name="Body Text 3"/>
-    <w:lsdException w:uiPriority="99" w:name="Body Text Indent 2"/>
-    <w:lsdException w:uiPriority="99" w:name="Body Text Indent 3"/>
-    <w:lsdException w:uiPriority="99" w:name="Block Text"/>
-    <w:lsdException w:qFormat="1" w:uiPriority="99" w:semiHidden="0" w:name="Hyperlink"/>
-    <w:lsdException w:uiPriority="99" w:name="FollowedHyperlink"/>
-    <w:lsdException w:qFormat="1" w:unhideWhenUsed="0" w:uiPriority="22" w:semiHidden="0" w:name="Strong"/>
-    <w:lsdException w:qFormat="1" w:unhideWhenUsed="0" w:uiPriority="20" w:semiHidden="0" w:name="Emphasis"/>
-    <w:lsdException w:uiPriority="99" w:name="Document Map"/>
-    <w:lsdException w:uiPriority="99" w:name="Plain Text"/>
-    <w:lsdException w:uiPriority="99" w:name="E-mail Signature"/>
-    <w:lsdException w:qFormat="1" w:uiPriority="99" w:semiHidden="0" w:name="Normal (Web)"/>
-    <w:lsdException w:uiPriority="99" w:name="HTML Acronym"/>
-    <w:lsdException w:uiPriority="99" w:name="HTML Address"/>
-    <w:lsdException w:uiPriority="99" w:name="HTML Cite"/>
-    <w:lsdException w:uiPriority="99" w:name="HTML Code"/>
-    <w:lsdException w:uiPriority="99" w:name="HTML Definition"/>
-    <w:lsdException w:uiPriority="99" w:name="HTML Keyboard"/>
-    <w:lsdException w:uiPriority="99" w:name="HTML Preformatted"/>
-    <w:lsdException w:uiPriority="99" w:name="HTML Sample"/>
-    <w:lsdException w:uiPriority="99" w:name="HTML Typewriter"/>
-    <w:lsdException w:uiPriority="99" w:name="HTML Variable"/>
-    <w:lsdException w:uiPriority="99" w:name="Normal Table"/>
-    <w:lsdException w:uiPriority="99" w:name="annotation subject"/>
-    <w:lsdException w:uiPriority="99" w:name="Table Simple 1"/>
-    <w:lsdException w:uiPriority="99" w:name="Table Simple 2"/>
-    <w:lsdException w:uiPriority="99" w:name="Table Simple 3"/>
-    <w:lsdException w:uiPriority="99" w:name="Table Classic 1"/>
-    <w:lsdException w:uiPriority="99" w:name="Table Classic 2"/>
-    <w:lsdException w:uiPriority="99" w:name="Table Classic 3"/>
-    <w:lsdException w:uiPriority="99" w:name="Table Classic 4"/>
-    <w:lsdException w:uiPriority="99" w:name="Table Colorful 1"/>
-    <w:lsdException w:uiPriority="99" w:name="Table Colorful 2"/>
-    <w:lsdException w:uiPriority="99" w:name="Table Colorful 3"/>
-    <w:lsdException w:uiPriority="99" w:name="Table Columns 1"/>
-    <w:lsdException w:uiPriority="99" w:name="Table Columns 2"/>
-    <w:lsdException w:uiPriority="99" w:name="Table Columns 3"/>
-    <w:lsdException w:uiPriority="99" w:name="Table Columns 4"/>
-    <w:lsdException w:uiPriority="99" w:name="Table Columns 5"/>
-    <w:lsdException w:uiPriority="99" w:name="Table Grid 1"/>
-    <w:lsdException w:uiPriority="99" w:name="Table Grid 2"/>
-    <w:lsdException w:uiPriority="99" w:name="Table Grid 3"/>
-    <w:lsdException w:uiPriority="99" w:name="Table Grid 4"/>
-    <w:lsdException w:uiPriority="99" w:name="Table Grid 5"/>
-    <w:lsdException w:uiPriority="99" w:name="Table Grid 6"/>
-    <w:lsdException w:uiPriority="99" w:name="Table Grid 7"/>
-    <w:lsdException w:uiPriority="99" w:name="Table Grid 8"/>
-    <w:lsdException w:uiPriority="99" w:name="Table List 1"/>
-    <w:lsdException w:uiPriority="99" w:name="Table List 2"/>
-    <w:lsdException w:uiPriority="99" w:name="Table List 3"/>
-    <w:lsdException w:uiPriority="99" w:name="Table List 4"/>
-    <w:lsdException w:uiPriority="99" w:name="Table List 5"/>
-    <w:lsdException w:uiPriority="99" w:name="Table List 6"/>
-    <w:lsdException w:uiPriority="99" w:name="Table List 7"/>
-    <w:lsdException w:uiPriority="99" w:name="Table List 8"/>
-    <w:lsdException w:uiPriority="99" w:name="Table 3D effects 1"/>
-    <w:lsdException w:uiPriority="99" w:name="Table 3D effects 2"/>
-    <w:lsdException w:uiPriority="99" w:name="Table 3D effects 3"/>
-    <w:lsdException w:uiPriority="99" w:name="Table Contemporary"/>
-    <w:lsdException w:uiPriority="99" w:name="Table Elegant"/>
-    <w:lsdException w:uiPriority="99" w:name="Table Professional"/>
-    <w:lsdException w:uiPriority="99" w:name="Table Subtle 1"/>
-    <w:lsdException w:uiPriority="99" w:name="Table Subtle 2"/>
-    <w:lsdException w:uiPriority="99" w:name="Table Web 1"/>
-    <w:lsdException w:uiPriority="99" w:name="Table Web 2"/>
-    <w:lsdException w:uiPriority="99" w:name="Table Web 3"/>
-    <w:lsdException w:uiPriority="99" w:name="Balloon Text"/>
-    <w:lsdException w:unhideWhenUsed="0" w:uiPriority="39" w:semiHidden="0" w:name="Table Grid"/>
-    <w:lsdException w:uiPriority="99" w:name="Table Theme"/>
-    <w:lsdException w:unhideWhenUsed="0" w:uiPriority="60" w:semiHidden="0" w:name="Light Shading"/>
-    <w:lsdException w:unhideWhenUsed="0" w:uiPriority="61" w:semiHidden="0" w:name="Light List"/>
-    <w:lsdException w:unhideWhenUsed="0" w:uiPriority="62" w:semiHidden="0" w:name="Light Grid"/>
-    <w:lsdException w:unhideWhenUsed="0" w:uiPriority="63" w:semiHidden="0" w:name="Medium Shading 1"/>
-    <w:lsdException w:unhideWhenUsed="0" w:uiPriority="64" w:semiHidden="0" w:name="Medium Shading 2"/>
-    <w:lsdException w:unhideWhenUsed="0" w:uiPriority="65" w:semiHidden="0" w:name="Medium List 1"/>
-    <w:lsdException w:unhideWhenUsed="0" w:uiPriority="66" w:semiHidden="0" w:name="Medium List 2"/>
-    <w:lsdException w:unhideWhenUsed="0" w:uiPriority="67" w:semiHidden="0" w:name="Medium Grid 1"/>
-    <w:lsdException w:unhideWhenUsed="0" w:uiPriority="68" w:semiHidden="0" w:name="Medium Grid 2"/>
-    <w:lsdException w:unhideWhenUsed="0" w:uiPriority="69" w:semiHidden="0" w:name="Medium Grid 3"/>
-    <w:lsdException w:unhideWhenUsed="0" w:uiPriority="70" w:semiHidden="0" w:name="Dark List"/>
-    <w:lsdException w:unhideWhenUsed="0" w:uiPriority="71" w:semiHidden="0" w:name="Colorful Shading"/>
-    <w:lsdException w:unhideWhenUsed="0" w:uiPriority="72" w:semiHidden="0" w:name="Colorful List"/>
-    <w:lsdException w:unhideWhenUsed="0" w:uiPriority="73" w:semiHidden="0" w:name="Colorful Grid"/>
-    <w:lsdException w:unhideWhenUsed="0" w:uiPriority="60" w:semiHidden="0" w:name="Light Shading Accent 1"/>
-    <w:lsdException w:unhideWhenUsed="0" w:uiPriority="61" w:semiHidden="0" w:name="Light List Accent 1"/>
-    <w:lsdException w:unhideWhenUsed="0" w:uiPriority="62" w:semiHidden="0" w:name="Light Grid Accent 1"/>
-    <w:lsdException w:unhideWhenUsed="0" w:uiPriority="63" w:semiHidden="0" w:name="Medium Shading 1 Accent 1"/>
-    <w:lsdException w:unhideWhenUsed="0" w:uiPriority="64" w:semiHidden="0" w:name="Medium Shading 2 Accent 1"/>
-    <w:lsdException w:unhideWhenUsed="0" w:uiPriority="65" w:semiHidden="0" w:name="Medium List 1 Accent 1"/>
-    <w:lsdException w:qFormat="1" w:unhideWhenUsed="0" w:uiPriority="34" w:semiHidden="0" w:name="List Paragraph"/>
-    <w:lsdException w:unhideWhenUsed="0" w:uiPriority="66" w:semiHidden="0" w:name="Medium List 2 Accent 1"/>
-    <w:lsdException w:unhideWhenUsed="0" w:uiPriority="67" w:semiHidden="0" w:name="Medium Grid 1 Accent 1"/>
-    <w:lsdException w:unhideWhenUsed="0" w:uiPriority="68" w:semiHidden="0" w:name="Medium Grid 2 Accent 1"/>
-    <w:lsdException w:unhideWhenUsed="0" w:uiPriority="69" w:semiHidden="0" w:name="Medium Grid 3 Accent 1"/>
-    <w:lsdException w:unhideWhenUsed="0" w:uiPriority="70" w:semiHidden="0" w:name="Dark List Accent 1"/>
-    <w:lsdException w:unhideWhenUsed="0" w:uiPriority="71" w:semiHidden="0" w:name="Colorful Shading Accent 1"/>
-    <w:lsdException w:unhideWhenUsed="0" w:uiPriority="72" w:semiHidden="0" w:name="Colorful List Accent 1"/>
-    <w:lsdException w:unhideWhenUsed="0" w:uiPriority="73" w:semiHidden="0" w:name="Colorful Grid Accent 1"/>
-    <w:lsdException w:unhideWhenUsed="0" w:uiPriority="60" w:semiHidden="0" w:name="Light Shading Accent 2"/>
-    <w:lsdException w:unhideWhenUsed="0" w:uiPriority="61" w:semiHidden="0" w:name="Light List Accent 2"/>
-    <w:lsdException w:unhideWhenUsed="0" w:uiPriority="62" w:semiHidden="0" w:name="Light Grid Accent 2"/>
-    <w:lsdException w:unhideWhenUsed="0" w:uiPriority="63" w:semiHidden="0" w:name="Medium Shading 1 Accent 2"/>
-    <w:lsdException w:unhideWhenUsed="0" w:uiPriority="64" w:semiHidden="0" w:name="Medium Shading 2 Accent 2"/>
-    <w:lsdException w:unhideWhenUsed="0" w:uiPriority="65" w:semiHidden="0" w:name="Medium List 1 Accent 2"/>
-    <w:lsdException w:unhideWhenUsed="0" w:uiPriority="66" w:semiHidden="0" w:name="Medium List 2 Accent 2"/>
-    <w:lsdException w:unhideWhenUsed="0" w:uiPriority="67" w:semiHidden="0" w:name="Medium Grid 1 Accent 2"/>
-    <w:lsdException w:unhideWhenUsed="0" w:uiPriority="68" w:semiHidden="0" w:name="Medium Grid 2 Accent 2"/>
-    <w:lsdException w:unhideWhenUsed="0" w:uiPriority="69" w:semiHidden="0" w:name="Medium Grid 3 Accent 2"/>
-    <w:lsdException w:unhideWhenUsed="0" w:uiPriority="70" w:semiHidden="0" w:name="Dark List Accent 2"/>
-    <w:lsdException w:unhideWhenUsed="0" w:uiPriority="71" w:semiHidden="0" w:name="Colorful Shading Accent 2"/>
-    <w:lsdException w:unhideWhenUsed="0" w:uiPriority="72" w:semiHidden="0" w:name="Colorful List Accent 2"/>
-    <w:lsdException w:unhideWhenUsed="0" w:uiPriority="73" w:semiHidden="0" w:name="Colorful Grid Accent 2"/>
-    <w:lsdException w:unhideWhenUsed="0" w:uiPriority="60" w:semiHidden="0" w:name="Light Shading Accent 3"/>
-    <w:lsdException w:unhideWhenUsed="0" w:uiPriority="61" w:semiHidden="0" w:name="Light List Accent 3"/>
-    <w:lsdException w:unhideWhenUsed="0" w:uiPriority="62" w:semiHidden="0" w:name="Light Grid Accent 3"/>
-    <w:lsdException w:unhideWhenUsed="0" w:uiPriority="63" w:semiHidden="0" w:name="Medium Shading 1 Accent 3"/>
-    <w:lsdException w:unhideWhenUsed="0" w:uiPriority="64" w:semiHidden="0" w:name="Medium Shading 2 Accent 3"/>
-    <w:lsdException w:unhideWhenUsed="0" w:uiPriority="65" w:semiHidden="0" w:name="Medium List 1 Accent 3"/>
-    <w:lsdException w:unhideWhenUsed="0" w:uiPriority="66" w:semiHidden="0" w:name="Medium List 2 Accent 3"/>
-    <w:lsdException w:unhideWhenUsed="0" w:uiPriority="67" w:semiHidden="0" w:name="Medium Grid 1 Accent 3"/>
-    <w:lsdException w:unhideWhenUsed="0" w:uiPriority="68" w:semiHidden="0" w:name="Medium Grid 2 Accent 3"/>
-    <w:lsdException w:unhideWhenUsed="0" w:uiPriority="69" w:semiHidden="0" w:name="Medium Grid 3 Accent 3"/>
-    <w:lsdException w:unhideWhenUsed="0" w:uiPriority="70" w:semiHidden="0" w:name="Dark List Accent 3"/>
-    <w:lsdException w:unhideWhenUsed="0" w:uiPriority="71" w:semiHidden="0" w:name="Colorful Shading Accent 3"/>
-    <w:lsdException w:unhideWhenUsed="0" w:uiPriority="72" w:semiHidden="0" w:name="Colorful List Accent 3"/>
-    <w:lsdException w:unhideWhenUsed="0" w:uiPriority="73" w:semiHidden="0" w:name="Colorful Grid Accent 3"/>
-    <w:lsdException w:unhideWhenUsed="0" w:uiPriority="60" w:semiHidden="0" w:name="Light Shading Accent 4"/>
-    <w:lsdException w:unhideWhenUsed="0" w:uiPriority="61" w:semiHidden="0" w:name="Light List Accent 4"/>
-    <w:lsdException w:unhideWhenUsed="0" w:uiPriority="62" w:semiHidden="0" w:name="Light Grid Accent 4"/>
-    <w:lsdException w:unhideWhenUsed="0" w:uiPriority="63" w:semiHidden="0" w:name="Medium Shading 1 Accent 4"/>
-    <w:lsdException w:unhideWhenUsed="0" w:uiPriority="64" w:semiHidden="0" w:name="Medium Shading 2 Accent 4"/>
-    <w:lsdException w:unhideWhenUsed="0" w:uiPriority="65" w:semiHidden="0" w:name="Medium List 1 Accent 4"/>
-    <w:lsdException w:unhideWhenUsed="0" w:uiPriority="66" w:semiHidden="0" w:name="Medium List 2 Accent 4"/>
-    <w:lsdException w:unhideWhenUsed="0" w:uiPriority="67" w:semiHidden="0" w:name="Medium Grid 1 Accent 4"/>
-    <w:lsdException w:unhideWhenUsed="0" w:uiPriority="68" w:semiHidden="0" w:name="Medium Grid 2 Accent 4"/>
-    <w:lsdException w:unhideWhenUsed="0" w:uiPriority="69" w:semiHidden="0" w:name="Medium Grid 3 Accent 4"/>
-    <w:lsdException w:unhideWhenUsed="0" w:uiPriority="70" w:semiHidden="0" w:name="Dark List Accent 4"/>
-    <w:lsdException w:unhideWhenUsed="0" w:uiPriority="71" w:semiHidden="0" w:name="Colorful Shading Accent 4"/>
-    <w:lsdException w:unhideWhenUsed="0" w:uiPriority="72" w:semiHidden="0" w:name="Colorful List Accent 4"/>
-    <w:lsdException w:unhideWhenUsed="0" w:uiPriority="73" w:semiHidden="0" w:name="Colorful Grid Accent 4"/>
-    <w:lsdException w:unhideWhenUsed="0" w:uiPriority="60" w:semiHidden="0" w:name="Light Shading Accent 5"/>
-    <w:lsdException w:unhideWhenUsed="0" w:uiPriority="61" w:semiHidden="0" w:name="Light List Accent 5"/>
-    <w:lsdException w:unhideWhenUsed="0" w:uiPriority="62" w:semiHidden="0" w:name="Light Grid Accent 5"/>
-    <w:lsdException w:unhideWhenUsed="0" w:uiPriority="63" w:semiHidden="0" w:name="Medium Shading 1 Accent 5"/>
-    <w:lsdException w:unhideWhenUsed="0" w:uiPriority="64" w:semiHidden="0" w:name="Medium Shading 2 Accent 5"/>
-    <w:lsdException w:unhideWhenUsed="0" w:uiPriority="65" w:semiHidden="0" w:name="Medium List 1 Accent 5"/>
-    <w:lsdException w:unhideWhenUsed="0" w:uiPriority="66" w:semiHidden="0" w:name="Medium List 2 Accent 5"/>
-    <w:lsdException w:unhideWhenUsed="0" w:uiPriority="67" w:semiHidden="0" w:name="Medium Grid 1 Accent 5"/>
-    <w:lsdException w:unhideWhenUsed="0" w:uiPriority="68" w:semiHidden="0" w:name="Medium Grid 2 Accent 5"/>
-    <w:lsdException w:unhideWhenUsed="0" w:uiPriority="69" w:semiHidden="0" w:name="Medium Grid 3 Accent 5"/>
-    <w:lsdException w:unhideWhenUsed="0" w:uiPriority="70" w:semiHidden="0" w:name="Dark List Accent 5"/>
-    <w:lsdException w:unhideWhenUsed="0" w:uiPriority="71" w:semiHidden="0" w:name="Colorful Shading Accent 5"/>
-    <w:lsdException w:unhideWhenUsed="0" w:uiPriority="72" w:semiHidden="0" w:name="Colorful List Accent 5"/>
-    <w:lsdException w:unhideWhenUsed="0" w:uiPriority="73" w:semiHidden="0" w:name="Colorful Grid Accent 5"/>
-    <w:lsdException w:unhideWhenUsed="0" w:uiPriority="60" w:semiHidden="0" w:name="Light Shading Accent 6"/>
-    <w:lsdException w:unhideWhenUsed="0" w:uiPriority="61" w:semiHidden="0" w:name="Light List Accent 6"/>
-    <w:lsdException w:unhideWhenUsed="0" w:uiPriority="62" w:semiHidden="0" w:name="Light Grid Accent 6"/>
-    <w:lsdException w:unhideWhenUsed="0" w:uiPriority="63" w:semiHidden="0" w:name="Medium Shading 1 Accent 6"/>
-    <w:lsdException w:unhideWhenUsed="0" w:uiPriority="64" w:semiHidden="0" w:name="Medium Shading 2 Accent 6"/>
-    <w:lsdException w:unhideWhenUsed="0" w:uiPriority="65" w:semiHidden="0" w:name="Medium List 1 Accent 6"/>
-    <w:lsdException w:unhideWhenUsed="0" w:uiPriority="66" w:semiHidden="0" w:name="Medium List 2 Accent 6"/>
-    <w:lsdException w:unhideWhenUsed="0" w:uiPriority="67" w:semiHidden="0" w:name="Medium Grid 1 Accent 6"/>
-    <w:lsdException w:unhideWhenUsed="0" w:uiPriority="68" w:semiHidden="0" w:name="Medium Grid 2 Accent 6"/>
-    <w:lsdException w:unhideWhenUsed="0" w:uiPriority="69" w:semiHidden="0" w:name="Medium Grid 3 Accent 6"/>
-    <w:lsdException w:unhideWhenUsed="0" w:uiPriority="70" w:semiHidden="0" w:name="Dark List Accent 6"/>
-    <w:lsdException w:unhideWhenUsed="0" w:uiPriority="71" w:semiHidden="0" w:name="Colorful Shading Accent 6"/>
-    <w:lsdException w:unhideWhenUsed="0" w:uiPriority="72" w:semiHidden="0" w:name="Colorful List Accent 6"/>
-    <w:lsdException w:unhideWhenUsed="0" w:uiPriority="73" w:semiHidden="0" w:name="Colorful Grid Accent 6"/>
+  <w:latentStyles w:defLockedState="0" w:defUIPriority="99" w:defSemiHidden="0" w:defUnhideWhenUsed="0" w:defQFormat="0" w:count="376">
+    <w:lsdException w:name="Normal" w:uiPriority="0" w:qFormat="1"/>
+    <w:lsdException w:name="heading 1" w:uiPriority="9" w:qFormat="1"/>
+    <w:lsdException w:name="heading 2" w:uiPriority="9" w:unhideWhenUsed="1" w:qFormat="1"/>
+    <w:lsdException w:name="heading 3" w:uiPriority="9" w:unhideWhenUsed="1" w:qFormat="1"/>
+    <w:lsdException w:name="heading 4" w:semiHidden="1" w:uiPriority="9" w:unhideWhenUsed="1" w:qFormat="1"/>
+    <w:lsdException w:name="heading 5" w:semiHidden="1" w:uiPriority="9" w:unhideWhenUsed="1" w:qFormat="1"/>
+    <w:lsdException w:name="heading 6" w:semiHidden="1" w:uiPriority="9" w:unhideWhenUsed="1" w:qFormat="1"/>
+    <w:lsdException w:name="heading 7" w:semiHidden="1" w:uiPriority="9" w:unhideWhenUsed="1" w:qFormat="1"/>
+    <w:lsdException w:name="heading 8" w:semiHidden="1" w:uiPriority="9" w:unhideWhenUsed="1" w:qFormat="1"/>
+    <w:lsdException w:name="heading 9" w:semiHidden="1" w:uiPriority="9" w:unhideWhenUsed="1" w:qFormat="1"/>
+    <w:lsdException w:name="index 1" w:semiHidden="1" w:unhideWhenUsed="1"/>
+    <w:lsdException w:name="index 2" w:semiHidden="1" w:unhideWhenUsed="1"/>
+    <w:lsdException w:name="index 3" w:semiHidden="1" w:unhideWhenUsed="1"/>
+    <w:lsdException w:name="index 4" w:semiHidden="1" w:unhideWhenUsed="1"/>
+    <w:lsdException w:name="index 5" w:semiHidden="1" w:unhideWhenUsed="1"/>
+    <w:lsdException w:name="index 6" w:semiHidden="1" w:unhideWhenUsed="1"/>
+    <w:lsdException w:name="index 7" w:semiHidden="1" w:unhideWhenUsed="1"/>
+    <w:lsdException w:name="index 8" w:semiHidden="1" w:unhideWhenUsed="1"/>
+    <w:lsdException w:name="index 9" w:semiHidden="1" w:unhideWhenUsed="1"/>
+    <w:lsdException w:name="toc 1" w:uiPriority="39" w:unhideWhenUsed="1" w:qFormat="1"/>
+    <w:lsdException w:name="toc 2" w:uiPriority="39" w:unhideWhenUsed="1" w:qFormat="1"/>
+    <w:lsdException w:name="toc 3" w:uiPriority="39" w:unhideWhenUsed="1" w:qFormat="1"/>
+    <w:lsdException w:name="toc 4" w:semiHidden="1" w:uiPriority="39" w:unhideWhenUsed="1"/>
+    <w:lsdException w:name="toc 5" w:semiHidden="1" w:uiPriority="39" w:unhideWhenUsed="1"/>
+    <w:lsdException w:name="toc 6" w:semiHidden="1" w:uiPriority="39" w:unhideWhenUsed="1"/>
+    <w:lsdException w:name="toc 7" w:semiHidden="1" w:uiPriority="39" w:unhideWhenUsed="1"/>
+    <w:lsdException w:name="toc 8" w:semiHidden="1" w:uiPriority="39" w:unhideWhenUsed="1"/>
+    <w:lsdException w:name="toc 9" w:semiHidden="1" w:uiPriority="39" w:unhideWhenUsed="1"/>
+    <w:lsdException w:name="Normal Indent" w:semiHidden="1" w:unhideWhenUsed="1"/>
+    <w:lsdException w:name="footnote text" w:semiHidden="1" w:unhideWhenUsed="1"/>
+    <w:lsdException w:name="annotation text" w:semiHidden="1" w:unhideWhenUsed="1"/>
+    <w:lsdException w:name="header" w:semiHidden="1" w:unhideWhenUsed="1"/>
+    <w:lsdException w:name="footer" w:semiHidden="1" w:unhideWhenUsed="1"/>
+    <w:lsdException w:name="index heading" w:semiHidden="1" w:unhideWhenUsed="1"/>
+    <w:lsdException w:name="caption" w:semiHidden="1" w:uiPriority="35" w:unhideWhenUsed="1" w:qFormat="1"/>
+    <w:lsdException w:name="table of figures" w:semiHidden="1" w:unhideWhenUsed="1"/>
+    <w:lsdException w:name="envelope address" w:semiHidden="1" w:unhideWhenUsed="1"/>
+    <w:lsdException w:name="envelope return" w:semiHidden="1" w:unhideWhenUsed="1"/>
+    <w:lsdException w:name="footnote reference" w:semiHidden="1" w:unhideWhenUsed="1"/>
+    <w:lsdException w:name="annotation reference" w:semiHidden="1" w:unhideWhenUsed="1"/>
+    <w:lsdException w:name="line number" w:semiHidden="1" w:unhideWhenUsed="1"/>
+    <w:lsdException w:name="page number" w:semiHidden="1" w:unhideWhenUsed="1"/>
+    <w:lsdException w:name="endnote reference" w:semiHidden="1" w:unhideWhenUsed="1"/>
+    <w:lsdException w:name="endnote text" w:semiHidden="1" w:unhideWhenUsed="1"/>
+    <w:lsdException w:name="table of authorities" w:semiHidden="1" w:unhideWhenUsed="1"/>
+    <w:lsdException w:name="macro" w:semiHidden="1" w:unhideWhenUsed="1"/>
+    <w:lsdException w:name="toa heading" w:semiHidden="1" w:unhideWhenUsed="1"/>
+    <w:lsdException w:name="List" w:semiHidden="1" w:unhideWhenUsed="1"/>
+    <w:lsdException w:name="List Bullet" w:semiHidden="1" w:unhideWhenUsed="1"/>
+    <w:lsdException w:name="List Number" w:semiHidden="1" w:unhideWhenUsed="1"/>
+    <w:lsdException w:name="List 2" w:semiHidden="1" w:unhideWhenUsed="1"/>
+    <w:lsdException w:name="List 3" w:semiHidden="1" w:unhideWhenUsed="1"/>
+    <w:lsdException w:name="List 4" w:semiHidden="1" w:unhideWhenUsed="1"/>
+    <w:lsdException w:name="List 5" w:semiHidden="1" w:unhideWhenUsed="1"/>
+    <w:lsdException w:name="List Bullet 2" w:semiHidden="1" w:unhideWhenUsed="1"/>
+    <w:lsdException w:name="List Bullet 3" w:semiHidden="1" w:unhideWhenUsed="1"/>
+    <w:lsdException w:name="List Bullet 4" w:semiHidden="1" w:unhideWhenUsed="1"/>
+    <w:lsdException w:name="List Bullet 5" w:semiHidden="1" w:unhideWhenUsed="1"/>
+    <w:lsdException w:name="List Number 2" w:semiHidden="1" w:unhideWhenUsed="1"/>
+    <w:lsdException w:name="List Number 3" w:semiHidden="1" w:unhideWhenUsed="1"/>
+    <w:lsdException w:name="List Number 4" w:semiHidden="1" w:unhideWhenUsed="1"/>
+    <w:lsdException w:name="List Number 5" w:semiHidden="1" w:unhideWhenUsed="1"/>
+    <w:lsdException w:name="Title" w:uiPriority="10" w:qFormat="1"/>
+    <w:lsdException w:name="Closing" w:semiHidden="1" w:unhideWhenUsed="1"/>
+    <w:lsdException w:name="Signature" w:semiHidden="1" w:unhideWhenUsed="1"/>
+    <w:lsdException w:name="Default Paragraph Font" w:semiHidden="1" w:uiPriority="1" w:unhideWhenUsed="1"/>
+    <w:lsdException w:name="Body Text" w:semiHidden="1" w:unhideWhenUsed="1"/>
+    <w:lsdException w:name="Body Text Indent" w:semiHidden="1" w:unhideWhenUsed="1"/>
+    <w:lsdException w:name="List Continue" w:semiHidden="1" w:unhideWhenUsed="1"/>
+    <w:lsdException w:name="List Continue 2" w:semiHidden="1" w:unhideWhenUsed="1"/>
+    <w:lsdException w:name="List Continue 3" w:semiHidden="1" w:unhideWhenUsed="1"/>
+    <w:lsdException w:name="List Continue 4" w:semiHidden="1" w:unhideWhenUsed="1"/>
+    <w:lsdException w:name="List Continue 5" w:semiHidden="1" w:unhideWhenUsed="1"/>
+    <w:lsdException w:name="Message Header" w:semiHidden="1" w:unhideWhenUsed="1"/>
+    <w:lsdException w:name="Subtitle" w:uiPriority="11" w:qFormat="1"/>
+    <w:lsdException w:name="Salutation" w:semiHidden="1" w:unhideWhenUsed="1"/>
+    <w:lsdException w:name="Date" w:semiHidden="1" w:unhideWhenUsed="1"/>
+    <w:lsdException w:name="Body Text First Indent" w:semiHidden="1" w:unhideWhenUsed="1"/>
+    <w:lsdException w:name="Body Text First Indent 2" w:semiHidden="1" w:unhideWhenUsed="1"/>
+    <w:lsdException w:name="Note Heading" w:semiHidden="1" w:unhideWhenUsed="1"/>
+    <w:lsdException w:name="Body Text 2" w:semiHidden="1" w:unhideWhenUsed="1"/>
+    <w:lsdException w:name="Body Text 3" w:semiHidden="1" w:unhideWhenUsed="1"/>
+    <w:lsdException w:name="Body Text Indent 2" w:semiHidden="1" w:unhideWhenUsed="1"/>
+    <w:lsdException w:name="Body Text Indent 3" w:semiHidden="1" w:unhideWhenUsed="1"/>
+    <w:lsdException w:name="Block Text" w:semiHidden="1" w:unhideWhenUsed="1"/>
+    <w:lsdException w:name="Hyperlink" w:unhideWhenUsed="1" w:qFormat="1"/>
+    <w:lsdException w:name="FollowedHyperlink" w:semiHidden="1" w:unhideWhenUsed="1"/>
+    <w:lsdException w:name="Strong" w:uiPriority="22" w:qFormat="1"/>
+    <w:lsdException w:name="Emphasis" w:uiPriority="20" w:qFormat="1"/>
+    <w:lsdException w:name="Document Map" w:semiHidden="1" w:unhideWhenUsed="1"/>
+    <w:lsdException w:name="Plain Text" w:semiHidden="1" w:unhideWhenUsed="1"/>
+    <w:lsdException w:name="E-mail Signature" w:semiHidden="1" w:unhideWhenUsed="1"/>
+    <w:lsdException w:name="HTML Top of Form" w:semiHidden="1" w:unhideWhenUsed="1"/>
+    <w:lsdException w:name="HTML Bottom of Form" w:semiHidden="1" w:unhideWhenUsed="1"/>
+    <w:lsdException w:name="Normal (Web)" w:unhideWhenUsed="1" w:qFormat="1"/>
+    <w:lsdException w:name="HTML Acronym" w:semiHidden="1" w:unhideWhenUsed="1"/>
+    <w:lsdException w:name="HTML Address" w:semiHidden="1" w:unhideWhenUsed="1"/>
+    <w:lsdException w:name="HTML Cite" w:semiHidden="1" w:unhideWhenUsed="1"/>
+    <w:lsdException w:name="HTML Code" w:semiHidden="1" w:unhideWhenUsed="1"/>
+    <w:lsdException w:name="HTML Definition" w:semiHidden="1" w:unhideWhenUsed="1"/>
+    <w:lsdException w:name="HTML Keyboard" w:semiHidden="1" w:unhideWhenUsed="1"/>
+    <w:lsdException w:name="HTML Preformatted" w:semiHidden="1" w:unhideWhenUsed="1"/>
+    <w:lsdException w:name="HTML Sample" w:semiHidden="1" w:unhideWhenUsed="1"/>
+    <w:lsdException w:name="HTML Typewriter" w:semiHidden="1" w:unhideWhenUsed="1"/>
+    <w:lsdException w:name="HTML Variable" w:semiHidden="1" w:unhideWhenUsed="1"/>
+    <w:lsdException w:name="Normal Table" w:semiHidden="1" w:unhideWhenUsed="1"/>
+    <w:lsdException w:name="annotation subject" w:semiHidden="1" w:unhideWhenUsed="1"/>
+    <w:lsdException w:name="No List" w:semiHidden="1" w:unhideWhenUsed="1"/>
+    <w:lsdException w:name="Outline List 1" w:semiHidden="1" w:unhideWhenUsed="1"/>
+    <w:lsdException w:name="Outline List 2" w:semiHidden="1" w:unhideWhenUsed="1"/>
+    <w:lsdException w:name="Outline List 3" w:semiHidden="1" w:unhideWhenUsed="1"/>
+    <w:lsdException w:name="Table Simple 1" w:semiHidden="1" w:unhideWhenUsed="1"/>
+    <w:lsdException w:name="Table Simple 2" w:semiHidden="1" w:unhideWhenUsed="1"/>
+    <w:lsdException w:name="Table Simple 3" w:semiHidden="1" w:unhideWhenUsed="1"/>
+    <w:lsdException w:name="Table Classic 1" w:semiHidden="1" w:unhideWhenUsed="1"/>
+    <w:lsdException w:name="Table Classic 2" w:semiHidden="1" w:unhideWhenUsed="1"/>
+    <w:lsdException w:name="Table Classic 3" w:semiHidden="1" w:unhideWhenUsed="1"/>
+    <w:lsdException w:name="Table Classic 4" w:semiHidden="1" w:unhideWhenUsed="1"/>
+    <w:lsdException w:name="Table Colorful 1" w:semiHidden="1" w:unhideWhenUsed="1"/>
+    <w:lsdException w:name="Table Colorful 2" w:semiHidden="1" w:unhideWhenUsed="1"/>
+    <w:lsdException w:name="Table Colorful 3" w:semiHidden="1" w:unhideWhenUsed="1"/>
+    <w:lsdException w:name="Table Columns 1" w:semiHidden="1" w:unhideWhenUsed="1"/>
+    <w:lsdException w:name="Table Columns 2" w:semiHidden="1" w:unhideWhenUsed="1"/>
+    <w:lsdException w:name="Table Columns 3" w:semiHidden="1" w:unhideWhenUsed="1"/>
+    <w:lsdException w:name="Table Columns 4" w:semiHidden="1" w:unhideWhenUsed="1"/>
+    <w:lsdException w:name="Table Columns 5" w:semiHidden="1" w:unhideWhenUsed="1"/>
+    <w:lsdException w:name="Table Grid 1" w:semiHidden="1" w:unhideWhenUsed="1"/>
+    <w:lsdException w:name="Table Grid 2" w:semiHidden="1" w:unhideWhenUsed="1"/>
+    <w:lsdException w:name="Table Grid 3" w:semiHidden="1" w:unhideWhenUsed="1"/>
+    <w:lsdException w:name="Table Grid 4" w:semiHidden="1" w:unhideWhenUsed="1"/>
+    <w:lsdException w:name="Table Grid 5" w:semiHidden="1" w:unhideWhenUsed="1"/>
+    <w:lsdException w:name="Table Grid 6" w:semiHidden="1" w:unhideWhenUsed="1"/>
+    <w:lsdException w:name="Table Grid 7" w:semiHidden="1" w:unhideWhenUsed="1"/>
+    <w:lsdException w:name="Table Grid 8" w:semiHidden="1" w:unhideWhenUsed="1"/>
+    <w:lsdException w:name="Table List 1" w:semiHidden="1" w:unhideWhenUsed="1"/>
+    <w:lsdException w:name="Table List 2" w:semiHidden="1" w:unhideWhenUsed="1"/>
+    <w:lsdException w:name="Table List 3" w:semiHidden="1" w:unhideWhenUsed="1"/>
+    <w:lsdException w:name="Table List 4" w:semiHidden="1" w:unhideWhenUsed="1"/>
+    <w:lsdException w:name="Table List 5" w:semiHidden="1" w:unhideWhenUsed="1"/>
+    <w:lsdException w:name="Table List 6" w:semiHidden="1" w:unhideWhenUsed="1"/>
+    <w:lsdException w:name="Table List 7" w:semiHidden="1" w:unhideWhenUsed="1"/>
+    <w:lsdException w:name="Table List 8" w:semiHidden="1" w:unhideWhenUsed="1"/>
+    <w:lsdException w:name="Table 3D effects 1" w:semiHidden="1" w:unhideWhenUsed="1"/>
+    <w:lsdException w:name="Table 3D effects 2" w:semiHidden="1" w:unhideWhenUsed="1"/>
+    <w:lsdException w:name="Table 3D effects 3" w:semiHidden="1" w:unhideWhenUsed="1"/>
+    <w:lsdException w:name="Table Contemporary" w:semiHidden="1" w:unhideWhenUsed="1"/>
+    <w:lsdException w:name="Table Elegant" w:semiHidden="1" w:unhideWhenUsed="1"/>
+    <w:lsdException w:name="Table Professional" w:semiHidden="1" w:unhideWhenUsed="1"/>
+    <w:lsdException w:name="Table Subtle 1" w:semiHidden="1" w:unhideWhenUsed="1"/>
+    <w:lsdException w:name="Table Subtle 2" w:semiHidden="1" w:unhideWhenUsed="1"/>
+    <w:lsdException w:name="Table Web 1" w:semiHidden="1" w:unhideWhenUsed="1"/>
+    <w:lsdException w:name="Table Web 2" w:semiHidden="1" w:unhideWhenUsed="1"/>
+    <w:lsdException w:name="Table Web 3" w:semiHidden="1" w:unhideWhenUsed="1"/>
+    <w:lsdException w:name="Balloon Text" w:semiHidden="1" w:unhideWhenUsed="1"/>
+    <w:lsdException w:name="Table Grid" w:uiPriority="39"/>
+    <w:lsdException w:name="Table Theme" w:semiHidden="1" w:unhideWhenUsed="1"/>
+    <w:lsdException w:name="Placeholder Text" w:semiHidden="1"/>
+    <w:lsdException w:name="Light Shading" w:uiPriority="60"/>
+    <w:lsdException w:name="Light List" w:uiPriority="61"/>
+    <w:lsdException w:name="Light Grid" w:uiPriority="62"/>
+    <w:lsdException w:name="Medium Shading 1" w:uiPriority="63"/>
+    <w:lsdException w:name="Medium Shading 2" w:uiPriority="64"/>
+    <w:lsdException w:name="Medium List 1" w:uiPriority="65"/>
+    <w:lsdException w:name="Medium List 2" w:uiPriority="66"/>
+    <w:lsdException w:name="Medium Grid 1" w:uiPriority="67"/>
+    <w:lsdException w:name="Medium Grid 2" w:uiPriority="68"/>
+    <w:lsdException w:name="Medium Grid 3" w:uiPriority="69"/>
+    <w:lsdException w:name="Dark List" w:uiPriority="70"/>
+    <w:lsdException w:name="Colorful Shading" w:uiPriority="71"/>
+    <w:lsdException w:name="Colorful List" w:uiPriority="72"/>
+    <w:lsdException w:name="Colorful Grid" w:uiPriority="73"/>
+    <w:lsdException w:name="Light Shading Accent 1" w:uiPriority="60"/>
+    <w:lsdException w:name="Light List Accent 1" w:uiPriority="61"/>
+    <w:lsdException w:name="Light Grid Accent 1" w:uiPriority="62"/>
+    <w:lsdException w:name="Medium Shading 1 Accent 1" w:uiPriority="63"/>
+    <w:lsdException w:name="Medium Shading 2 Accent 1" w:uiPriority="64"/>
+    <w:lsdException w:name="Medium List 1 Accent 1" w:uiPriority="65"/>
+    <w:lsdException w:name="Revision" w:semiHidden="1"/>
+    <w:lsdException w:name="List Paragraph" w:uiPriority="34" w:qFormat="1"/>
+    <w:lsdException w:name="Medium List 2 Accent 1" w:uiPriority="66"/>
+    <w:lsdException w:name="Medium Grid 1 Accent 1" w:uiPriority="67"/>
+    <w:lsdException w:name="Medium Grid 2 Accent 1" w:uiPriority="68"/>
+    <w:lsdException w:name="Medium Grid 3 Accent 1" w:uiPriority="69"/>
+    <w:lsdException w:name="Dark List Accent 1" w:uiPriority="70"/>
+    <w:lsdException w:name="Colorful Shading Accent 1" w:uiPriority="71"/>
+    <w:lsdException w:name="Colorful List Accent 1" w:uiPriority="72"/>
+    <w:lsdException w:name="Colorful Grid Accent 1" w:uiPriority="73"/>
+    <w:lsdException w:name="Light Shading Accent 2" w:uiPriority="60"/>
+    <w:lsdException w:name="Light List Accent 2" w:uiPriority="61"/>
+    <w:lsdException w:name="Light Grid Accent 2" w:uiPriority="62"/>
+    <w:lsdException w:name="Medium Shading 1 Accent 2" w:uiPriority="63"/>
+    <w:lsdException w:name="Medium Shading 2 Accent 2" w:uiPriority="64"/>
+    <w:lsdException w:name="Medium List 1 Accent 2" w:uiPriority="65"/>
+    <w:lsdException w:name="Medium List 2 Accent 2" w:uiPriority="66"/>
+    <w:lsdException w:name="Medium Grid 1 Accent 2" w:uiPriority="67"/>
+    <w:lsdException w:name="Medium Grid 2 Accent 2" w:uiPriority="68"/>
+    <w:lsdException w:name="Medium Grid 3 Accent 2" w:uiPriority="69"/>
+    <w:lsdException w:name="Dark List Accent 2" w:uiPriority="70"/>
+    <w:lsdException w:name="Colorful Shading Accent 2" w:uiPriority="71"/>
+    <w:lsdException w:name="Colorful List Accent 2" w:uiPriority="72"/>
+    <w:lsdException w:name="Colorful Grid Accent 2" w:uiPriority="73"/>
+    <w:lsdException w:name="Light Shading Accent 3" w:uiPriority="60"/>
+    <w:lsdException w:name="Light List Accent 3" w:uiPriority="61"/>
+    <w:lsdException w:name="Light Grid Accent 3" w:uiPriority="62"/>
+    <w:lsdException w:name="Medium Shading 1 Accent 3" w:uiPriority="63"/>
+    <w:lsdException w:name="Medium Shading 2 Accent 3" w:uiPriority="64"/>
+    <w:lsdException w:name="Medium List 1 Accent 3" w:uiPriority="65"/>
+    <w:lsdException w:name="Medium List 2 Accent 3" w:uiPriority="66"/>
+    <w:lsdException w:name="Medium Grid 1 Accent 3" w:uiPriority="67"/>
+    <w:lsdException w:name="Medium Grid 2 Accent 3" w:uiPriority="68"/>
+    <w:lsdException w:name="Medium Grid 3 Accent 3" w:uiPriority="69"/>
+    <w:lsdException w:name="Dark List Accent 3" w:uiPriority="70"/>
+    <w:lsdException w:name="Colorful Shading Accent 3" w:uiPriority="71"/>
+    <w:lsdException w:name="Colorful List Accent 3" w:uiPriority="72"/>
+    <w:lsdException w:name="Colorful Grid Accent 3" w:uiPriority="73"/>
+    <w:lsdException w:name="Light Shading Accent 4" w:uiPriority="60"/>
+    <w:lsdException w:name="Light List Accent 4" w:uiPriority="61"/>
+    <w:lsdException w:name="Light Grid Accent 4" w:uiPriority="62"/>
+    <w:lsdException w:name="Medium Shading 1 Accent 4" w:uiPriority="63"/>
+    <w:lsdException w:name="Medium Shading 2 Accent 4" w:uiPriority="64"/>
+    <w:lsdException w:name="Medium List 1 Accent 4" w:uiPriority="65"/>
+    <w:lsdException w:name="Medium List 2 Accent 4" w:uiPriority="66"/>
+    <w:lsdException w:name="Medium Grid 1 Accent 4" w:uiPriority="67"/>
+    <w:lsdException w:name="Medium Grid 2 Accent 4" w:uiPriority="68"/>
+    <w:lsdException w:name="Medium Grid 3 Accent 4" w:uiPriority="69"/>
+    <w:lsdException w:name="Dark List Accent 4" w:uiPriority="70"/>
+    <w:lsdException w:name="Colorful Shading Accent 4" w:uiPriority="71"/>
+    <w:lsdException w:name="Colorful List Accent 4" w:uiPriority="72"/>
+    <w:lsdException w:name="Colorful Grid Accent 4" w:uiPriority="73"/>
+    <w:lsdException w:name="Light Shading Accent 5" w:uiPriority="60"/>
+    <w:lsdException w:name="Light List Accent 5" w:uiPriority="61"/>
+    <w:lsdException w:name="Light Grid Accent 5" w:uiPriority="62"/>
+    <w:lsdException w:name="Medium Shading 1 Accent 5" w:uiPriority="63"/>
+    <w:lsdException w:name="Medium Shading 2 Accent 5" w:uiPriority="64"/>
+    <w:lsdException w:name="Medium List 1 Accent 5" w:uiPriority="65"/>
+    <w:lsdException w:name="Medium List 2 Accent 5" w:uiPriority="66"/>
+    <w:lsdException w:name="Medium Grid 1 Accent 5" w:uiPriority="67"/>
+    <w:lsdException w:name="Medium Grid 2 Accent 5" w:uiPriority="68"/>
+    <w:lsdException w:name="Medium Grid 3 Accent 5" w:uiPriority="69"/>
+    <w:lsdException w:name="Dark List Accent 5" w:uiPriority="70"/>
+    <w:lsdException w:name="Colorful Shading Accent 5" w:uiPriority="71"/>
+    <w:lsdException w:name="Colorful List Accent 5" w:uiPriority="72"/>
+    <w:lsdException w:name="Colorful Grid Accent 5" w:uiPriority="73"/>
+    <w:lsdException w:name="Light Shading Accent 6" w:uiPriority="60"/>
+    <w:lsdException w:name="Light List Accent 6" w:uiPriority="61"/>
+    <w:lsdException w:name="Light Grid Accent 6" w:uiPriority="62"/>
+    <w:lsdException w:name="Medium Shading 1 Accent 6" w:uiPriority="63"/>
+    <w:lsdException w:name="Medium Shading 2 Accent 6" w:uiPriority="64"/>
+    <w:lsdException w:name="Medium List 1 Accent 6" w:uiPriority="65"/>
+    <w:lsdException w:name="Medium List 2 Accent 6" w:uiPriority="66"/>
+    <w:lsdException w:name="Medium Grid 1 Accent 6" w:uiPriority="67"/>
+    <w:lsdException w:name="Medium Grid 2 Accent 6" w:uiPriority="68"/>
+    <w:lsdException w:name="Medium Grid 3 Accent 6" w:uiPriority="69"/>
+    <w:lsdException w:name="Dark List Accent 6" w:uiPriority="70"/>
+    <w:lsdException w:name="Colorful Shading Accent 6" w:uiPriority="71"/>
+    <w:lsdException w:name="Colorful List Accent 6" w:uiPriority="72"/>
+    <w:lsdException w:name="Colorful Grid Accent 6" w:uiPriority="73"/>
+    <w:lsdException w:name="Subtle Emphasis" w:uiPriority="19" w:qFormat="1"/>
+    <w:lsdException w:name="Intense Emphasis" w:uiPriority="21" w:qFormat="1"/>
+    <w:lsdException w:name="Subtle Reference" w:uiPriority="31" w:qFormat="1"/>
+    <w:lsdException w:name="Intense Reference" w:uiPriority="32" w:qFormat="1"/>
+    <w:lsdException w:name="Book Title" w:uiPriority="33" w:qFormat="1"/>
+    <w:lsdException w:name="Bibliography" w:semiHidden="1" w:uiPriority="37" w:unhideWhenUsed="1"/>
+    <w:lsdException w:name="TOC Heading" w:semiHidden="1" w:uiPriority="39" w:unhideWhenUsed="1" w:qFormat="1"/>
+    <w:lsdException w:name="Plain Table 1" w:uiPriority="41"/>
+    <w:lsdException w:name="Plain Table 2" w:uiPriority="42"/>
+    <w:lsdException w:name="Plain Table 3" w:uiPriority="43"/>
+    <w:lsdException w:name="Plain Table 4" w:uiPriority="44"/>
+    <w:lsdException w:name="Plain Table 5" w:uiPriority="45"/>
+    <w:lsdException w:name="Grid Table Light" w:uiPriority="40"/>
+    <w:lsdException w:name="Grid Table 1 Light" w:uiPriority="46"/>
+    <w:lsdException w:name="Grid Table 2" w:uiPriority="47"/>
+    <w:lsdException w:name="Grid Table 3" w:uiPriority="48"/>
+    <w:lsdException w:name="Grid Table 4" w:uiPriority="49"/>
+    <w:lsdException w:name="Grid Table 5 Dark" w:uiPriority="50"/>
+    <w:lsdException w:name="Grid Table 6 Colorful" w:uiPriority="51"/>
+    <w:lsdException w:name="Grid Table 7 Colorful" w:uiPriority="52"/>
+    <w:lsdException w:name="Grid Table 1 Light Accent 1" w:uiPriority="46"/>
+    <w:lsdException w:name="Grid Table 2 Accent 1" w:uiPriority="47"/>
+    <w:lsdException w:name="Grid Table 3 Accent 1" w:uiPriority="48"/>
+    <w:lsdException w:name="Grid Table 4 Accent 1" w:uiPriority="49"/>
+    <w:lsdException w:name="Grid Table 5 Dark Accent 1" w:uiPriority="50"/>
+    <w:lsdException w:name="Grid Table 6 Colorful Accent 1" w:uiPriority="51"/>
+    <w:lsdException w:name="Grid Table 7 Colorful Accent 1" w:uiPriority="52"/>
+    <w:lsdException w:name="Grid Table 1 Light Accent 2" w:uiPriority="46"/>
+    <w:lsdException w:name="Grid Table 2 Accent 2" w:uiPriority="47"/>
+    <w:lsdException w:name="Grid Table 3 Accent 2" w:uiPriority="48"/>
+    <w:lsdException w:name="Grid Table 4 Accent 2" w:uiPriority="49"/>
+    <w:lsdException w:name="Grid Table 5 Dark Accent 2" w:uiPriority="50"/>
+    <w:lsdException w:name="Grid Table 6 Colorful Accent 2" w:uiPriority="51"/>
+    <w:lsdException w:name="Grid Table 7 Colorful Accent 2" w:uiPriority="52"/>
+    <w:lsdException w:name="Grid Table 1 Light Accent 3" w:uiPriority="46"/>
+    <w:lsdException w:name="Grid Table 2 Accent 3" w:uiPriority="47"/>
+    <w:lsdException w:name="Grid Table 3 Accent 3" w:uiPriority="48"/>
+    <w:lsdException w:name="Grid Table 4 Accent 3" w:uiPriority="49"/>
+    <w:lsdException w:name="Grid Table 5 Dark Accent 3" w:uiPriority="50"/>
+    <w:lsdException w:name="Grid Table 6 Colorful Accent 3" w:uiPriority="51"/>
+    <w:lsdException w:name="Grid Table 7 Colorful Accent 3" w:uiPriority="52"/>
+    <w:lsdException w:name="Grid Table 1 Light Accent 4" w:uiPriority="46"/>
+    <w:lsdException w:name="Grid Table 2 Accent 4" w:uiPriority="47"/>
+    <w:lsdException w:name="Grid Table 3 Accent 4" w:uiPriority="48"/>
+    <w:lsdException w:name="Grid Table 4 Accent 4" w:uiPriority="49"/>
+    <w:lsdException w:name="Grid Table 5 Dark Accent 4" w:uiPriority="50"/>
+    <w:lsdException w:name="Grid Table 6 Colorful Accent 4" w:uiPriority="51"/>
+    <w:lsdException w:name="Grid Table 7 Colorful Accent 4" w:uiPriority="52"/>
+    <w:lsdException w:name="Grid Table 1 Light Accent 5" w:uiPriority="46"/>
+    <w:lsdException w:name="Grid Table 2 Accent 5" w:uiPriority="47"/>
+    <w:lsdException w:name="Grid Table 3 Accent 5" w:uiPriority="48"/>
+    <w:lsdException w:name="Grid Table 4 Accent 5" w:uiPriority="49"/>
+    <w:lsdException w:name="Grid Table 5 Dark Accent 5" w:uiPriority="50"/>
+    <w:lsdException w:name="Grid Table 6 Colorful Accent 5" w:uiPriority="51"/>
+    <w:lsdException w:name="Grid Table 7 Colorful Accent 5" w:uiPriority="52"/>
+    <w:lsdException w:name="Grid Table 1 Light Accent 6" w:uiPriority="46"/>
+    <w:lsdException w:name="Grid Table 2 Accent 6" w:uiPriority="47"/>
+    <w:lsdException w:name="Grid Table 3 Accent 6" w:uiPriority="48"/>
+    <w:lsdException w:name="Grid Table 4 Accent 6" w:uiPriority="49"/>
+    <w:lsdException w:name="Grid Table 5 Dark Accent 6" w:uiPriority="50"/>
+    <w:lsdException w:name="Grid Table 6 Colorful Accent 6" w:uiPriority="51"/>
+    <w:lsdException w:name="Grid Table 7 Colorful Accent 6" w:uiPriority="52"/>
+    <w:lsdException w:name="List Table 1 Light" w:uiPriority="46"/>
+    <w:lsdException w:name="List Table 2" w:uiPriority="47"/>
+    <w:lsdException w:name="List Table 3" w:uiPriority="48"/>
+    <w:lsdException w:name="List Table 4" w:uiPriority="49"/>
+    <w:lsdException w:name="List Table 5 Dark" w:uiPriority="50"/>
+    <w:lsdException w:name="List Table 6 Colorful" w:uiPriority="51"/>
+    <w:lsdException w:name="List Table 7 Colorful" w:uiPriority="52"/>
+    <w:lsdException w:name="List Table 1 Light Accent 1" w:uiPriority="46"/>
+    <w:lsdException w:name="List Table 2 Accent 1" w:uiPriority="47"/>
+    <w:lsdException w:name="List Table 3 Accent 1" w:uiPriority="48"/>
+    <w:lsdException w:name="List Table 4 Accent 1" w:uiPriority="49"/>
+    <w:lsdException w:name="List Table 5 Dark Accent 1" w:uiPriority="50"/>
+    <w:lsdException w:name="List Table 6 Colorful Accent 1" w:uiPriority="51"/>
+    <w:lsdException w:name="List Table 7 Colorful Accent 1" w:uiPriority="52"/>
+    <w:lsdException w:name="List Table 1 Light Accent 2" w:uiPriority="46"/>
+    <w:lsdException w:name="List Table 2 Accent 2" w:uiPriority="47"/>
+    <w:lsdException w:name="List Table 3 Accent 2" w:uiPriority="48"/>
+    <w:lsdException w:name="List Table 4 Accent 2" w:uiPriority="49"/>
+    <w:lsdException w:name="List Table 5 Dark Accent 2" w:uiPriority="50"/>
+    <w:lsdException w:name="List Table 6 Colorful Accent 2" w:uiPriority="51"/>
+    <w:lsdException w:name="List Table 7 Colorful Accent 2" w:uiPriority="52"/>
+    <w:lsdException w:name="List Table 1 Light Accent 3" w:uiPriority="46"/>
+    <w:lsdException w:name="List Table 2 Accent 3" w:uiPriority="47"/>
+    <w:lsdException w:name="List Table 3 Accent 3" w:uiPriority="48"/>
+    <w:lsdException w:name="List Table 4 Accent 3" w:uiPriority="49"/>
+    <w:lsdException w:name="List Table 5 Dark Accent 3" w:uiPriority="50"/>
+    <w:lsdException w:name="List Table 6 Colorful Accent 3" w:uiPriority="51"/>
+    <w:lsdException w:name="List Table 7 Colorful Accent 3" w:uiPriority="52"/>
+    <w:lsdException w:name="List Table 1 Light Accent 4" w:uiPriority="46"/>
+    <w:lsdException w:name="List Table 2 Accent 4" w:uiPriority="47"/>
+    <w:lsdException w:name="List Table 3 Accent 4" w:uiPriority="48"/>
+    <w:lsdException w:name="List Table 4 Accent 4" w:uiPriority="49"/>
+    <w:lsdException w:name="List Table 5 Dark Accent 4" w:uiPriority="50"/>
+    <w:lsdException w:name="List Table 6 Colorful Accent 4" w:uiPriority="51"/>
+    <w:lsdException w:name="List Table 7 Colorful Accent 4" w:uiPriority="52"/>
+    <w:lsdException w:name="List Table 1 Light Accent 5" w:uiPriority="46"/>
+    <w:lsdException w:name="List Table 2 Accent 5" w:uiPriority="47"/>
+    <w:lsdException w:name="List Table 3 Accent 5" w:uiPriority="48"/>
+    <w:lsdException w:name="List Table 4 Accent 5" w:uiPriority="49"/>
+    <w:lsdException w:name="List Table 5 Dark Accent 5" w:uiPriority="50"/>
+    <w:lsdException w:name="List Table 6 Colorful Accent 5" w:uiPriority="51"/>
+    <w:lsdException w:name="List Table 7 Colorful Accent 5" w:uiPriority="52"/>
+    <w:lsdException w:name="List Table 1 Light Accent 6" w:uiPriority="46"/>
+    <w:lsdException w:name="List Table 2 Accent 6" w:uiPriority="47"/>
+    <w:lsdException w:name="List Table 3 Accent 6" w:uiPriority="48"/>
+    <w:lsdException w:name="List Table 4 Accent 6" w:uiPriority="49"/>
+    <w:lsdException w:name="List Table 5 Dark Accent 6" w:uiPriority="50"/>
+    <w:lsdException w:name="List Table 6 Colorful Accent 6" w:uiPriority="51"/>
+    <w:lsdException w:name="List Table 7 Colorful Accent 6" w:uiPriority="52"/>
+    <w:lsdException w:name="Mention" w:semiHidden="1" w:unhideWhenUsed="1"/>
+    <w:lsdException w:name="Smart Hyperlink" w:semiHidden="1" w:unhideWhenUsed="1"/>
+    <w:lsdException w:name="Hashtag" w:semiHidden="1" w:unhideWhenUsed="1"/>
+    <w:lsdException w:name="Unresolved Mention" w:semiHidden="1" w:unhideWhenUsed="1"/>
+    <w:lsdException w:name="Smart Link" w:semiHidden="1" w:unhideWhenUsed="1"/>
   </w:latentStyles>
-  <w:style w:type="paragraph" w:default="1" w:styleId="1">
+  <w:style w:type="paragraph" w:default="1" w:styleId="Normal">
     <w:name w:val="Normal"/>
     <w:qFormat/>
-    <w:uiPriority w:val="0"/>
     <w:pPr>
       <w:spacing w:after="160" w:line="259" w:lineRule="auto"/>
     </w:pPr>
     <w:rPr>
-      <w:rFonts w:asciiTheme="minorHAnsi" w:hAnsiTheme="minorHAnsi" w:eastAsiaTheme="minorHAnsi" w:cstheme="minorBidi"/>
+      <w:rFonts w:asciiTheme="minorHAnsi" w:eastAsiaTheme="minorHAnsi" w:hAnsiTheme="minorHAnsi" w:cstheme="minorBidi"/>
       <w:sz w:val="22"/>
       <w:szCs w:val="22"/>
-      <w:lang w:val="en-US" w:eastAsia="en-US" w:bidi="ar-SA"/>
     </w:rPr>
   </w:style>
-  <w:style w:type="paragraph" w:styleId="2">
+  <w:style w:type="paragraph" w:styleId="Heading1">
     <w:name w:val="heading 1"/>
-    <w:basedOn w:val="1"/>
-    <w:next w:val="1"/>
-    <w:link w:val="14"/>
+    <w:basedOn w:val="Normal"/>
+    <w:next w:val="Normal"/>
+    <w:link w:val="Heading1Char"/>
+    <w:uiPriority w:val="9"/>
     <w:qFormat/>
-    <w:uiPriority w:val="9"/>
     <w:pPr>
       <w:spacing w:after="480"/>
       <w:jc w:val="center"/>
@@ -5204,14 +5050,14 @@
       <w:szCs w:val="24"/>
     </w:rPr>
   </w:style>
-  <w:style w:type="paragraph" w:styleId="3">
+  <w:style w:type="paragraph" w:styleId="Heading2">
     <w:name w:val="heading 2"/>
-    <w:basedOn w:val="4"/>
-    <w:next w:val="1"/>
-    <w:link w:val="15"/>
+    <w:basedOn w:val="ListParagraph"/>
+    <w:next w:val="Normal"/>
+    <w:link w:val="Heading2Char"/>
+    <w:uiPriority w:val="9"/>
     <w:unhideWhenUsed/>
     <w:qFormat/>
-    <w:uiPriority w:val="9"/>
     <w:pPr>
       <w:numPr>
         <w:ilvl w:val="1"/>
@@ -5227,14 +5073,14 @@
       <w:szCs w:val="24"/>
     </w:rPr>
   </w:style>
-  <w:style w:type="paragraph" w:styleId="5">
+  <w:style w:type="paragraph" w:styleId="Heading3">
     <w:name w:val="heading 3"/>
-    <w:basedOn w:val="4"/>
-    <w:next w:val="1"/>
-    <w:link w:val="17"/>
+    <w:basedOn w:val="ListParagraph"/>
+    <w:next w:val="Normal"/>
+    <w:link w:val="Heading3Char"/>
+    <w:uiPriority w:val="9"/>
     <w:unhideWhenUsed/>
     <w:qFormat/>
-    <w:uiPriority w:val="9"/>
     <w:pPr>
       <w:numPr>
         <w:ilvl w:val="2"/>
@@ -5251,18 +5097,19 @@
       <w:szCs w:val="24"/>
     </w:rPr>
   </w:style>
-  <w:style w:type="character" w:default="1" w:styleId="6">
+  <w:style w:type="character" w:default="1" w:styleId="DefaultParagraphFont">
     <w:name w:val="Default Paragraph Font"/>
+    <w:uiPriority w:val="1"/>
     <w:semiHidden/>
     <w:unhideWhenUsed/>
-    <w:uiPriority w:val="1"/>
   </w:style>
-  <w:style w:type="table" w:default="1" w:styleId="7">
+  <w:style w:type="table" w:default="1" w:styleId="TableNormal">
     <w:name w:val="Normal Table"/>
+    <w:uiPriority w:val="99"/>
     <w:semiHidden/>
     <w:unhideWhenUsed/>
-    <w:uiPriority w:val="99"/>
     <w:tblPr>
+      <w:tblInd w:w="0" w:type="dxa"/>
       <w:tblCellMar>
         <w:top w:w="0" w:type="dxa"/>
         <w:left w:w="108" w:type="dxa"/>
@@ -5271,99 +5118,100 @@
       </w:tblCellMar>
     </w:tblPr>
   </w:style>
-  <w:style w:type="paragraph" w:styleId="4">
+  <w:style w:type="numbering" w:default="1" w:styleId="NoList">
+    <w:name w:val="No List"/>
+    <w:uiPriority w:val="99"/>
+    <w:semiHidden/>
+    <w:unhideWhenUsed/>
+  </w:style>
+  <w:style w:type="paragraph" w:styleId="ListParagraph">
     <w:name w:val="List Paragraph"/>
-    <w:basedOn w:val="1"/>
+    <w:basedOn w:val="Normal"/>
+    <w:uiPriority w:val="34"/>
     <w:qFormat/>
-    <w:uiPriority w:val="34"/>
     <w:pPr>
       <w:ind w:left="720"/>
       <w:contextualSpacing/>
     </w:pPr>
   </w:style>
-  <w:style w:type="character" w:styleId="8">
+  <w:style w:type="character" w:styleId="Hyperlink">
     <w:name w:val="Hyperlink"/>
-    <w:basedOn w:val="6"/>
+    <w:basedOn w:val="DefaultParagraphFont"/>
+    <w:uiPriority w:val="99"/>
     <w:unhideWhenUsed/>
     <w:qFormat/>
-    <w:uiPriority w:val="99"/>
     <w:rPr>
       <w:color w:val="0563C1" w:themeColor="hyperlink"/>
       <w:u w:val="single"/>
-      <w14:textFill>
-        <w14:solidFill>
-          <w14:schemeClr w14:val="hlink"/>
-        </w14:solidFill>
-      </w14:textFill>
     </w:rPr>
   </w:style>
-  <w:style w:type="paragraph" w:styleId="9">
+  <w:style w:type="paragraph" w:styleId="NormalWeb">
     <w:name w:val="Normal (Web)"/>
-    <w:basedOn w:val="1"/>
+    <w:basedOn w:val="Normal"/>
+    <w:uiPriority w:val="99"/>
     <w:unhideWhenUsed/>
     <w:qFormat/>
-    <w:uiPriority w:val="99"/>
     <w:pPr>
       <w:spacing w:before="100" w:beforeAutospacing="1" w:after="100" w:afterAutospacing="1" w:line="240" w:lineRule="auto"/>
     </w:pPr>
     <w:rPr>
-      <w:rFonts w:ascii="Times New Roman" w:hAnsi="Times New Roman" w:eastAsia="Times New Roman" w:cs="Times New Roman"/>
+      <w:rFonts w:ascii="Times New Roman" w:eastAsia="Times New Roman" w:hAnsi="Times New Roman" w:cs="Times New Roman"/>
       <w:sz w:val="24"/>
       <w:szCs w:val="24"/>
     </w:rPr>
   </w:style>
-  <w:style w:type="character" w:styleId="10">
+  <w:style w:type="character" w:styleId="Strong">
     <w:name w:val="Strong"/>
-    <w:basedOn w:val="6"/>
+    <w:basedOn w:val="DefaultParagraphFont"/>
+    <w:uiPriority w:val="22"/>
     <w:qFormat/>
-    <w:uiPriority w:val="22"/>
     <w:rPr>
       <w:b/>
       <w:bCs/>
     </w:rPr>
   </w:style>
-  <w:style w:type="paragraph" w:styleId="11">
+  <w:style w:type="paragraph" w:styleId="TOC1">
     <w:name w:val="toc 1"/>
-    <w:basedOn w:val="1"/>
-    <w:next w:val="1"/>
+    <w:basedOn w:val="Normal"/>
+    <w:next w:val="Normal"/>
     <w:autoRedefine/>
+    <w:uiPriority w:val="39"/>
     <w:unhideWhenUsed/>
     <w:qFormat/>
-    <w:uiPriority w:val="39"/>
     <w:pPr>
       <w:spacing w:after="100"/>
     </w:pPr>
   </w:style>
-  <w:style w:type="paragraph" w:styleId="12">
+  <w:style w:type="paragraph" w:styleId="TOC2">
     <w:name w:val="toc 2"/>
-    <w:basedOn w:val="1"/>
-    <w:next w:val="1"/>
+    <w:basedOn w:val="Normal"/>
+    <w:next w:val="Normal"/>
     <w:autoRedefine/>
+    <w:uiPriority w:val="39"/>
     <w:unhideWhenUsed/>
     <w:qFormat/>
-    <w:uiPriority w:val="39"/>
     <w:pPr>
       <w:spacing w:after="100"/>
       <w:ind w:left="220"/>
     </w:pPr>
   </w:style>
-  <w:style w:type="paragraph" w:styleId="13">
+  <w:style w:type="paragraph" w:styleId="TOC3">
     <w:name w:val="toc 3"/>
-    <w:basedOn w:val="1"/>
-    <w:next w:val="1"/>
+    <w:basedOn w:val="Normal"/>
+    <w:next w:val="Normal"/>
     <w:autoRedefine/>
+    <w:uiPriority w:val="39"/>
     <w:unhideWhenUsed/>
     <w:qFormat/>
-    <w:uiPriority w:val="39"/>
     <w:pPr>
       <w:spacing w:after="100"/>
       <w:ind w:left="440"/>
     </w:pPr>
   </w:style>
-  <w:style w:type="character" w:customStyle="1" w:styleId="14">
+  <w:style w:type="character" w:customStyle="1" w:styleId="Heading1Char">
     <w:name w:val="Heading 1 Char"/>
-    <w:basedOn w:val="6"/>
-    <w:link w:val="2"/>
+    <w:basedOn w:val="DefaultParagraphFont"/>
+    <w:link w:val="Heading1"/>
     <w:uiPriority w:val="9"/>
     <w:rPr>
       <w:rFonts w:ascii="Times New Roman" w:hAnsi="Times New Roman" w:cs="Times New Roman"/>
@@ -5373,12 +5221,12 @@
       <w:szCs w:val="24"/>
     </w:rPr>
   </w:style>
-  <w:style w:type="character" w:customStyle="1" w:styleId="15">
+  <w:style w:type="character" w:customStyle="1" w:styleId="Heading2Char">
     <w:name w:val="Heading 2 Char"/>
-    <w:basedOn w:val="6"/>
-    <w:link w:val="3"/>
+    <w:basedOn w:val="DefaultParagraphFont"/>
+    <w:link w:val="Heading2"/>
+    <w:uiPriority w:val="9"/>
     <w:qFormat/>
-    <w:uiPriority w:val="9"/>
     <w:rPr>
       <w:rFonts w:ascii="Times New Roman" w:hAnsi="Times New Roman" w:cs="Times New Roman"/>
       <w:b/>
@@ -5387,19 +5235,19 @@
       <w:szCs w:val="24"/>
     </w:rPr>
   </w:style>
-  <w:style w:type="table" w:customStyle="1" w:styleId="16">
+  <w:style w:type="table" w:customStyle="1" w:styleId="GridTable1Light1">
     <w:name w:val="Grid Table 1 Light1"/>
-    <w:basedOn w:val="7"/>
+    <w:basedOn w:val="TableNormal"/>
+    <w:uiPriority w:val="46"/>
     <w:qFormat/>
-    <w:uiPriority w:val="46"/>
     <w:tblPr>
       <w:tblBorders>
-        <w:top w:val="single" w:color="999999" w:themeColor="text1" w:themeTint="66" w:sz="4" w:space="0"/>
-        <w:left w:val="single" w:color="999999" w:themeColor="text1" w:themeTint="66" w:sz="4" w:space="0"/>
-        <w:bottom w:val="single" w:color="999999" w:themeColor="text1" w:themeTint="66" w:sz="4" w:space="0"/>
-        <w:right w:val="single" w:color="999999" w:themeColor="text1" w:themeTint="66" w:sz="4" w:space="0"/>
-        <w:insideH w:val="single" w:color="999999" w:themeColor="text1" w:themeTint="66" w:sz="4" w:space="0"/>
-        <w:insideV w:val="single" w:color="999999" w:themeColor="text1" w:themeTint="66" w:sz="4" w:space="0"/>
+        <w:top w:val="single" w:sz="4" w:space="0" w:color="999999" w:themeColor="text1" w:themeTint="66"/>
+        <w:left w:val="single" w:sz="4" w:space="0" w:color="999999" w:themeColor="text1" w:themeTint="66"/>
+        <w:bottom w:val="single" w:sz="4" w:space="0" w:color="999999" w:themeColor="text1" w:themeTint="66"/>
+        <w:right w:val="single" w:sz="4" w:space="0" w:color="999999" w:themeColor="text1" w:themeTint="66"/>
+        <w:insideH w:val="single" w:sz="4" w:space="0" w:color="999999" w:themeColor="text1" w:themeTint="66"/>
+        <w:insideV w:val="single" w:sz="4" w:space="0" w:color="999999" w:themeColor="text1" w:themeTint="66"/>
       </w:tblBorders>
     </w:tblPr>
     <w:tblStylePr w:type="firstRow">
@@ -5407,9 +5255,10 @@
         <w:b/>
         <w:bCs/>
       </w:rPr>
+      <w:tblPr/>
       <w:tcPr>
         <w:tcBorders>
-          <w:bottom w:val="single" w:color="666666" w:themeColor="text1" w:themeTint="99" w:sz="12" w:space="0"/>
+          <w:bottom w:val="single" w:sz="12" w:space="0" w:color="666666" w:themeColor="text1" w:themeTint="99"/>
         </w:tcBorders>
       </w:tcPr>
     </w:tblStylePr>
@@ -5418,9 +5267,10 @@
         <w:b/>
         <w:bCs/>
       </w:rPr>
+      <w:tblPr/>
       <w:tcPr>
         <w:tcBorders>
-          <w:top w:val="double" w:color="666666" w:themeColor="text1" w:themeTint="99" w:sz="2" w:space="0"/>
+          <w:top w:val="double" w:sz="2" w:space="0" w:color="666666" w:themeColor="text1" w:themeTint="99"/>
         </w:tcBorders>
       </w:tcPr>
     </w:tblStylePr>
@@ -5437,12 +5287,12 @@
       </w:rPr>
     </w:tblStylePr>
   </w:style>
-  <w:style w:type="character" w:customStyle="1" w:styleId="17">
+  <w:style w:type="character" w:customStyle="1" w:styleId="Heading3Char">
     <w:name w:val="Heading 3 Char"/>
-    <w:basedOn w:val="6"/>
-    <w:link w:val="5"/>
+    <w:basedOn w:val="DefaultParagraphFont"/>
+    <w:link w:val="Heading3"/>
+    <w:uiPriority w:val="9"/>
     <w:qFormat/>
-    <w:uiPriority w:val="9"/>
     <w:rPr>
       <w:rFonts w:ascii="Times New Roman" w:hAnsi="Times New Roman" w:cs="Times New Roman"/>
       <w:b/>
@@ -5452,13 +5302,13 @@
       <w:szCs w:val="24"/>
     </w:rPr>
   </w:style>
-  <w:style w:type="paragraph" w:customStyle="1" w:styleId="18">
+  <w:style w:type="paragraph" w:customStyle="1" w:styleId="TOCHeading1">
     <w:name w:val="TOC Heading1"/>
-    <w:basedOn w:val="2"/>
-    <w:next w:val="1"/>
+    <w:basedOn w:val="Heading1"/>
+    <w:next w:val="Normal"/>
+    <w:uiPriority w:val="39"/>
     <w:unhideWhenUsed/>
     <w:qFormat/>
-    <w:uiPriority w:val="39"/>
     <w:pPr>
       <w:keepNext/>
       <w:keepLines/>
@@ -5467,10 +5317,10 @@
       <w:outlineLvl w:val="9"/>
     </w:pPr>
     <w:rPr>
-      <w:rFonts w:asciiTheme="majorHAnsi" w:hAnsiTheme="majorHAnsi" w:eastAsiaTheme="majorEastAsia" w:cstheme="majorBidi"/>
+      <w:rFonts w:asciiTheme="majorHAnsi" w:eastAsiaTheme="majorEastAsia" w:hAnsiTheme="majorHAnsi" w:cstheme="majorBidi"/>
       <w:b w:val="0"/>
       <w:bCs w:val="0"/>
-      <w:color w:val="2E75B6" w:themeColor="accent1" w:themeShade="BF"/>
+      <w:color w:val="2E74B5" w:themeColor="accent1" w:themeShade="BF"/>
       <w:sz w:val="32"/>
       <w:szCs w:val="32"/>
     </w:rPr>
@@ -5730,6 +5580,7 @@
     </a:fmtScheme>
   </a:themeElements>
   <a:objectDefaults/>
+  <a:extraClrSchemeLst/>
 </a:theme>
 </file>
 
@@ -5739,6 +5590,8 @@
 
 <file path=customXml/itemProps1.xml><?xml version="1.0" encoding="utf-8"?>
 <ds:datastoreItem xmlns:ds="http://schemas.openxmlformats.org/officeDocument/2006/customXml" ds:itemID="{1609BA4D-7BE1-4407-85D0-DB8EB833EAC0}">
-  <ds:schemaRefs/>
+  <ds:schemaRefs>
+    <ds:schemaRef ds:uri="http://schemas.openxmlformats.org/officeDocument/2006/bibliography"/>
+  </ds:schemaRefs>
 </ds:datastoreItem>
 </file>
</xml_diff>